<commit_message>
Hyperparameter als Text ergänzt
Restliche ansätze zu Parametern bei finalem modell wieder gelöscht und Alles innerhalb der 6 seiten
</commit_message>
<xml_diff>
--- a/Journal template free format.docx
+++ b/Journal template free format.docx
@@ -32,15 +32,7 @@
     </w:p>
     <w:p>
       <w:r>
-        <w:t xml:space="preserve">Die Motivation dieser Analyse besteht darin zu untersuchen, wie gut maschinelle Lernverfahren komplexe Sensordaten verarbeiten und daraus menschliche Aktivitäten ableiten können. Solche Verfahren sind insbesondere im Bereich Human </w:t>
-      </w:r>
-      <w:proofErr w:type="spellStart"/>
-      <w:r>
-        <w:t>Activity</w:t>
-      </w:r>
-      <w:proofErr w:type="spellEnd"/>
-      <w:r>
-        <w:t xml:space="preserve"> Recognition relevant, beispielsweise für Fitness-Tracking, Gesundheitsmonitoring, Rehabilitation oder kontextabhängige Smartphone-Anwendungen. Besonders interessant ist dabei nicht nur, ob ein Modell bekannte Messungen gut klassifizieren kann, sondern auch, ob es auf bisher unbekannte Personen generalisiert.</w:t>
+        <w:t>Die Motivation dieser Analyse besteht darin zu untersuchen, wie gut maschinelle Lernverfahren komplexe Sensordaten verarbeiten und daraus menschliche Aktivitäten ableiten können. Solche Verfahren sind insbesondere im Bereich Human Activity Recognition relevant, beispielsweise für Fitness-Tracking, Gesundheitsmonitoring, Rehabilitation oder kontextabhängige Smartphone-Anwendungen. Besonders interessant ist dabei nicht nur, ob ein Modell bekannte Messungen gut klassifizieren kann, sondern auch, ob es auf bisher unbekannte Personen generalisiert.</w:t>
       </w:r>
     </w:p>
     <w:p>
@@ -66,31 +58,7 @@
     </w:p>
     <w:p>
       <w:r>
-        <w:t xml:space="preserve">Die zur Verfügung gestellten Daten basieren auf A Public Domain Dataset </w:t>
-      </w:r>
-      <w:proofErr w:type="spellStart"/>
-      <w:r>
-        <w:t>for</w:t>
-      </w:r>
-      <w:proofErr w:type="spellEnd"/>
-      <w:r>
-        <w:t xml:space="preserve"> Human </w:t>
-      </w:r>
-      <w:proofErr w:type="spellStart"/>
-      <w:r>
-        <w:t>Activity</w:t>
-      </w:r>
-      <w:proofErr w:type="spellEnd"/>
-      <w:r>
-        <w:t xml:space="preserve"> Recognition </w:t>
-      </w:r>
-      <w:proofErr w:type="spellStart"/>
-      <w:r>
-        <w:t>Using</w:t>
-      </w:r>
-      <w:proofErr w:type="spellEnd"/>
-      <w:r>
-        <w:t xml:space="preserve"> Smartphones</w:t>
+        <w:t>Die zur Verfügung gestellten Daten basieren auf A Public Domain Dataset for Human Activity Recognition Using Smartphones</w:t>
       </w:r>
       <w:sdt>
         <w:sdtPr>
@@ -133,15 +101,7 @@
         <w:spacing w:after="0" w:line="312" w:lineRule="auto"/>
       </w:pPr>
       <w:r>
-        <w:t xml:space="preserve">Der Datensatz besteht aus zwei CSV-Dateien. Die Datei measures.csv enthält die gelabelten Daten und wurde für Training, Modellvergleich und Testbewertung verwendet. Die Datei to_predict.csv enthält </w:t>
-      </w:r>
-      <w:proofErr w:type="spellStart"/>
-      <w:r>
-        <w:t>ungelabelte</w:t>
-      </w:r>
-      <w:proofErr w:type="spellEnd"/>
-      <w:r>
-        <w:t xml:space="preserve"> Daten, für die am Ende der Analyse finale Vorhersagen erzeugt werden sollen.</w:t>
+        <w:t>Der Datensatz besteht aus zwei CSV-Dateien. Die Datei measures.csv enthält die gelabelten Daten und wurde für Training, Modellvergleich und Testbewertung verwendet. Die Datei to_predict.csv enthält ungelabelte Daten, für die am Ende der Analyse finale Vorhersagen erzeugt werden sollen.</w:t>
       </w:r>
     </w:p>
     <w:p>
@@ -149,23 +109,7 @@
         <w:spacing w:after="0" w:line="312" w:lineRule="auto"/>
       </w:pPr>
       <w:r>
-        <w:t xml:space="preserve">Die Datei measures.csv umfasst 7352 Beobachtungen mit insgesamt 563 Spalten. Davon sind 561 Spalten Sensorfeatures. Die beiden übrigen Spalten sind </w:t>
-      </w:r>
-      <w:proofErr w:type="spellStart"/>
-      <w:r>
-        <w:t>subject</w:t>
-      </w:r>
-      <w:proofErr w:type="spellEnd"/>
-      <w:r>
-        <w:t xml:space="preserve">, also die Personen-ID, und </w:t>
-      </w:r>
-      <w:proofErr w:type="spellStart"/>
-      <w:r>
-        <w:t>activity</w:t>
-      </w:r>
-      <w:proofErr w:type="spellEnd"/>
-      <w:r>
-        <w:t>, also das Aktivitätslabel. In measures.csv sind 21 der insgesamt 30 Versuchspersonen enthalten.</w:t>
+        <w:t>Die Datei measures.csv umfasst 7352 Beobachtungen mit insgesamt 563 Spalten. Davon sind 561 Spalten Sensorfeatures. Die beiden übrigen Spalten sind subject, also die Personen-ID, und activity, also das Aktivitätslabel. In measures.csv sind 21 der insgesamt 30 Versuchspersonen enthalten.</w:t>
       </w:r>
     </w:p>
     <w:p>
@@ -175,51 +119,14 @@
       <w:r>
         <w:t xml:space="preserve">: </w:t>
       </w:r>
-      <w:proofErr w:type="spellStart"/>
-      <w:r>
-        <w:t>Laying</w:t>
-      </w:r>
-      <w:proofErr w:type="spellEnd"/>
-      <w:r>
-        <w:t xml:space="preserve">, Standing, Sitting, Walking, </w:t>
-      </w:r>
-      <w:proofErr w:type="spellStart"/>
-      <w:r>
-        <w:t>Walking_Upstairs</w:t>
-      </w:r>
-      <w:proofErr w:type="spellEnd"/>
-      <w:r>
-        <w:t xml:space="preserve"> und </w:t>
-      </w:r>
-      <w:proofErr w:type="spellStart"/>
-      <w:r>
-        <w:t>Walking_Downstairs</w:t>
-      </w:r>
-      <w:proofErr w:type="spellEnd"/>
-      <w:r>
-        <w:t>.</w:t>
+      <w:r>
+        <w:t>Laying, Standing, Sitting, Walking, Walking_Upstairs und Walking_Downstairs.</w:t>
       </w:r>
     </w:p>
     <w:p>
       <w:r>
         <w:lastRenderedPageBreak/>
-        <w:t xml:space="preserve">Eine Zeile im Datensatz beschreibt jeweils ein Messfenster einer bestimmten Person während einer bestimmten Aktivität. Die Feature-Spalten enthalten vorverarbeitete und normalisierte Sensormerkmale, die aus den Smartphone-Signalen berechnet wurden. Die Datei to_predict.csv umfasst die übrigen 2947 Beobachtungen. Sie enthält dieselben Sensorfeatures und die Spalte </w:t>
-      </w:r>
-      <w:proofErr w:type="spellStart"/>
-      <w:r>
-        <w:t>subject</w:t>
-      </w:r>
-      <w:proofErr w:type="spellEnd"/>
-      <w:r>
-        <w:t xml:space="preserve">, jedoch keine Zielvariable </w:t>
-      </w:r>
-      <w:proofErr w:type="spellStart"/>
-      <w:r>
-        <w:t>activity</w:t>
-      </w:r>
-      <w:proofErr w:type="spellEnd"/>
-      <w:r>
-        <w:t>.</w:t>
+        <w:t>Eine Zeile im Datensatz beschreibt jeweils ein Messfenster einer bestimmten Person während einer bestimmten Aktivität. Die Feature-Spalten enthalten vorverarbeitete und normalisierte Sensormerkmale, die aus den Smartphone-Signalen berechnet wurden. Die Datei to_predict.csv umfasst die übrigen 2947 Beobachtungen. Sie enthält dieselben Sensorfeatures und die Spalte subject, jedoch keine Zielvariable activity.</w:t>
       </w:r>
     </w:p>
     <w:p>
@@ -255,23 +162,7 @@
     </w:p>
     <w:p>
       <w:r>
-        <w:t>Für Modelle, die empfindlich auf unterschiedliche Skalierungen reagieren, beispielsweise SVM, k-</w:t>
-      </w:r>
-      <w:proofErr w:type="spellStart"/>
-      <w:r>
-        <w:t>Nearest</w:t>
-      </w:r>
-      <w:proofErr w:type="spellEnd"/>
-      <w:r>
-        <w:t xml:space="preserve"> Neighbors oder </w:t>
-      </w:r>
-      <w:proofErr w:type="spellStart"/>
-      <w:r>
-        <w:t>Logistic</w:t>
-      </w:r>
-      <w:proofErr w:type="spellEnd"/>
-      <w:r>
-        <w:t xml:space="preserve"> Regression, wurde eine Standardisierung innerhalb einer Pipeline verwendet. Dadurch wurde sichergestellt, dass die Skalierung ausschließlich auf den Trainingsdaten gelernt und anschließend auf Validierungs- oder Testdaten angewendet wurde.</w:t>
+        <w:t>Für Modelle, die empfindlich auf unterschiedliche Skalierungen reagieren, beispielsweise SVM, k-Nearest Neighbors oder Logistic Regression, wurde eine Standardisierung innerhalb einer Pipeline verwendet. Dadurch wurde sichergestellt, dass die Skalierung ausschließlich auf den Trainingsdaten gelernt und anschließend auf Validierungs- oder Testdaten angewendet wurde.</w:t>
       </w:r>
     </w:p>
     <w:p>
@@ -289,44 +180,12 @@
     </w:p>
     <w:p>
       <w:r>
-        <w:t>Für die Modellbewertung wurde measures.csv in einen Trainings- und einen Testdatensatz aufgeteilt. Die Aufteilung erfolgte nicht zufällig auf Ebene einzelner Beobachtungen, sondern gruppiert nach Versuchspersonen (</w:t>
-      </w:r>
-      <w:proofErr w:type="spellStart"/>
-      <w:r>
-        <w:t>subject</w:t>
-      </w:r>
-      <w:proofErr w:type="spellEnd"/>
-      <w:r>
-        <w:t>). Dieses Vorgehen ist notwendig, da mehrere Messfenster von derselben Person stammen.</w:t>
-      </w:r>
-    </w:p>
-    <w:p>
-      <w:r>
-        <w:t xml:space="preserve">Die </w:t>
-      </w:r>
-      <w:proofErr w:type="spellStart"/>
-      <w:r>
-        <w:t>Subjects</w:t>
-      </w:r>
-      <w:proofErr w:type="spellEnd"/>
-      <w:r>
-        <w:t xml:space="preserve"> 27, 28, 29 und 30 wurden dem Testdatensatz zugeordnet. Alle übrigen 17 </w:t>
-      </w:r>
-      <w:proofErr w:type="spellStart"/>
-      <w:r>
-        <w:t>Subjects</w:t>
-      </w:r>
-      <w:proofErr w:type="spellEnd"/>
-      <w:r>
-        <w:t xml:space="preserve"> aus measures.csv wurden für den Trainingsdatensatz verwendet. Zusätzlich wurde überprüft, ob die </w:t>
-      </w:r>
-      <w:proofErr w:type="spellStart"/>
-      <w:r>
-        <w:t>Subjects</w:t>
-      </w:r>
-      <w:proofErr w:type="spellEnd"/>
-      <w:r>
-        <w:t xml:space="preserve"> 1, 3, 5 und 6 im Trainingsdatensatz enthalten sind. Der resultierende Trainingsdatensatz umfasst 5867 Beobachtungen, der Testdatensatz 1485. Zwischen de</w:t>
+        <w:t>Für die Modellbewertung wurde measures.csv in einen Trainings- und einen Testdatensatz aufgeteilt. Die Aufteilung erfolgte nicht zufällig auf Ebene einzelner Beobachtungen, sondern gruppiert nach Versuchspersonen (subject). Dieses Vorgehen ist notwendig, da mehrere Messfenster von derselben Person stammen.</w:t>
+      </w:r>
+    </w:p>
+    <w:p>
+      <w:r>
+        <w:t>Die Subjects 27, 28, 29 und 30 wurden dem Testdatensatz zugeordnet. Alle übrigen 17 Subjects aus measures.csv wurden für den Trainingsdatensatz verwendet. Zusätzlich wurde überprüft, ob die Subjects 1, 3, 5 und 6 im Trainingsdatensatz enthalten sind. Der resultierende Trainingsdatensatz umfasst 5867 Beobachtungen, der Testdatensatz 1485. Zwischen de</w:t>
       </w:r>
       <w:r>
         <w:t xml:space="preserve">m </w:t>
@@ -405,23 +264,7 @@
         </w:drawing>
       </w:r>
       <w:r>
-        <w:t xml:space="preserve">Die Modellwahl erfolgte ausschließlich auf dem Trainingsdatensatz mithilfe einer 5-fold Group Cross-Validation. Dabei wurden die Folds ebenfalls nach </w:t>
-      </w:r>
-      <w:proofErr w:type="spellStart"/>
-      <w:r>
-        <w:t>subject</w:t>
-      </w:r>
-      <w:proofErr w:type="spellEnd"/>
-      <w:r>
-        <w:t xml:space="preserve"> gebildet, sodass alle Beobachtungen einer Person vollständig entweder im Trainings- oder im Validierungsanteil eines Folds lagen. Als zentrale Bewertungsmetrik wurde die mittlere </w:t>
-      </w:r>
-      <w:proofErr w:type="spellStart"/>
-      <w:r>
-        <w:t>Accuracy</w:t>
-      </w:r>
-      <w:proofErr w:type="spellEnd"/>
-      <w:r>
-        <w:t xml:space="preserve"> über die fünf Folds verwendet.</w:t>
+        <w:t>Die Modellwahl erfolgte ausschließlich auf dem Trainingsdatensatz mithilfe einer 5-fold Group Cross-Validation. Dabei wurden die Folds ebenfalls nach subject gebildet, sodass alle Beobachtungen einer Person vollständig entweder im Trainings- oder im Validierungsanteil eines Folds lagen. Als zentrale Bewertungsmetrik wurde die mittlere Accuracy über die fünf Folds verwendet.</w:t>
       </w:r>
     </w:p>
     <w:p>
@@ -591,31 +434,7 @@
     </w:p>
     <w:p>
       <w:r>
-        <w:t>Zur Modellwahl wurden mehrere Klassifikationsmodelle auf dem Trainingsdatensatz verglichen. Die Auswahl geeigneter Modelle erfolgte primär anhand der mittleren Cross-Validation-</w:t>
-      </w:r>
-      <w:proofErr w:type="spellStart"/>
-      <w:r>
-        <w:t>Accuracy</w:t>
-      </w:r>
-      <w:proofErr w:type="spellEnd"/>
-      <w:r>
-        <w:t xml:space="preserve">. Anschließend wurden ausgewählte Modellvarianten auf dem </w:t>
-      </w:r>
-      <w:proofErr w:type="spellStart"/>
-      <w:r>
-        <w:t>subject</w:t>
-      </w:r>
-      <w:proofErr w:type="spellEnd"/>
-      <w:r>
-        <w:t>-basierten Holdout-</w:t>
-      </w:r>
-      <w:proofErr w:type="spellStart"/>
-      <w:r>
-        <w:t>Testset</w:t>
-      </w:r>
-      <w:proofErr w:type="spellEnd"/>
-      <w:r>
-        <w:t xml:space="preserve"> bewertet.</w:t>
+        <w:t>Zur Modellwahl wurden mehrere Klassifikationsmodelle auf dem Trainingsdatensatz verglichen. Die Auswahl geeigneter Modelle erfolgte primär anhand der mittleren Cross-Validation-Accuracy. Anschließend wurden ausgewählte Modellvarianten auf dem subject-basierten Holdout-Testset bewertet.</w:t>
       </w:r>
     </w:p>
     <w:p>
@@ -633,39 +452,7 @@
     </w:p>
     <w:p>
       <w:r>
-        <w:t xml:space="preserve">Für den Modellvergleich wurden verschiedene Klassifikationsverfahren getestet, darunter </w:t>
-      </w:r>
-      <w:proofErr w:type="spellStart"/>
-      <w:r>
-        <w:t>Logistic</w:t>
-      </w:r>
-      <w:proofErr w:type="spellEnd"/>
-      <w:r>
-        <w:t xml:space="preserve"> Regression, k-</w:t>
-      </w:r>
-      <w:proofErr w:type="spellStart"/>
-      <w:r>
-        <w:t>Nearest</w:t>
-      </w:r>
-      <w:proofErr w:type="spellEnd"/>
-      <w:r>
-        <w:t xml:space="preserve"> Neighbors, Random Forest, </w:t>
-      </w:r>
-      <w:proofErr w:type="spellStart"/>
-      <w:r>
-        <w:t>XGBClassifier</w:t>
-      </w:r>
-      <w:proofErr w:type="spellEnd"/>
-      <w:r>
-        <w:t xml:space="preserve"> und RBF-SVM. Die Bewertung erfolgte mit 5-fold Group Cross-Validation auf dem Trainingsdatensatz. Dabei wurde nach </w:t>
-      </w:r>
-      <w:proofErr w:type="spellStart"/>
-      <w:r>
-        <w:t>subject</w:t>
-      </w:r>
-      <w:proofErr w:type="spellEnd"/>
-      <w:r>
-        <w:t xml:space="preserve"> gruppiert, sodass Beobachtungen derselben Person nicht gleichzeitig in Trainings- und Validierungsdaten eines Folds vorkamen.</w:t>
+        <w:t>Für den Modellvergleich wurden verschiedene Klassifikationsverfahren getestet, darunter Logistic Regression, k-Nearest Neighbors, Random Forest, XGBClassifier und RBF-SVM. Die Bewertung erfolgte mit 5-fold Group Cross-Validation auf dem Trainingsdatensatz. Dabei wurde nach subject gruppiert, sodass Beobachtungen derselben Person nicht gleichzeitig in Trainings- und Validierungsdaten eines Folds vorkamen.</w:t>
       </w:r>
     </w:p>
     <w:tbl>
@@ -721,16 +508,8 @@
               <w:rPr>
                 <w:b/>
               </w:rPr>
-              <w:t xml:space="preserve">CV </w:t>
+              <w:t>CV Accuracy</w:t>
             </w:r>
-            <w:proofErr w:type="spellStart"/>
-            <w:r>
-              <w:rPr>
-                <w:b/>
-              </w:rPr>
-              <w:t>Accuracy</w:t>
-            </w:r>
-            <w:proofErr w:type="spellEnd"/>
           </w:p>
         </w:tc>
         <w:tc>
@@ -845,13 +624,8 @@
             <w:pPr>
               <w:spacing w:after="0" w:line="240" w:lineRule="auto"/>
             </w:pPr>
-            <w:proofErr w:type="spellStart"/>
             <w:r>
-              <w:t>Logistic</w:t>
-            </w:r>
-            <w:proofErr w:type="spellEnd"/>
-            <w:r>
-              <w:t xml:space="preserve"> Regression</w:t>
+              <w:t>Logistic Regression</w:t>
             </w:r>
           </w:p>
         </w:tc>
@@ -907,11 +681,9 @@
             <w:pPr>
               <w:spacing w:after="0" w:line="240" w:lineRule="auto"/>
             </w:pPr>
-            <w:proofErr w:type="spellStart"/>
             <w:r>
               <w:t>XGBClassifier</w:t>
             </w:r>
-            <w:proofErr w:type="spellEnd"/>
           </w:p>
         </w:tc>
         <w:tc>
@@ -1024,15 +796,7 @@
               <w:spacing w:after="0" w:line="240" w:lineRule="auto"/>
             </w:pPr>
             <w:r>
-              <w:t>k-</w:t>
-            </w:r>
-            <w:proofErr w:type="spellStart"/>
-            <w:r>
-              <w:t>Nearest</w:t>
-            </w:r>
-            <w:proofErr w:type="spellEnd"/>
-            <w:r>
-              <w:t xml:space="preserve"> Neighbors</w:t>
+              <w:t>k-Nearest Neighbors</w:t>
             </w:r>
           </w:p>
         </w:tc>
@@ -1109,39 +873,7 @@
     </w:p>
     <w:p>
       <w:r>
-        <w:t>Die RBF-SVM erzielte mit einer mittleren Cross-Validation-</w:t>
-      </w:r>
-      <w:proofErr w:type="spellStart"/>
-      <w:r>
-        <w:t>Accuracy</w:t>
-      </w:r>
-      <w:proofErr w:type="spellEnd"/>
-      <w:r>
-        <w:t xml:space="preserve"> von 0.9248 das beste Ergebnis im Modellvergleich. </w:t>
-      </w:r>
-      <w:proofErr w:type="spellStart"/>
-      <w:r>
-        <w:t>Logistic</w:t>
-      </w:r>
-      <w:proofErr w:type="spellEnd"/>
-      <w:r>
-        <w:t xml:space="preserve"> Regression und </w:t>
-      </w:r>
-      <w:proofErr w:type="spellStart"/>
-      <w:r>
-        <w:t>XGBClassifier</w:t>
-      </w:r>
-      <w:proofErr w:type="spellEnd"/>
-      <w:r>
-        <w:t xml:space="preserve"> lagen mit 0.9160 bzw. 0.9112 ebenfalls auf hohem Niveau. Der </w:t>
-      </w:r>
-      <w:proofErr w:type="spellStart"/>
-      <w:r>
-        <w:t>XGBClassifier</w:t>
-      </w:r>
-      <w:proofErr w:type="spellEnd"/>
-      <w:r>
-        <w:t xml:space="preserve"> hatte eine deutlich höhere mittlere Fit-Zeit als die übrigen Modelle, wurde jedoch aufgrund seiner guten Testleistung und Kombinierbarkeit mit anderen Modellen weiter untersucht.</w:t>
+        <w:t>Die RBF-SVM erzielte mit einer mittleren Cross-Validation-Accuracy von 0.9248 das beste Ergebnis im Modellvergleich. Logistic Regression und XGBClassifier lagen mit 0.9160 bzw. 0.9112 ebenfalls auf hohem Niveau. Der XGBClassifier hatte eine deutlich höhere mittlere Fit-Zeit als die übrigen Modelle, wurde jedoch aufgrund seiner guten Testleistung und Kombinierbarkeit mit anderen Modellen weiter untersucht.</w:t>
       </w:r>
     </w:p>
     <w:p>
@@ -1159,68 +891,12 @@
     </w:p>
     <w:p>
       <w:r>
-        <w:t xml:space="preserve">Hyperparameter wurden vor allem bei den Modellen weiter untersucht, die im ersten Modellvergleich eine gute Leistung zeigten oder für die Fehlerstruktur besonders relevant waren. Die Auswahl der Hyperparameter erfolgte dabei auf Basis der Cross-Validation-Ergebnisse auf dem Trainingsdatensatz. Die Test </w:t>
-      </w:r>
-      <w:proofErr w:type="spellStart"/>
-      <w:r>
-        <w:t>Accuracy</w:t>
-      </w:r>
-      <w:proofErr w:type="spellEnd"/>
-      <w:r>
-        <w:t xml:space="preserve"> des Holdout-</w:t>
-      </w:r>
-      <w:proofErr w:type="spellStart"/>
-      <w:r>
-        <w:t>Testsets</w:t>
-      </w:r>
-      <w:proofErr w:type="spellEnd"/>
-      <w:r>
-        <w:t xml:space="preserve"> wurde nicht zur Auswahl der Hyperparameter verwendet, sondern erst anschließend zur finalen Bewertung der ausgewählten Modellvarianten berechnet.</w:t>
-      </w:r>
-    </w:p>
-    <w:p>
-      <w:r>
-        <w:t xml:space="preserve">Besonders deutlich lohnte sich die Optimierung beim </w:t>
-      </w:r>
-      <w:proofErr w:type="spellStart"/>
-      <w:r>
-        <w:t>XGBClassifier</w:t>
-      </w:r>
-      <w:proofErr w:type="spellEnd"/>
-      <w:r>
-        <w:t xml:space="preserve">. Durch die Anpassung von Baumanzahl, Baumtiefe, </w:t>
-      </w:r>
-      <w:proofErr w:type="spellStart"/>
-      <w:r>
-        <w:t>Lernrate</w:t>
-      </w:r>
-      <w:proofErr w:type="spellEnd"/>
-      <w:r>
-        <w:t xml:space="preserve">, Subsampling und Regularisierung verbesserte sich die Modellleistung im Vergleich zur vorherigen Einstellung. Auch bei der RBF-SVM führte die Anpassung der Parameter C und </w:t>
-      </w:r>
-      <w:proofErr w:type="spellStart"/>
-      <w:r>
-        <w:t>gamma</w:t>
-      </w:r>
-      <w:proofErr w:type="spellEnd"/>
-      <w:r>
-        <w:t xml:space="preserve"> zu einer leichten Verbesserung. Random Forest und k-</w:t>
-      </w:r>
-      <w:proofErr w:type="spellStart"/>
-      <w:r>
-        <w:t>Nearest</w:t>
-      </w:r>
-      <w:proofErr w:type="spellEnd"/>
-      <w:r>
-        <w:t xml:space="preserve"> Neighbors wurden ebenfalls mit verschiedenen Parametereinstellungen getestet, erreichten jedoch keine bessere Cross-Validation-Leistung als </w:t>
-      </w:r>
-      <w:proofErr w:type="spellStart"/>
-      <w:r>
-        <w:t>XGBClassifier</w:t>
-      </w:r>
-      <w:proofErr w:type="spellEnd"/>
-      <w:r>
-        <w:t xml:space="preserve"> oder RBF-SVM.</w:t>
+        <w:t>Hyperparameter wurden vor allem bei den Modellen weiter untersucht, die im ersten Modellvergleich eine gute Leistung zeigten oder für die Fehlerstruktur besonders relevant waren. Die Auswahl der Hyperparameter erfolgte dabei auf Basis der Cross-Validation-Ergebnisse auf dem Trainingsdatensatz. Die Test Accuracy des Holdout-Testsets wurde nicht zur Auswahl der Hyperparameter verwendet, sondern erst anschließend zur finalen Bewertung der ausgewählten Modellvarianten berechnet.</w:t>
+      </w:r>
+    </w:p>
+    <w:p>
+      <w:r>
+        <w:t>Besonders deutlich lohnte sich die Optimierung beim XGBClassifier. Durch die Anpassung von Baumanzahl, Baumtiefe, Lernrate, Subsampling und Regularisierung verbesserte sich die Modellleistung im Vergleich zur vorherigen Einstellung. Auch bei der RBF-SVM führte die Anpassung der Parameter C und gamma zu einer leichten Verbesserung. Random Forest und k-Nearest Neighbors wurden ebenfalls mit verschiedenen Parametereinstellungen getestet, erreichten jedoch keine bessere Cross-Validation-Leistung als XGBClassifier oder RBF-SVM.</w:t>
       </w:r>
     </w:p>
     <w:p>
@@ -1242,31 +918,7 @@
         <w:jc w:val="left"/>
       </w:pPr>
       <w:r>
-        <w:t xml:space="preserve">Nach der Modellwahl wurden ausgewählte Modelle auf dem </w:t>
-      </w:r>
-      <w:proofErr w:type="spellStart"/>
-      <w:r>
-        <w:t>subject</w:t>
-      </w:r>
-      <w:proofErr w:type="spellEnd"/>
-      <w:r>
-        <w:t>-basierten Holdout-</w:t>
-      </w:r>
-      <w:proofErr w:type="spellStart"/>
-      <w:r>
-        <w:t>Testset</w:t>
-      </w:r>
-      <w:proofErr w:type="spellEnd"/>
-      <w:r>
-        <w:t xml:space="preserve"> bewertet. Dafür wurden Test </w:t>
-      </w:r>
-      <w:proofErr w:type="spellStart"/>
-      <w:r>
-        <w:t>Accuracy</w:t>
-      </w:r>
-      <w:proofErr w:type="spellEnd"/>
-      <w:r>
-        <w:t xml:space="preserve">, </w:t>
+        <w:t xml:space="preserve">Nach der Modellwahl wurden ausgewählte Modelle auf dem subject-basierten Holdout-Testset bewertet. Dafür wurden Test Accuracy, </w:t>
       </w:r>
       <w:proofErr w:type="gramStart"/>
       <w:r>
@@ -1274,31 +926,7 @@
       </w:r>
       <w:proofErr w:type="gramEnd"/>
       <w:r>
-        <w:t xml:space="preserve"> und die </w:t>
-      </w:r>
-      <w:proofErr w:type="spellStart"/>
-      <w:r>
-        <w:t>Confusion</w:t>
-      </w:r>
-      <w:proofErr w:type="spellEnd"/>
-      <w:r>
-        <w:t xml:space="preserve"> Matrix berechnet. Die Test </w:t>
-      </w:r>
-      <w:proofErr w:type="spellStart"/>
-      <w:r>
-        <w:t>Accuracy</w:t>
-      </w:r>
-      <w:proofErr w:type="spellEnd"/>
-      <w:r>
-        <w:t xml:space="preserve"> wurde nicht als primäre Metrik der Modellwahl verwendet, sondern diente zur finalen Bewertung der Generalisierung auf unbekannte </w:t>
-      </w:r>
-      <w:proofErr w:type="spellStart"/>
-      <w:r>
-        <w:t>Subjects</w:t>
-      </w:r>
-      <w:proofErr w:type="spellEnd"/>
-      <w:r>
-        <w:t>.</w:t>
+        <w:t xml:space="preserve"> und die Confusion Matrix berechnet. Die Test Accuracy wurde nicht als primäre Metrik der Modellwahl verwendet, sondern diente zur finalen Bewertung der Generalisierung auf unbekannte Subjects.</w:t>
       </w:r>
     </w:p>
     <w:p>
@@ -1341,52 +969,12 @@
         <w:t xml:space="preserve">, </w:t>
       </w:r>
       <w:r>
-        <w:t xml:space="preserve">zusätzlich wurde mit </w:t>
-      </w:r>
-      <w:proofErr w:type="spellStart"/>
-      <w:r>
-        <w:t>SelectKBest</w:t>
-      </w:r>
-      <w:proofErr w:type="spellEnd"/>
-      <w:r>
-        <w:t xml:space="preserve"> eine Feature </w:t>
-      </w:r>
-      <w:proofErr w:type="spellStart"/>
-      <w:r>
-        <w:t>Selection</w:t>
-      </w:r>
-      <w:proofErr w:type="spellEnd"/>
-      <w:r>
-        <w:t xml:space="preserve"> durchgeführt, um nur die für diese binäre Trennung relevantesten Merkmale zu verwenden.</w:t>
-      </w:r>
-    </w:p>
-    <w:p>
-      <w:r>
-        <w:t xml:space="preserve">Verschiedene Spezialmodelle wurden getestet, darunter RBF-SVM, </w:t>
-      </w:r>
-      <w:proofErr w:type="spellStart"/>
-      <w:r>
-        <w:t>Logistic</w:t>
-      </w:r>
-      <w:proofErr w:type="spellEnd"/>
-      <w:r>
-        <w:t xml:space="preserve"> Regression, </w:t>
-      </w:r>
-      <w:proofErr w:type="spellStart"/>
-      <w:r>
-        <w:t>LinearSVC</w:t>
-      </w:r>
-      <w:proofErr w:type="spellEnd"/>
-      <w:r>
-        <w:t xml:space="preserve">, Random Forest, </w:t>
-      </w:r>
-      <w:proofErr w:type="spellStart"/>
-      <w:r>
-        <w:t>XGBoost</w:t>
-      </w:r>
-      <w:proofErr w:type="spellEnd"/>
-      <w:r>
-        <w:t xml:space="preserve"> und Polynomial-SVM. Das beste Spezialmodell verwendete 150 ausgewählte Features und eine Polynomial-SVM. Zusätzlich wurde die Entscheidungsschwelle des Spezialmodells angepasst, um die verbleibenden Verwechslungen zwischen SITTING und STANDING weiter zu reduzieren.</w:t>
+        <w:t>zusätzlich wurde mit SelectKBest eine Feature Selection durchgeführt, um nur die für diese binäre Trennung relevantesten Merkmale zu verwenden.</w:t>
+      </w:r>
+    </w:p>
+    <w:p>
+      <w:r>
+        <w:t>Verschiedene Spezialmodelle wurden getestet, darunter RBF-SVM, Logistic Regression, LinearSVC, Random Forest, XGBoost und Polynomial-SVM. Das beste Spezialmodell verwendete 150 ausgewählte Features und eine Polynomial-SVM. Zusätzlich wurde die Entscheidungsschwelle des Spezialmodells angepasst, um die verbleibenden Verwechslungen zwischen SITTING und STANDING weiter zu reduzieren.</w:t>
       </w:r>
     </w:p>
     <w:p>
@@ -1415,23 +1003,7 @@
         <w:t>ist</w:t>
       </w:r>
       <w:r>
-        <w:t xml:space="preserve"> ein zweistufiges Modell. In der ersten Stufe wurde ein Soft-Voting-Ensemble aus Polynomial-SVM und </w:t>
-      </w:r>
-      <w:proofErr w:type="spellStart"/>
-      <w:r>
-        <w:t>XGBClassifier</w:t>
-      </w:r>
-      <w:proofErr w:type="spellEnd"/>
-      <w:r>
-        <w:t xml:space="preserve"> verwendet. Der </w:t>
-      </w:r>
-      <w:proofErr w:type="spellStart"/>
-      <w:r>
-        <w:t>XGBClassifier</w:t>
-      </w:r>
-      <w:proofErr w:type="spellEnd"/>
-      <w:r>
-        <w:t xml:space="preserve"> wurde </w:t>
+        <w:t xml:space="preserve"> ein zweistufiges Modell. In der ersten Stufe wurde ein Soft-Voting-Ensemble aus Polynomial-SVM und XGBClassifier verwendet. Der XGBClassifier wurde </w:t>
       </w:r>
       <w:proofErr w:type="gramStart"/>
       <w:r>
@@ -1470,23 +1042,7 @@
     </w:p>
     <w:p>
       <w:r>
-        <w:t>Das finale Modell erreichte auf dem Holdout-</w:t>
-      </w:r>
-      <w:proofErr w:type="spellStart"/>
-      <w:r>
-        <w:t>Testset</w:t>
-      </w:r>
-      <w:proofErr w:type="spellEnd"/>
-      <w:r>
-        <w:t xml:space="preserve"> eine Test </w:t>
-      </w:r>
-      <w:proofErr w:type="spellStart"/>
-      <w:r>
-        <w:t>Accuracy</w:t>
-      </w:r>
-      <w:proofErr w:type="spellEnd"/>
-      <w:r>
-        <w:t xml:space="preserve"> von 0.9764 und einen </w:t>
+        <w:t xml:space="preserve">Das finale Modell erreichte auf dem Holdout-Testset eine Test Accuracy von 0.9764 und einen </w:t>
       </w:r>
       <w:proofErr w:type="gramStart"/>
       <w:r>
@@ -1498,323 +1054,766 @@
       </w:r>
       <w:r>
         <w:br/>
-        <w:t>Alle Hyperparameter sind folgend in den Tabellen dargestellt.</w:t>
-      </w:r>
-    </w:p>
-    <w:p/>
-    <w:p/>
-    <w:p>
-      <w:r>
+      </w:r>
+    </w:p>
+    <w:p>
+      <w:r>
+        <w:t xml:space="preserve">Alle Hyperparameter sind folgend </w:t>
+      </w:r>
+      <w:r>
+        <w:t>aufgelistet:</w:t>
+      </w:r>
+      <w:r>
+        <w:rPr>
+          <w:lang w:val="en-US"/>
+        </w:rPr>
+        <w:br w:type="page"/>
+      </w:r>
+    </w:p>
+    <w:p>
+      <w:pPr>
+        <w:rPr>
+          <w:lang w:val="en-US"/>
+        </w:rPr>
+      </w:pPr>
+      <w:r>
+        <w:rPr>
+          <w:lang w:val="en-US"/>
+        </w:rPr>
         <w:lastRenderedPageBreak/>
-        <w:drawing>
-          <wp:anchor distT="0" distB="0" distL="114300" distR="114300" simplePos="0" relativeHeight="251661312" behindDoc="0" locked="0" layoutInCell="1" allowOverlap="1" wp14:anchorId="6059FF23" wp14:editId="0B4856CF">
-            <wp:simplePos x="0" y="0"/>
-            <wp:positionH relativeFrom="margin">
-              <wp:align>right</wp:align>
-            </wp:positionH>
-            <wp:positionV relativeFrom="paragraph">
-              <wp:posOffset>264</wp:posOffset>
-            </wp:positionV>
-            <wp:extent cx="2343150" cy="2686050"/>
-            <wp:effectExtent l="0" t="0" r="0" b="0"/>
-            <wp:wrapSquare wrapText="bothSides"/>
-            <wp:docPr id="1780603271" name="Grafik 1"/>
-            <wp:cNvGraphicFramePr>
-              <a:graphicFrameLocks xmlns:a="http://schemas.openxmlformats.org/drawingml/2006/main" noChangeAspect="1"/>
-            </wp:cNvGraphicFramePr>
-            <a:graphic xmlns:a="http://schemas.openxmlformats.org/drawingml/2006/main">
-              <a:graphicData uri="http://schemas.openxmlformats.org/drawingml/2006/picture">
-                <pic:pic xmlns:pic="http://schemas.openxmlformats.org/drawingml/2006/picture">
-                  <pic:nvPicPr>
-                    <pic:cNvPr id="1780603271" name=""/>
-                    <pic:cNvPicPr/>
-                  </pic:nvPicPr>
-                  <pic:blipFill>
-                    <a:blip r:embed="rId9">
-                      <a:extLst>
-                        <a:ext uri="{28A0092B-C50C-407E-A947-70E740481C1C}">
-                          <a14:useLocalDpi xmlns:a14="http://schemas.microsoft.com/office/drawing/2010/main" val="0"/>
-                        </a:ext>
-                      </a:extLst>
-                    </a:blip>
-                    <a:stretch>
-                      <a:fillRect/>
-                    </a:stretch>
-                  </pic:blipFill>
-                  <pic:spPr>
-                    <a:xfrm>
-                      <a:off x="0" y="0"/>
-                      <a:ext cx="2343150" cy="2686050"/>
-                    </a:xfrm>
-                    <a:prstGeom prst="rect">
-                      <a:avLst/>
-                    </a:prstGeom>
-                  </pic:spPr>
-                </pic:pic>
-              </a:graphicData>
-            </a:graphic>
-          </wp:anchor>
-        </w:drawing>
-      </w:r>
-      <w:r>
-        <w:drawing>
-          <wp:anchor distT="0" distB="0" distL="114300" distR="114300" simplePos="0" relativeHeight="251662336" behindDoc="0" locked="0" layoutInCell="1" allowOverlap="1" wp14:anchorId="56FAF068" wp14:editId="27016C09">
-            <wp:simplePos x="0" y="0"/>
-            <wp:positionH relativeFrom="margin">
-              <wp:align>left</wp:align>
-            </wp:positionH>
-            <wp:positionV relativeFrom="paragraph">
-              <wp:posOffset>263</wp:posOffset>
-            </wp:positionV>
-            <wp:extent cx="3172268" cy="2676899"/>
-            <wp:effectExtent l="0" t="0" r="9525" b="9525"/>
-            <wp:wrapSquare wrapText="bothSides"/>
-            <wp:docPr id="1812242445" name="Grafik 1"/>
-            <wp:cNvGraphicFramePr>
-              <a:graphicFrameLocks xmlns:a="http://schemas.openxmlformats.org/drawingml/2006/main" noChangeAspect="1"/>
-            </wp:cNvGraphicFramePr>
-            <a:graphic xmlns:a="http://schemas.openxmlformats.org/drawingml/2006/main">
-              <a:graphicData uri="http://schemas.openxmlformats.org/drawingml/2006/picture">
-                <pic:pic xmlns:pic="http://schemas.openxmlformats.org/drawingml/2006/picture">
-                  <pic:nvPicPr>
-                    <pic:cNvPr id="1812242445" name=""/>
-                    <pic:cNvPicPr/>
-                  </pic:nvPicPr>
-                  <pic:blipFill>
-                    <a:blip r:embed="rId10">
-                      <a:extLst>
-                        <a:ext uri="{28A0092B-C50C-407E-A947-70E740481C1C}">
-                          <a14:useLocalDpi xmlns:a14="http://schemas.microsoft.com/office/drawing/2010/main" val="0"/>
-                        </a:ext>
-                      </a:extLst>
-                    </a:blip>
-                    <a:stretch>
-                      <a:fillRect/>
-                    </a:stretch>
-                  </pic:blipFill>
-                  <pic:spPr>
-                    <a:xfrm>
-                      <a:off x="0" y="0"/>
-                      <a:ext cx="3172268" cy="2676899"/>
-                    </a:xfrm>
-                    <a:prstGeom prst="rect">
-                      <a:avLst/>
-                    </a:prstGeom>
-                  </pic:spPr>
-                </pic:pic>
-              </a:graphicData>
-            </a:graphic>
-          </wp:anchor>
-        </w:drawing>
-      </w:r>
-    </w:p>
-    <w:p>
-      <w:r>
-        <w:drawing>
-          <wp:anchor distT="0" distB="0" distL="114300" distR="114300" simplePos="0" relativeHeight="251663360" behindDoc="0" locked="0" layoutInCell="1" allowOverlap="1" wp14:anchorId="5BB9DEDE" wp14:editId="550C2AE8">
-            <wp:simplePos x="0" y="0"/>
-            <wp:positionH relativeFrom="margin">
-              <wp:align>left</wp:align>
-            </wp:positionH>
-            <wp:positionV relativeFrom="paragraph">
-              <wp:posOffset>4792</wp:posOffset>
-            </wp:positionV>
-            <wp:extent cx="4382112" cy="2314898"/>
-            <wp:effectExtent l="0" t="0" r="0" b="9525"/>
-            <wp:wrapSquare wrapText="bothSides"/>
-            <wp:docPr id="253379448" name="Grafik 1"/>
-            <wp:cNvGraphicFramePr>
-              <a:graphicFrameLocks xmlns:a="http://schemas.openxmlformats.org/drawingml/2006/main" noChangeAspect="1"/>
-            </wp:cNvGraphicFramePr>
-            <a:graphic xmlns:a="http://schemas.openxmlformats.org/drawingml/2006/main">
-              <a:graphicData uri="http://schemas.openxmlformats.org/drawingml/2006/picture">
-                <pic:pic xmlns:pic="http://schemas.openxmlformats.org/drawingml/2006/picture">
-                  <pic:nvPicPr>
-                    <pic:cNvPr id="253379448" name=""/>
-                    <pic:cNvPicPr/>
-                  </pic:nvPicPr>
-                  <pic:blipFill>
-                    <a:blip r:embed="rId11">
-                      <a:extLst>
-                        <a:ext uri="{28A0092B-C50C-407E-A947-70E740481C1C}">
-                          <a14:useLocalDpi xmlns:a14="http://schemas.microsoft.com/office/drawing/2010/main" val="0"/>
-                        </a:ext>
-                      </a:extLst>
-                    </a:blip>
-                    <a:stretch>
-                      <a:fillRect/>
-                    </a:stretch>
-                  </pic:blipFill>
-                  <pic:spPr>
-                    <a:xfrm>
-                      <a:off x="0" y="0"/>
-                      <a:ext cx="4382112" cy="2314898"/>
-                    </a:xfrm>
-                    <a:prstGeom prst="rect">
-                      <a:avLst/>
-                    </a:prstGeom>
-                  </pic:spPr>
-                </pic:pic>
-              </a:graphicData>
-            </a:graphic>
-          </wp:anchor>
-        </w:drawing>
-      </w:r>
-    </w:p>
-    <w:p>
-      <w:pPr>
-        <w:pStyle w:val="berschrift1"/>
-        <w:jc w:val="left"/>
-        <w:rPr>
-          <w:b w:val="0"/>
-          <w:bCs w:val="0"/>
-          <w:sz w:val="24"/>
-          <w:szCs w:val="24"/>
-        </w:rPr>
-      </w:pPr>
-      <w:r>
-        <w:rPr>
-          <w:b w:val="0"/>
-          <w:bCs w:val="0"/>
-          <w:sz w:val="24"/>
-          <w:szCs w:val="24"/>
+        <w:t xml:space="preserve">Poly-SVM </w:t>
+      </w:r>
+      <w:r>
+        <w:rPr>
+          <w:lang w:val="en-US"/>
+        </w:rPr>
+        <w:t>(</w:t>
+      </w:r>
+      <w:r>
+        <w:rPr>
+          <w:lang w:val="en-US"/>
+        </w:rPr>
+        <w:t>Stufe 1</w:t>
+      </w:r>
+      <w:r>
+        <w:rPr>
+          <w:lang w:val="en-US"/>
+        </w:rPr>
+        <w:t>)</w:t>
+      </w:r>
+      <w:r>
+        <w:rPr>
+          <w:lang w:val="en-US"/>
+        </w:rPr>
+        <w:t xml:space="preserve">: </w:t>
+      </w:r>
+    </w:p>
+    <w:p>
+      <w:pPr>
+        <w:rPr>
+          <w:lang w:val="en-US"/>
+        </w:rPr>
+      </w:pPr>
+      <w:proofErr w:type="gramStart"/>
+      <w:r>
+        <w:rPr>
+          <w:lang w:val="en-US"/>
+        </w:rPr>
+        <w:t>Pipeline(</w:t>
+      </w:r>
+      <w:proofErr w:type="gramEnd"/>
+      <w:r>
+        <w:rPr>
+          <w:lang w:val="en-US"/>
+        </w:rPr>
+        <w:t>steps</w:t>
+      </w:r>
+      <w:proofErr w:type="gramStart"/>
+      <w:r>
+        <w:rPr>
+          <w:lang w:val="en-US"/>
+        </w:rPr>
+        <w:t>=[</w:t>
+      </w:r>
+      <w:proofErr w:type="gramEnd"/>
+      <w:r>
+        <w:rPr>
+          <w:lang w:val="en-US"/>
+        </w:rPr>
+        <w:t xml:space="preserve">("scaler", </w:t>
+      </w:r>
+      <w:proofErr w:type="gramStart"/>
+      <w:r>
+        <w:rPr>
+          <w:lang w:val="en-US"/>
+        </w:rPr>
+        <w:t>StandardScaler(</w:t>
+      </w:r>
+      <w:proofErr w:type="gramEnd"/>
+      <w:r>
+        <w:rPr>
+          <w:lang w:val="en-US"/>
+        </w:rPr>
+        <w:t>)),</w:t>
+      </w:r>
+      <w:r>
+        <w:rPr>
+          <w:lang w:val="en-US"/>
         </w:rPr>
         <w:t xml:space="preserve"> </w:t>
       </w:r>
-    </w:p>
-    <w:p/>
-    <w:p/>
-    <w:p/>
-    <w:p/>
-    <w:p/>
-    <w:p/>
-    <w:p>
-      <w:r>
-        <w:drawing>
-          <wp:anchor distT="0" distB="0" distL="114300" distR="114300" simplePos="0" relativeHeight="251664384" behindDoc="0" locked="0" layoutInCell="1" allowOverlap="1" wp14:anchorId="106DE239" wp14:editId="3725ADA3">
-            <wp:simplePos x="0" y="0"/>
-            <wp:positionH relativeFrom="column">
-              <wp:posOffset>465754</wp:posOffset>
-            </wp:positionH>
-            <wp:positionV relativeFrom="paragraph">
-              <wp:posOffset>76703</wp:posOffset>
-            </wp:positionV>
-            <wp:extent cx="2695951" cy="1609950"/>
-            <wp:effectExtent l="0" t="0" r="0" b="9525"/>
-            <wp:wrapSquare wrapText="bothSides"/>
-            <wp:docPr id="1940800505" name="Grafik 1"/>
-            <wp:cNvGraphicFramePr>
-              <a:graphicFrameLocks xmlns:a="http://schemas.openxmlformats.org/drawingml/2006/main" noChangeAspect="1"/>
-            </wp:cNvGraphicFramePr>
-            <a:graphic xmlns:a="http://schemas.openxmlformats.org/drawingml/2006/main">
-              <a:graphicData uri="http://schemas.openxmlformats.org/drawingml/2006/picture">
-                <pic:pic xmlns:pic="http://schemas.openxmlformats.org/drawingml/2006/picture">
-                  <pic:nvPicPr>
-                    <pic:cNvPr id="1940800505" name=""/>
-                    <pic:cNvPicPr/>
-                  </pic:nvPicPr>
-                  <pic:blipFill>
-                    <a:blip r:embed="rId12">
-                      <a:extLst>
-                        <a:ext uri="{28A0092B-C50C-407E-A947-70E740481C1C}">
-                          <a14:useLocalDpi xmlns:a14="http://schemas.microsoft.com/office/drawing/2010/main" val="0"/>
-                        </a:ext>
-                      </a:extLst>
-                    </a:blip>
-                    <a:stretch>
-                      <a:fillRect/>
-                    </a:stretch>
-                  </pic:blipFill>
-                  <pic:spPr>
-                    <a:xfrm>
-                      <a:off x="0" y="0"/>
-                      <a:ext cx="2695951" cy="1609950"/>
-                    </a:xfrm>
-                    <a:prstGeom prst="rect">
-                      <a:avLst/>
-                    </a:prstGeom>
-                  </pic:spPr>
-                </pic:pic>
-              </a:graphicData>
-            </a:graphic>
-          </wp:anchor>
-        </w:drawing>
-      </w:r>
-    </w:p>
-    <w:p/>
-    <w:p/>
-    <w:p/>
-    <w:p/>
-    <w:p/>
-    <w:p/>
-    <w:p/>
-    <w:p>
-      <w:r>
-        <w:lastRenderedPageBreak/>
-        <w:drawing>
-          <wp:anchor distT="0" distB="0" distL="114300" distR="114300" simplePos="0" relativeHeight="251665408" behindDoc="0" locked="0" layoutInCell="1" allowOverlap="1" wp14:anchorId="000CA19C" wp14:editId="20E82F6B">
-            <wp:simplePos x="0" y="0"/>
-            <wp:positionH relativeFrom="margin">
-              <wp:posOffset>86264</wp:posOffset>
-            </wp:positionH>
-            <wp:positionV relativeFrom="paragraph">
-              <wp:posOffset>575</wp:posOffset>
-            </wp:positionV>
-            <wp:extent cx="4210638" cy="2324424"/>
-            <wp:effectExtent l="0" t="0" r="0" b="0"/>
-            <wp:wrapSquare wrapText="bothSides"/>
-            <wp:docPr id="929110773" name="Grafik 1"/>
-            <wp:cNvGraphicFramePr>
-              <a:graphicFrameLocks xmlns:a="http://schemas.openxmlformats.org/drawingml/2006/main" noChangeAspect="1"/>
-            </wp:cNvGraphicFramePr>
-            <a:graphic xmlns:a="http://schemas.openxmlformats.org/drawingml/2006/main">
-              <a:graphicData uri="http://schemas.openxmlformats.org/drawingml/2006/picture">
-                <pic:pic xmlns:pic="http://schemas.openxmlformats.org/drawingml/2006/picture">
-                  <pic:nvPicPr>
-                    <pic:cNvPr id="929110773" name=""/>
-                    <pic:cNvPicPr/>
-                  </pic:nvPicPr>
-                  <pic:blipFill>
-                    <a:blip r:embed="rId13">
-                      <a:extLst>
-                        <a:ext uri="{28A0092B-C50C-407E-A947-70E740481C1C}">
-                          <a14:useLocalDpi xmlns:a14="http://schemas.microsoft.com/office/drawing/2010/main" val="0"/>
-                        </a:ext>
-                      </a:extLst>
-                    </a:blip>
-                    <a:stretch>
-                      <a:fillRect/>
-                    </a:stretch>
-                  </pic:blipFill>
-                  <pic:spPr>
-                    <a:xfrm>
-                      <a:off x="0" y="0"/>
-                      <a:ext cx="4210638" cy="2324424"/>
-                    </a:xfrm>
-                    <a:prstGeom prst="rect">
-                      <a:avLst/>
-                    </a:prstGeom>
-                  </pic:spPr>
-                </pic:pic>
-              </a:graphicData>
-            </a:graphic>
-          </wp:anchor>
-        </w:drawing>
-      </w:r>
-    </w:p>
-    <w:p/>
-    <w:p/>
-    <w:p/>
-    <w:p/>
-    <w:p/>
-    <w:p/>
-    <w:p/>
-    <w:p/>
-    <w:p/>
-    <w:p/>
-    <w:p/>
-    <w:p/>
-    <w:p/>
+      <w:r>
+        <w:rPr>
+          <w:lang w:val="en-US"/>
+        </w:rPr>
+        <w:t xml:space="preserve">("classifier", </w:t>
+      </w:r>
+      <w:proofErr w:type="gramStart"/>
+      <w:r>
+        <w:rPr>
+          <w:lang w:val="en-US"/>
+        </w:rPr>
+        <w:t>SVC(</w:t>
+      </w:r>
+      <w:proofErr w:type="gramEnd"/>
+      <w:r>
+        <w:rPr>
+          <w:lang w:val="en-US"/>
+        </w:rPr>
+        <w:t>kernel="poly",</w:t>
+      </w:r>
+      <w:r>
+        <w:rPr>
+          <w:lang w:val="en-US"/>
+        </w:rPr>
+        <w:t xml:space="preserve"> </w:t>
+      </w:r>
+      <w:r>
+        <w:rPr>
+          <w:lang w:val="en-US"/>
+        </w:rPr>
+        <w:t>C=1e5,</w:t>
+      </w:r>
+      <w:r>
+        <w:rPr>
+          <w:lang w:val="en-US"/>
+        </w:rPr>
+        <w:t xml:space="preserve"> </w:t>
+      </w:r>
+      <w:r>
+        <w:rPr>
+          <w:lang w:val="en-US"/>
+        </w:rPr>
+        <w:t>tol=1e-5,</w:t>
+      </w:r>
+      <w:r>
+        <w:rPr>
+          <w:lang w:val="en-US"/>
+        </w:rPr>
+        <w:t xml:space="preserve"> </w:t>
+      </w:r>
+      <w:r>
+        <w:rPr>
+          <w:lang w:val="en-US"/>
+        </w:rPr>
+        <w:t>shrinking=True,</w:t>
+      </w:r>
+      <w:r>
+        <w:rPr>
+          <w:lang w:val="en-US"/>
+        </w:rPr>
+        <w:t xml:space="preserve"> </w:t>
+      </w:r>
+      <w:r>
+        <w:rPr>
+          <w:lang w:val="en-US"/>
+        </w:rPr>
+        <w:t>gamma=0.001,</w:t>
+      </w:r>
+      <w:r>
+        <w:rPr>
+          <w:lang w:val="en-US"/>
+        </w:rPr>
+        <w:t xml:space="preserve"> </w:t>
+      </w:r>
+      <w:r>
+        <w:rPr>
+          <w:lang w:val="en-US"/>
+        </w:rPr>
+        <w:t>degree=6,</w:t>
+      </w:r>
+      <w:r>
+        <w:rPr>
+          <w:lang w:val="en-US"/>
+        </w:rPr>
+        <w:t xml:space="preserve"> </w:t>
+      </w:r>
+      <w:r>
+        <w:rPr>
+          <w:lang w:val="en-US"/>
+        </w:rPr>
+        <w:t>coef0=2.0,</w:t>
+      </w:r>
+      <w:r>
+        <w:rPr>
+          <w:lang w:val="en-US"/>
+        </w:rPr>
+        <w:t xml:space="preserve"> </w:t>
+      </w:r>
+      <w:r>
+        <w:rPr>
+          <w:lang w:val="en-US"/>
+        </w:rPr>
+        <w:t>class_weight=class_weights_encoded,</w:t>
+      </w:r>
+      <w:r>
+        <w:rPr>
+          <w:lang w:val="en-US"/>
+        </w:rPr>
+        <w:t xml:space="preserve"> </w:t>
+      </w:r>
+      <w:r>
+        <w:rPr>
+          <w:lang w:val="en-US"/>
+        </w:rPr>
+        <w:t>probability=True,</w:t>
+      </w:r>
+      <w:r>
+        <w:rPr>
+          <w:lang w:val="en-US"/>
+        </w:rPr>
+        <w:t xml:space="preserve"> </w:t>
+      </w:r>
+      <w:r>
+        <w:rPr>
+          <w:lang w:val="en-US"/>
+        </w:rPr>
+        <w:t>random_state=RANDOM_STATE</w:t>
+      </w:r>
+      <w:proofErr w:type="gramStart"/>
+      <w:r>
+        <w:rPr>
+          <w:lang w:val="en-US"/>
+        </w:rPr>
+        <w:t>,</w:t>
+      </w:r>
+      <w:r>
+        <w:rPr>
+          <w:lang w:val="en-US"/>
+        </w:rPr>
+        <w:t xml:space="preserve"> </w:t>
+      </w:r>
+      <w:r>
+        <w:rPr>
+          <w:lang w:val="en-US"/>
+        </w:rPr>
+        <w:t>)</w:t>
+      </w:r>
+      <w:proofErr w:type="gramEnd"/>
+      <w:r>
+        <w:rPr>
+          <w:lang w:val="en-US"/>
+        </w:rPr>
+        <w:t>),])</w:t>
+      </w:r>
+    </w:p>
+    <w:p>
+      <w:pPr>
+        <w:rPr>
+          <w:lang w:val="en-US"/>
+        </w:rPr>
+      </w:pPr>
+      <w:r>
+        <w:rPr>
+          <w:lang w:val="en-US"/>
+        </w:rPr>
+        <w:t xml:space="preserve">Weights: </w:t>
+      </w:r>
+      <w:r>
+        <w:rPr>
+          <w:lang w:val="en-US"/>
+        </w:rPr>
+        <w:t>"LAYING": 1.0,</w:t>
+      </w:r>
+      <w:r>
+        <w:rPr>
+          <w:lang w:val="en-US"/>
+        </w:rPr>
+        <w:t xml:space="preserve"> </w:t>
+      </w:r>
+      <w:r>
+        <w:rPr>
+          <w:lang w:val="en-US"/>
+        </w:rPr>
+        <w:t>"SITTING": 2.0,</w:t>
+      </w:r>
+      <w:r>
+        <w:rPr>
+          <w:lang w:val="en-US"/>
+        </w:rPr>
+        <w:t xml:space="preserve"> </w:t>
+      </w:r>
+      <w:r>
+        <w:rPr>
+          <w:lang w:val="en-US"/>
+        </w:rPr>
+        <w:t>"STANDING": 1.5,</w:t>
+      </w:r>
+      <w:r>
+        <w:rPr>
+          <w:lang w:val="en-US"/>
+        </w:rPr>
+        <w:t xml:space="preserve"> </w:t>
+      </w:r>
+      <w:r>
+        <w:rPr>
+          <w:lang w:val="en-US"/>
+        </w:rPr>
+        <w:t>"WALKING": 1.2,</w:t>
+      </w:r>
+      <w:r>
+        <w:rPr>
+          <w:lang w:val="en-US"/>
+        </w:rPr>
+        <w:t xml:space="preserve"> </w:t>
+      </w:r>
+      <w:r>
+        <w:rPr>
+          <w:lang w:val="en-US"/>
+        </w:rPr>
+        <w:t>"WALKING_DOWNSTAIRS": 3.0,</w:t>
+      </w:r>
+      <w:r>
+        <w:rPr>
+          <w:lang w:val="en-US"/>
+        </w:rPr>
+        <w:t xml:space="preserve"> </w:t>
+      </w:r>
+      <w:r>
+        <w:rPr>
+          <w:lang w:val="en-US"/>
+        </w:rPr>
+        <w:t>"WALKING_UPSTAIRS": 2.0</w:t>
+      </w:r>
+    </w:p>
+    <w:p>
+      <w:pPr>
+        <w:rPr>
+          <w:lang w:val="en-US"/>
+        </w:rPr>
+      </w:pPr>
+    </w:p>
+    <w:p>
+      <w:pPr>
+        <w:rPr>
+          <w:lang w:val="en-US"/>
+        </w:rPr>
+      </w:pPr>
+      <w:r>
+        <w:rPr>
+          <w:lang w:val="en-US"/>
+        </w:rPr>
+        <w:t>XGBoost (Stufe 1):</w:t>
+      </w:r>
+    </w:p>
+    <w:p>
+      <w:pPr>
+        <w:rPr>
+          <w:lang w:val="en-US"/>
+        </w:rPr>
+      </w:pPr>
+      <w:r>
+        <w:rPr>
+          <w:lang w:val="en-US"/>
+        </w:rPr>
+        <w:t>dict(objective="multi:softprob",</w:t>
+      </w:r>
+      <w:r>
+        <w:rPr>
+          <w:lang w:val="en-US"/>
+        </w:rPr>
+        <w:t xml:space="preserve"> </w:t>
+      </w:r>
+      <w:r>
+        <w:rPr>
+          <w:lang w:val="en-US"/>
+        </w:rPr>
+        <w:t>eval_metric="mlogloss",</w:t>
+      </w:r>
+      <w:r>
+        <w:rPr>
+          <w:lang w:val="en-US"/>
+        </w:rPr>
+        <w:t xml:space="preserve"> </w:t>
+      </w:r>
+      <w:r>
+        <w:rPr>
+          <w:lang w:val="en-US"/>
+        </w:rPr>
+        <w:t>tree_method="hist",</w:t>
+      </w:r>
+      <w:r>
+        <w:rPr>
+          <w:lang w:val="en-US"/>
+        </w:rPr>
+        <w:t xml:space="preserve"> </w:t>
+      </w:r>
+      <w:r>
+        <w:rPr>
+          <w:lang w:val="en-US"/>
+        </w:rPr>
+        <w:t>random_state=RANDOM_STATE,</w:t>
+      </w:r>
+      <w:r>
+        <w:rPr>
+          <w:lang w:val="en-US"/>
+        </w:rPr>
+        <w:t xml:space="preserve"> </w:t>
+      </w:r>
+      <w:r>
+        <w:rPr>
+          <w:lang w:val="en-US"/>
+        </w:rPr>
+        <w:t>n_jobs=-1,</w:t>
+      </w:r>
+      <w:r>
+        <w:rPr>
+          <w:lang w:val="en-US"/>
+        </w:rPr>
+        <w:t xml:space="preserve"> </w:t>
+      </w:r>
+      <w:r>
+        <w:rPr>
+          <w:lang w:val="en-US"/>
+        </w:rPr>
+        <w:t>n_estimators=300,</w:t>
+      </w:r>
+      <w:r>
+        <w:rPr>
+          <w:lang w:val="en-US"/>
+        </w:rPr>
+        <w:t xml:space="preserve"> </w:t>
+      </w:r>
+      <w:r>
+        <w:rPr>
+          <w:lang w:val="en-US"/>
+        </w:rPr>
+        <w:t>max_depth=2,</w:t>
+      </w:r>
+      <w:r>
+        <w:rPr>
+          <w:lang w:val="en-US"/>
+        </w:rPr>
+        <w:t xml:space="preserve"> </w:t>
+      </w:r>
+      <w:r>
+        <w:rPr>
+          <w:lang w:val="en-US"/>
+        </w:rPr>
+        <w:t>learning_rate=0.1,</w:t>
+      </w:r>
+      <w:r>
+        <w:rPr>
+          <w:lang w:val="en-US"/>
+        </w:rPr>
+        <w:t xml:space="preserve"> </w:t>
+      </w:r>
+      <w:r>
+        <w:rPr>
+          <w:lang w:val="en-US"/>
+        </w:rPr>
+        <w:t>subsample=0.8,</w:t>
+      </w:r>
+      <w:r>
+        <w:rPr>
+          <w:lang w:val="en-US"/>
+        </w:rPr>
+        <w:t xml:space="preserve"> </w:t>
+      </w:r>
+      <w:r>
+        <w:rPr>
+          <w:lang w:val="en-US"/>
+        </w:rPr>
+        <w:t>colsample_bytree=1.0,</w:t>
+      </w:r>
+      <w:r>
+        <w:rPr>
+          <w:lang w:val="en-US"/>
+        </w:rPr>
+        <w:t xml:space="preserve"> </w:t>
+      </w:r>
+      <w:r>
+        <w:rPr>
+          <w:lang w:val="en-US"/>
+        </w:rPr>
+        <w:t>min_child_weight=3,</w:t>
+      </w:r>
+      <w:r>
+        <w:rPr>
+          <w:lang w:val="en-US"/>
+        </w:rPr>
+        <w:t xml:space="preserve"> </w:t>
+      </w:r>
+      <w:r>
+        <w:rPr>
+          <w:lang w:val="en-US"/>
+        </w:rPr>
+        <w:t>reg_lambda=5,</w:t>
+      </w:r>
+      <w:r>
+        <w:rPr>
+          <w:lang w:val="en-US"/>
+        </w:rPr>
+        <w:t xml:space="preserve"> </w:t>
+      </w:r>
+      <w:r>
+        <w:rPr>
+          <w:lang w:val="en-US"/>
+        </w:rPr>
+        <w:t>reg_alpha=0.1,)</w:t>
+      </w:r>
+    </w:p>
+    <w:p>
+      <w:pPr>
+        <w:rPr>
+          <w:lang w:val="en-US"/>
+        </w:rPr>
+      </w:pPr>
+    </w:p>
+    <w:p>
+      <w:pPr>
+        <w:rPr>
+          <w:lang w:val="en-US"/>
+        </w:rPr>
+      </w:pPr>
+      <w:r>
+        <w:rPr>
+          <w:lang w:val="en-US"/>
+        </w:rPr>
+        <w:t>VotingClassifier (Stufe 1):</w:t>
+      </w:r>
+    </w:p>
+    <w:p>
+      <w:pPr>
+        <w:rPr>
+          <w:lang w:val="en-US"/>
+        </w:rPr>
+      </w:pPr>
+      <w:proofErr w:type="gramStart"/>
+      <w:r>
+        <w:rPr>
+          <w:lang w:val="en-US"/>
+        </w:rPr>
+        <w:t>VotingClassifier(</w:t>
+      </w:r>
+      <w:proofErr w:type="gramEnd"/>
+      <w:r>
+        <w:rPr>
+          <w:lang w:val="en-US"/>
+        </w:rPr>
+        <w:t>estimators</w:t>
+      </w:r>
+      <w:proofErr w:type="gramStart"/>
+      <w:r>
+        <w:rPr>
+          <w:lang w:val="en-US"/>
+        </w:rPr>
+        <w:t>=[</w:t>
+      </w:r>
+      <w:proofErr w:type="gramEnd"/>
+      <w:r>
+        <w:rPr>
+          <w:lang w:val="en-US"/>
+        </w:rPr>
+        <w:t>("poly_svm", poly_svm_main), ("xgb", xgb_main),],</w:t>
+      </w:r>
+      <w:r>
+        <w:rPr>
+          <w:lang w:val="en-US"/>
+        </w:rPr>
+        <w:t xml:space="preserve"> </w:t>
+      </w:r>
+      <w:r>
+        <w:rPr>
+          <w:lang w:val="en-US"/>
+        </w:rPr>
+        <w:t>voting="soft",</w:t>
+      </w:r>
+      <w:r>
+        <w:rPr>
+          <w:lang w:val="en-US"/>
+        </w:rPr>
+        <w:t xml:space="preserve"> </w:t>
+      </w:r>
+      <w:r>
+        <w:rPr>
+          <w:lang w:val="en-US"/>
+        </w:rPr>
+        <w:t>weights</w:t>
+      </w:r>
+      <w:proofErr w:type="gramStart"/>
+      <w:r>
+        <w:rPr>
+          <w:lang w:val="en-US"/>
+        </w:rPr>
+        <w:t>=[</w:t>
+      </w:r>
+      <w:proofErr w:type="gramEnd"/>
+      <w:r>
+        <w:rPr>
+          <w:lang w:val="en-US"/>
+        </w:rPr>
+        <w:t>1, 3],</w:t>
+      </w:r>
+      <w:r>
+        <w:rPr>
+          <w:lang w:val="en-US"/>
+        </w:rPr>
+        <w:t xml:space="preserve"> </w:t>
+      </w:r>
+      <w:r>
+        <w:rPr>
+          <w:lang w:val="en-US"/>
+        </w:rPr>
+        <w:t>n_jobs=-1,)</w:t>
+      </w:r>
+    </w:p>
+    <w:p>
+      <w:pPr>
+        <w:rPr>
+          <w:lang w:val="en-US"/>
+        </w:rPr>
+      </w:pPr>
+    </w:p>
+    <w:p>
+      <w:pPr>
+        <w:rPr>
+          <w:lang w:val="en-US"/>
+        </w:rPr>
+      </w:pPr>
+      <w:r>
+        <w:rPr>
+          <w:lang w:val="en-US"/>
+        </w:rPr>
+        <w:t>Poly-SVM (Stufe 2):</w:t>
+      </w:r>
+    </w:p>
+    <w:p>
+      <w:pPr>
+        <w:rPr>
+          <w:lang w:val="en-US"/>
+        </w:rPr>
+      </w:pPr>
+      <w:r>
+        <w:rPr>
+          <w:lang w:val="en-US"/>
+        </w:rPr>
+        <w:t>Pipeline(steps=[("scaler", StandardScaler()),</w:t>
+      </w:r>
+      <w:r>
+        <w:rPr>
+          <w:lang w:val="en-US"/>
+        </w:rPr>
+        <w:t xml:space="preserve"> </w:t>
+      </w:r>
+      <w:r>
+        <w:rPr>
+          <w:lang w:val="en-US"/>
+        </w:rPr>
+        <w:t>("select",</w:t>
+      </w:r>
+      <w:r>
+        <w:rPr>
+          <w:lang w:val="en-US"/>
+        </w:rPr>
+        <w:t xml:space="preserve"> </w:t>
+      </w:r>
+      <w:r>
+        <w:rPr>
+          <w:lang w:val="en-US"/>
+        </w:rPr>
+        <w:t>SelectKBest(score_func=f_classif, k=150)), ("classifier", SVC(kernel="poly",</w:t>
+      </w:r>
+      <w:r>
+        <w:rPr>
+          <w:lang w:val="en-US"/>
+        </w:rPr>
+        <w:t xml:space="preserve"> </w:t>
+      </w:r>
+      <w:r>
+        <w:rPr>
+          <w:lang w:val="en-US"/>
+        </w:rPr>
+        <w:t>C=10,</w:t>
+      </w:r>
+      <w:r>
+        <w:rPr>
+          <w:lang w:val="en-US"/>
+        </w:rPr>
+        <w:t xml:space="preserve"> </w:t>
+      </w:r>
+      <w:r>
+        <w:rPr>
+          <w:lang w:val="en-US"/>
+        </w:rPr>
+        <w:t>gamma=0.0003,</w:t>
+      </w:r>
+      <w:r>
+        <w:rPr>
+          <w:lang w:val="en-US"/>
+        </w:rPr>
+        <w:t xml:space="preserve"> </w:t>
+      </w:r>
+      <w:r>
+        <w:rPr>
+          <w:lang w:val="en-US"/>
+        </w:rPr>
+        <w:t>degree=3,</w:t>
+      </w:r>
+      <w:r>
+        <w:rPr>
+          <w:lang w:val="en-US"/>
+        </w:rPr>
+        <w:t xml:space="preserve"> </w:t>
+      </w:r>
+      <w:r>
+        <w:rPr>
+          <w:lang w:val="en-US"/>
+        </w:rPr>
+        <w:t>coef0=2.0,</w:t>
+      </w:r>
+      <w:r>
+        <w:rPr>
+          <w:lang w:val="en-US"/>
+        </w:rPr>
+        <w:t xml:space="preserve"> </w:t>
+      </w:r>
+      <w:r>
+        <w:rPr>
+          <w:lang w:val="en-US"/>
+        </w:rPr>
+        <w:t>class_weight={"SITTING": 1.4, "STANDING": 1.0},</w:t>
+      </w:r>
+      <w:r>
+        <w:rPr>
+          <w:lang w:val="en-US"/>
+        </w:rPr>
+        <w:t xml:space="preserve"> </w:t>
+      </w:r>
+      <w:r>
+        <w:rPr>
+          <w:lang w:val="en-US"/>
+        </w:rPr>
+        <w:t>random_state=RANDOM_STATE,)),])</w:t>
+      </w:r>
+    </w:p>
+    <w:p>
+      <w:pPr>
+        <w:rPr>
+          <w:lang w:val="en-US"/>
+        </w:rPr>
+      </w:pPr>
+    </w:p>
     <w:sdt>
       <w:sdtPr>
         <w:rPr>
@@ -1966,1032 +1965,13 @@
                 <w:fldChar w:fldCharType="end"/>
               </w:r>
             </w:p>
-            <w:tbl>
-              <w:tblPr>
-                <w:tblStyle w:val="Tabellenraster"/>
-                <w:tblpPr w:leftFromText="142" w:rightFromText="142" w:topFromText="284" w:vertAnchor="text" w:horzAnchor="page" w:tblpX="7381" w:tblpY="1187"/>
-                <w:tblW w:w="0" w:type="auto"/>
-                <w:tblLook w:val="04A0" w:firstRow="1" w:lastRow="0" w:firstColumn="1" w:lastColumn="0" w:noHBand="0" w:noVBand="1"/>
-              </w:tblPr>
-              <w:tblGrid>
-                <w:gridCol w:w="1975"/>
-                <w:gridCol w:w="2340"/>
-              </w:tblGrid>
-              <w:tr>
-                <w:trPr>
-                  <w:trHeight w:val="517"/>
-                </w:trPr>
-                <w:tc>
-                  <w:tcPr>
-                    <w:tcW w:w="1975" w:type="dxa"/>
-                  </w:tcPr>
-                  <w:p>
-                    <w:pPr>
-                      <w:spacing w:line="240" w:lineRule="auto"/>
-                      <w:rPr>
-                        <w:b/>
-                        <w:bCs/>
-                      </w:rPr>
-                    </w:pPr>
-                    <w:r>
-                      <w:rPr>
-                        <w:b/>
-                        <w:bCs/>
-                      </w:rPr>
-                      <w:t>Parameter</w:t>
-                    </w:r>
-                  </w:p>
-                  <w:p>
-                    <w:pPr>
-                      <w:spacing w:line="240" w:lineRule="auto"/>
-                      <w:rPr>
-                        <w:b/>
-                        <w:bCs/>
-                      </w:rPr>
-                    </w:pPr>
-                    <w:proofErr w:type="spellStart"/>
-                    <w:r>
-                      <w:rPr>
-                        <w:b/>
-                        <w:bCs/>
-                      </w:rPr>
-                      <w:t>XGBoost</w:t>
-                    </w:r>
-                    <w:proofErr w:type="spellEnd"/>
-                  </w:p>
-                </w:tc>
-                <w:tc>
-                  <w:tcPr>
-                    <w:tcW w:w="2340" w:type="dxa"/>
-                  </w:tcPr>
-                  <w:p>
-                    <w:pPr>
-                      <w:spacing w:line="240" w:lineRule="auto"/>
-                      <w:rPr>
-                        <w:b/>
-                        <w:bCs/>
-                      </w:rPr>
-                    </w:pPr>
-                    <w:r>
-                      <w:rPr>
-                        <w:b/>
-                        <w:bCs/>
-                      </w:rPr>
-                      <w:t>Wert</w:t>
-                    </w:r>
-                  </w:p>
-                </w:tc>
-              </w:tr>
-              <w:tr>
-                <w:trPr>
-                  <w:trHeight w:val="517"/>
-                </w:trPr>
-                <w:tc>
-                  <w:tcPr>
-                    <w:tcW w:w="1975" w:type="dxa"/>
-                  </w:tcPr>
-                  <w:p>
-                    <w:pPr>
-                      <w:spacing w:line="240" w:lineRule="auto"/>
-                    </w:pPr>
-                    <w:proofErr w:type="spellStart"/>
-                    <w:r>
-                      <w:lastRenderedPageBreak/>
-                      <w:t>objective</w:t>
-                    </w:r>
-                    <w:proofErr w:type="spellEnd"/>
-                  </w:p>
-                </w:tc>
-                <w:tc>
-                  <w:tcPr>
-                    <w:tcW w:w="2340" w:type="dxa"/>
-                  </w:tcPr>
-                  <w:p>
-                    <w:pPr>
-                      <w:spacing w:line="240" w:lineRule="auto"/>
-                    </w:pPr>
-                    <w:proofErr w:type="spellStart"/>
-                    <w:proofErr w:type="gramStart"/>
-                    <w:r>
-                      <w:t>Multi:softprob</w:t>
-                    </w:r>
-                    <w:proofErr w:type="spellEnd"/>
-                    <w:proofErr w:type="gramEnd"/>
-                  </w:p>
-                </w:tc>
-              </w:tr>
-              <w:tr>
-                <w:trPr>
-                  <w:trHeight w:val="517"/>
-                </w:trPr>
-                <w:tc>
-                  <w:tcPr>
-                    <w:tcW w:w="1975" w:type="dxa"/>
-                  </w:tcPr>
-                  <w:p>
-                    <w:pPr>
-                      <w:spacing w:line="240" w:lineRule="auto"/>
-                    </w:pPr>
-                    <w:proofErr w:type="spellStart"/>
-                    <w:r>
-                      <w:t>eval_metric</w:t>
-                    </w:r>
-                    <w:proofErr w:type="spellEnd"/>
-                  </w:p>
-                </w:tc>
-                <w:tc>
-                  <w:tcPr>
-                    <w:tcW w:w="2340" w:type="dxa"/>
-                  </w:tcPr>
-                  <w:p>
-                    <w:pPr>
-                      <w:spacing w:line="240" w:lineRule="auto"/>
-                    </w:pPr>
-                    <w:proofErr w:type="spellStart"/>
-                    <w:r>
-                      <w:t>mlogloss</w:t>
-                    </w:r>
-                    <w:proofErr w:type="spellEnd"/>
-                  </w:p>
-                </w:tc>
-              </w:tr>
-              <w:tr>
-                <w:trPr>
-                  <w:trHeight w:val="517"/>
-                </w:trPr>
-                <w:tc>
-                  <w:tcPr>
-                    <w:tcW w:w="1975" w:type="dxa"/>
-                  </w:tcPr>
-                  <w:p>
-                    <w:pPr>
-                      <w:spacing w:line="240" w:lineRule="auto"/>
-                    </w:pPr>
-                    <w:proofErr w:type="spellStart"/>
-                    <w:r>
-                      <w:t>tree_method</w:t>
-                    </w:r>
-                    <w:proofErr w:type="spellEnd"/>
-                  </w:p>
-                </w:tc>
-                <w:tc>
-                  <w:tcPr>
-                    <w:tcW w:w="2340" w:type="dxa"/>
-                  </w:tcPr>
-                  <w:p>
-                    <w:pPr>
-                      <w:spacing w:line="240" w:lineRule="auto"/>
-                    </w:pPr>
-                    <w:proofErr w:type="spellStart"/>
-                    <w:r>
-                      <w:t>hist</w:t>
-                    </w:r>
-                    <w:proofErr w:type="spellEnd"/>
-                  </w:p>
-                </w:tc>
-              </w:tr>
-              <w:tr>
-                <w:trPr>
-                  <w:trHeight w:val="517"/>
-                </w:trPr>
-                <w:tc>
-                  <w:tcPr>
-                    <w:tcW w:w="1975" w:type="dxa"/>
-                  </w:tcPr>
-                  <w:p>
-                    <w:pPr>
-                      <w:spacing w:line="240" w:lineRule="auto"/>
-                    </w:pPr>
-                    <w:proofErr w:type="spellStart"/>
-                    <w:r>
-                      <w:t>random_state</w:t>
-                    </w:r>
-                    <w:proofErr w:type="spellEnd"/>
-                  </w:p>
-                </w:tc>
-                <w:tc>
-                  <w:tcPr>
-                    <w:tcW w:w="2340" w:type="dxa"/>
-                  </w:tcPr>
-                  <w:p>
-                    <w:pPr>
-                      <w:spacing w:line="240" w:lineRule="auto"/>
-                    </w:pPr>
-                    <w:r>
-                      <w:t>RANDOM_STATE</w:t>
-                    </w:r>
-                  </w:p>
-                </w:tc>
-              </w:tr>
-              <w:tr>
-                <w:trPr>
-                  <w:trHeight w:val="517"/>
-                </w:trPr>
-                <w:tc>
-                  <w:tcPr>
-                    <w:tcW w:w="1975" w:type="dxa"/>
-                  </w:tcPr>
-                  <w:p>
-                    <w:pPr>
-                      <w:spacing w:line="240" w:lineRule="auto"/>
-                    </w:pPr>
-                    <w:proofErr w:type="spellStart"/>
-                    <w:r>
-                      <w:t>n_jobs</w:t>
-                    </w:r>
-                    <w:proofErr w:type="spellEnd"/>
-                  </w:p>
-                </w:tc>
-                <w:tc>
-                  <w:tcPr>
-                    <w:tcW w:w="2340" w:type="dxa"/>
-                  </w:tcPr>
-                  <w:p>
-                    <w:pPr>
-                      <w:spacing w:line="240" w:lineRule="auto"/>
-                    </w:pPr>
-                    <w:r>
-                      <w:t>-1</w:t>
-                    </w:r>
-                  </w:p>
-                </w:tc>
-              </w:tr>
-              <w:tr>
-                <w:trPr>
-                  <w:trHeight w:val="517"/>
-                </w:trPr>
-                <w:tc>
-                  <w:tcPr>
-                    <w:tcW w:w="1975" w:type="dxa"/>
-                  </w:tcPr>
-                  <w:p>
-                    <w:pPr>
-                      <w:spacing w:line="240" w:lineRule="auto"/>
-                    </w:pPr>
-                    <w:proofErr w:type="spellStart"/>
-                    <w:r>
-                      <w:t>n_estimators</w:t>
-                    </w:r>
-                    <w:proofErr w:type="spellEnd"/>
-                  </w:p>
-                </w:tc>
-                <w:tc>
-                  <w:tcPr>
-                    <w:tcW w:w="2340" w:type="dxa"/>
-                  </w:tcPr>
-                  <w:p>
-                    <w:pPr>
-                      <w:spacing w:line="240" w:lineRule="auto"/>
-                    </w:pPr>
-                    <w:r>
-                      <w:t>300</w:t>
-                    </w:r>
-                  </w:p>
-                </w:tc>
-              </w:tr>
-              <w:tr>
-                <w:trPr>
-                  <w:trHeight w:val="517"/>
-                </w:trPr>
-                <w:tc>
-                  <w:tcPr>
-                    <w:tcW w:w="1975" w:type="dxa"/>
-                  </w:tcPr>
-                  <w:p>
-                    <w:pPr>
-                      <w:spacing w:line="240" w:lineRule="auto"/>
-                    </w:pPr>
-                    <w:proofErr w:type="spellStart"/>
-                    <w:r>
-                      <w:t>max_depth</w:t>
-                    </w:r>
-                    <w:proofErr w:type="spellEnd"/>
-                  </w:p>
-                </w:tc>
-                <w:tc>
-                  <w:tcPr>
-                    <w:tcW w:w="2340" w:type="dxa"/>
-                  </w:tcPr>
-                  <w:p>
-                    <w:pPr>
-                      <w:spacing w:line="240" w:lineRule="auto"/>
-                    </w:pPr>
-                    <w:r>
-                      <w:t>2</w:t>
-                    </w:r>
-                  </w:p>
-                </w:tc>
-              </w:tr>
-              <w:tr>
-                <w:trPr>
-                  <w:trHeight w:val="517"/>
-                </w:trPr>
-                <w:tc>
-                  <w:tcPr>
-                    <w:tcW w:w="1975" w:type="dxa"/>
-                  </w:tcPr>
-                  <w:p>
-                    <w:pPr>
-                      <w:spacing w:line="240" w:lineRule="auto"/>
-                    </w:pPr>
-                    <w:proofErr w:type="spellStart"/>
-                    <w:r>
-                      <w:t>learning_rate</w:t>
-                    </w:r>
-                    <w:proofErr w:type="spellEnd"/>
-                  </w:p>
-                </w:tc>
-                <w:tc>
-                  <w:tcPr>
-                    <w:tcW w:w="2340" w:type="dxa"/>
-                  </w:tcPr>
-                  <w:p>
-                    <w:pPr>
-                      <w:spacing w:line="240" w:lineRule="auto"/>
-                    </w:pPr>
-                    <w:r>
-                      <w:t>0.1</w:t>
-                    </w:r>
-                  </w:p>
-                </w:tc>
-              </w:tr>
-              <w:tr>
-                <w:trPr>
-                  <w:trHeight w:val="517"/>
-                </w:trPr>
-                <w:tc>
-                  <w:tcPr>
-                    <w:tcW w:w="1975" w:type="dxa"/>
-                  </w:tcPr>
-                  <w:p>
-                    <w:pPr>
-                      <w:spacing w:line="240" w:lineRule="auto"/>
-                    </w:pPr>
-                    <w:r>
-                      <w:t>subsampl</w:t>
-                    </w:r>
-                    <w:r>
-                      <w:t>e</w:t>
-                    </w:r>
-                  </w:p>
-                </w:tc>
-                <w:tc>
-                  <w:tcPr>
-                    <w:tcW w:w="2340" w:type="dxa"/>
-                  </w:tcPr>
-                  <w:p>
-                    <w:pPr>
-                      <w:spacing w:line="240" w:lineRule="auto"/>
-                    </w:pPr>
-                    <w:r>
-                      <w:t>0.8</w:t>
-                    </w:r>
-                  </w:p>
-                </w:tc>
-              </w:tr>
-              <w:tr>
-                <w:trPr>
-                  <w:trHeight w:val="517"/>
-                </w:trPr>
-                <w:tc>
-                  <w:tcPr>
-                    <w:tcW w:w="1975" w:type="dxa"/>
-                  </w:tcPr>
-                  <w:p>
-                    <w:pPr>
-                      <w:spacing w:line="240" w:lineRule="auto"/>
-                    </w:pPr>
-                    <w:proofErr w:type="spellStart"/>
-                    <w:r>
-                      <w:t>colsample_bytree</w:t>
-                    </w:r>
-                    <w:proofErr w:type="spellEnd"/>
-                  </w:p>
-                </w:tc>
-                <w:tc>
-                  <w:tcPr>
-                    <w:tcW w:w="2340" w:type="dxa"/>
-                  </w:tcPr>
-                  <w:p>
-                    <w:pPr>
-                      <w:spacing w:line="240" w:lineRule="auto"/>
-                    </w:pPr>
-                    <w:r>
-                      <w:t>1.0</w:t>
-                    </w:r>
-                  </w:p>
-                </w:tc>
-              </w:tr>
-              <w:tr>
-                <w:trPr>
-                  <w:trHeight w:val="517"/>
-                </w:trPr>
-                <w:tc>
-                  <w:tcPr>
-                    <w:tcW w:w="1975" w:type="dxa"/>
-                  </w:tcPr>
-                  <w:p>
-                    <w:pPr>
-                      <w:spacing w:line="240" w:lineRule="auto"/>
-                    </w:pPr>
-                    <w:proofErr w:type="spellStart"/>
-                    <w:r>
-                      <w:t>min_child_weight</w:t>
-                    </w:r>
-                    <w:proofErr w:type="spellEnd"/>
-                  </w:p>
-                </w:tc>
-                <w:tc>
-                  <w:tcPr>
-                    <w:tcW w:w="2340" w:type="dxa"/>
-                  </w:tcPr>
-                  <w:p>
-                    <w:pPr>
-                      <w:spacing w:line="240" w:lineRule="auto"/>
-                    </w:pPr>
-                    <w:r>
-                      <w:t>3</w:t>
-                    </w:r>
-                  </w:p>
-                </w:tc>
-              </w:tr>
-              <w:tr>
-                <w:trPr>
-                  <w:trHeight w:val="517"/>
-                </w:trPr>
-                <w:tc>
-                  <w:tcPr>
-                    <w:tcW w:w="1975" w:type="dxa"/>
-                  </w:tcPr>
-                  <w:p>
-                    <w:pPr>
-                      <w:spacing w:line="240" w:lineRule="auto"/>
-                    </w:pPr>
-                    <w:proofErr w:type="spellStart"/>
-                    <w:r>
-                      <w:t>reg_lambda</w:t>
-                    </w:r>
-                    <w:proofErr w:type="spellEnd"/>
-                  </w:p>
-                </w:tc>
-                <w:tc>
-                  <w:tcPr>
-                    <w:tcW w:w="2340" w:type="dxa"/>
-                  </w:tcPr>
-                  <w:p>
-                    <w:pPr>
-                      <w:spacing w:line="240" w:lineRule="auto"/>
-                    </w:pPr>
-                    <w:r>
-                      <w:t>5</w:t>
-                    </w:r>
-                  </w:p>
-                </w:tc>
-              </w:tr>
-              <w:tr>
-                <w:trPr>
-                  <w:trHeight w:val="517"/>
-                </w:trPr>
-                <w:tc>
-                  <w:tcPr>
-                    <w:tcW w:w="1975" w:type="dxa"/>
-                  </w:tcPr>
-                  <w:p>
-                    <w:pPr>
-                      <w:spacing w:line="240" w:lineRule="auto"/>
-                    </w:pPr>
-                    <w:proofErr w:type="spellStart"/>
-                    <w:r>
-                      <w:t>reg_alpha</w:t>
-                    </w:r>
-                    <w:proofErr w:type="spellEnd"/>
-                  </w:p>
-                </w:tc>
-                <w:tc>
-                  <w:tcPr>
-                    <w:tcW w:w="2340" w:type="dxa"/>
-                  </w:tcPr>
-                  <w:p>
-                    <w:pPr>
-                      <w:spacing w:line="240" w:lineRule="auto"/>
-                    </w:pPr>
-                    <w:r>
-                      <w:t>0.1</w:t>
-                    </w:r>
-                  </w:p>
-                </w:tc>
-              </w:tr>
-            </w:tbl>
-            <w:p/>
-            <w:tbl>
-              <w:tblPr>
-                <w:tblStyle w:val="Tabellenraster"/>
-                <w:tblpPr w:leftFromText="141" w:rightFromText="141" w:vertAnchor="text" w:horzAnchor="page" w:tblpX="2341" w:tblpY="797"/>
-                <w:tblW w:w="0" w:type="auto"/>
-                <w:tblLook w:val="04A0" w:firstRow="1" w:lastRow="0" w:firstColumn="1" w:lastColumn="0" w:noHBand="0" w:noVBand="1"/>
-              </w:tblPr>
-              <w:tblGrid>
-                <w:gridCol w:w="1551"/>
-                <w:gridCol w:w="2773"/>
-              </w:tblGrid>
-              <w:tr>
-                <w:trPr>
-                  <w:trHeight w:val="429"/>
-                </w:trPr>
-                <w:tc>
-                  <w:tcPr>
-                    <w:tcW w:w="1551" w:type="dxa"/>
-                  </w:tcPr>
-                  <w:p>
-                    <w:pPr>
-                      <w:spacing w:line="240" w:lineRule="auto"/>
-                      <w:rPr>
-                        <w:b/>
-                        <w:bCs/>
-                      </w:rPr>
-                    </w:pPr>
-                    <w:r>
-                      <w:rPr>
-                        <w:b/>
-                        <w:bCs/>
-                      </w:rPr>
-                      <w:t xml:space="preserve">Parameter </w:t>
-                    </w:r>
-                  </w:p>
-                  <w:p>
-                    <w:pPr>
-                      <w:spacing w:line="240" w:lineRule="auto"/>
-                      <w:rPr>
-                        <w:b/>
-                        <w:bCs/>
-                      </w:rPr>
-                    </w:pPr>
-                    <w:r>
-                      <w:rPr>
-                        <w:b/>
-                        <w:bCs/>
-                      </w:rPr>
-                      <w:t>Poly-SVM</w:t>
-                    </w:r>
-                  </w:p>
-                </w:tc>
-                <w:tc>
-                  <w:tcPr>
-                    <w:tcW w:w="2773" w:type="dxa"/>
-                  </w:tcPr>
-                  <w:p>
-                    <w:pPr>
-                      <w:spacing w:line="240" w:lineRule="auto"/>
-                      <w:rPr>
-                        <w:b/>
-                        <w:bCs/>
-                      </w:rPr>
-                    </w:pPr>
-                    <w:r>
-                      <w:rPr>
-                        <w:b/>
-                        <w:bCs/>
-                      </w:rPr>
-                      <w:t>Wert</w:t>
-                    </w:r>
-                  </w:p>
-                </w:tc>
-              </w:tr>
-              <w:tr>
-                <w:trPr>
-                  <w:trHeight w:val="429"/>
-                </w:trPr>
-                <w:tc>
-                  <w:tcPr>
-                    <w:tcW w:w="1551" w:type="dxa"/>
-                  </w:tcPr>
-                  <w:p>
-                    <w:pPr>
-                      <w:spacing w:line="240" w:lineRule="auto"/>
-                    </w:pPr>
-                    <w:proofErr w:type="spellStart"/>
-                    <w:r>
-                      <w:t>kerner</w:t>
-                    </w:r>
-                    <w:proofErr w:type="spellEnd"/>
-                  </w:p>
-                </w:tc>
-                <w:tc>
-                  <w:tcPr>
-                    <w:tcW w:w="2773" w:type="dxa"/>
-                  </w:tcPr>
-                  <w:p>
-                    <w:pPr>
-                      <w:spacing w:line="240" w:lineRule="auto"/>
-                    </w:pPr>
-                    <w:proofErr w:type="spellStart"/>
-                    <w:r>
-                      <w:t>poly</w:t>
-                    </w:r>
-                    <w:proofErr w:type="spellEnd"/>
-                  </w:p>
-                </w:tc>
-              </w:tr>
-              <w:tr>
-                <w:trPr>
-                  <w:trHeight w:val="429"/>
-                </w:trPr>
-                <w:tc>
-                  <w:tcPr>
-                    <w:tcW w:w="1551" w:type="dxa"/>
-                  </w:tcPr>
-                  <w:p>
-                    <w:pPr>
-                      <w:spacing w:line="240" w:lineRule="auto"/>
-                    </w:pPr>
-                    <w:r>
-                      <w:t>C</w:t>
-                    </w:r>
-                  </w:p>
-                </w:tc>
-                <w:tc>
-                  <w:tcPr>
-                    <w:tcW w:w="2773" w:type="dxa"/>
-                  </w:tcPr>
-                  <w:p>
-                    <w:pPr>
-                      <w:spacing w:line="240" w:lineRule="auto"/>
-                    </w:pPr>
-                    <w:r>
-                      <w:t>1e5</w:t>
-                    </w:r>
-                  </w:p>
-                </w:tc>
-              </w:tr>
-              <w:tr>
-                <w:trPr>
-                  <w:trHeight w:val="418"/>
-                </w:trPr>
-                <w:tc>
-                  <w:tcPr>
-                    <w:tcW w:w="1551" w:type="dxa"/>
-                  </w:tcPr>
-                  <w:p>
-                    <w:pPr>
-                      <w:spacing w:line="240" w:lineRule="auto"/>
-                    </w:pPr>
-                    <w:proofErr w:type="spellStart"/>
-                    <w:r>
-                      <w:t>tol</w:t>
-                    </w:r>
-                    <w:proofErr w:type="spellEnd"/>
-                  </w:p>
-                </w:tc>
-                <w:tc>
-                  <w:tcPr>
-                    <w:tcW w:w="2773" w:type="dxa"/>
-                  </w:tcPr>
-                  <w:p>
-                    <w:pPr>
-                      <w:spacing w:line="240" w:lineRule="auto"/>
-                    </w:pPr>
-                    <w:r>
-                      <w:t>1e-5</w:t>
-                    </w:r>
-                  </w:p>
-                </w:tc>
-              </w:tr>
-              <w:tr>
-                <w:trPr>
-                  <w:trHeight w:val="429"/>
-                </w:trPr>
-                <w:tc>
-                  <w:tcPr>
-                    <w:tcW w:w="1551" w:type="dxa"/>
-                  </w:tcPr>
-                  <w:p>
-                    <w:pPr>
-                      <w:spacing w:line="240" w:lineRule="auto"/>
-                    </w:pPr>
-                    <w:proofErr w:type="spellStart"/>
-                    <w:r>
-                      <w:t>shrinking</w:t>
-                    </w:r>
-                    <w:proofErr w:type="spellEnd"/>
-                  </w:p>
-                </w:tc>
-                <w:tc>
-                  <w:tcPr>
-                    <w:tcW w:w="2773" w:type="dxa"/>
-                  </w:tcPr>
-                  <w:p>
-                    <w:pPr>
-                      <w:spacing w:line="240" w:lineRule="auto"/>
-                    </w:pPr>
-                    <w:r>
-                      <w:t>True</w:t>
-                    </w:r>
-                  </w:p>
-                </w:tc>
-              </w:tr>
-              <w:tr>
-                <w:trPr>
-                  <w:trHeight w:val="429"/>
-                </w:trPr>
-                <w:tc>
-                  <w:tcPr>
-                    <w:tcW w:w="1551" w:type="dxa"/>
-                  </w:tcPr>
-                  <w:p>
-                    <w:pPr>
-                      <w:spacing w:line="240" w:lineRule="auto"/>
-                    </w:pPr>
-                    <w:proofErr w:type="spellStart"/>
-                    <w:r>
-                      <w:t>gamma</w:t>
-                    </w:r>
-                    <w:proofErr w:type="spellEnd"/>
-                  </w:p>
-                </w:tc>
-                <w:tc>
-                  <w:tcPr>
-                    <w:tcW w:w="2773" w:type="dxa"/>
-                  </w:tcPr>
-                  <w:p>
-                    <w:pPr>
-                      <w:spacing w:line="240" w:lineRule="auto"/>
-                    </w:pPr>
-                    <w:r>
-                      <w:t>0.001</w:t>
-                    </w:r>
-                  </w:p>
-                </w:tc>
-              </w:tr>
-              <w:tr>
-                <w:trPr>
-                  <w:trHeight w:val="429"/>
-                </w:trPr>
-                <w:tc>
-                  <w:tcPr>
-                    <w:tcW w:w="1551" w:type="dxa"/>
-                  </w:tcPr>
-                  <w:p>
-                    <w:pPr>
-                      <w:spacing w:line="240" w:lineRule="auto"/>
-                    </w:pPr>
-                    <w:proofErr w:type="spellStart"/>
-                    <w:r>
-                      <w:t>degree</w:t>
-                    </w:r>
-                    <w:proofErr w:type="spellEnd"/>
-                  </w:p>
-                </w:tc>
-                <w:tc>
-                  <w:tcPr>
-                    <w:tcW w:w="2773" w:type="dxa"/>
-                  </w:tcPr>
-                  <w:p>
-                    <w:pPr>
-                      <w:spacing w:line="240" w:lineRule="auto"/>
-                    </w:pPr>
-                    <w:r>
-                      <w:t>6</w:t>
-                    </w:r>
-                  </w:p>
-                </w:tc>
-              </w:tr>
-              <w:tr>
-                <w:trPr>
-                  <w:trHeight w:val="429"/>
-                </w:trPr>
-                <w:tc>
-                  <w:tcPr>
-                    <w:tcW w:w="1551" w:type="dxa"/>
-                  </w:tcPr>
-                  <w:p>
-                    <w:pPr>
-                      <w:spacing w:line="240" w:lineRule="auto"/>
-                    </w:pPr>
-                    <w:r>
-                      <w:t>coef0</w:t>
-                    </w:r>
-                  </w:p>
-                </w:tc>
-                <w:tc>
-                  <w:tcPr>
-                    <w:tcW w:w="2773" w:type="dxa"/>
-                  </w:tcPr>
-                  <w:p>
-                    <w:pPr>
-                      <w:spacing w:line="240" w:lineRule="auto"/>
-                    </w:pPr>
-                    <w:r>
-                      <w:t>2.0</w:t>
-                    </w:r>
-                  </w:p>
-                </w:tc>
-              </w:tr>
-              <w:tr>
-                <w:trPr>
-                  <w:trHeight w:val="429"/>
-                </w:trPr>
-                <w:tc>
-                  <w:tcPr>
-                    <w:tcW w:w="1551" w:type="dxa"/>
-                  </w:tcPr>
-                  <w:p>
-                    <w:pPr>
-                      <w:spacing w:line="240" w:lineRule="auto"/>
-                    </w:pPr>
-                    <w:proofErr w:type="spellStart"/>
-                    <w:r>
-                      <w:t>class_weight</w:t>
-                    </w:r>
-                    <w:proofErr w:type="spellEnd"/>
-                  </w:p>
-                </w:tc>
-                <w:tc>
-                  <w:tcPr>
-                    <w:tcW w:w="2773" w:type="dxa"/>
-                  </w:tcPr>
-                  <w:p>
-                    <w:pPr>
-                      <w:spacing w:line="240" w:lineRule="auto"/>
-                      <w:rPr>
-                        <w:lang w:val="en-US"/>
-                      </w:rPr>
-                    </w:pPr>
-                    <w:r>
-                      <w:rPr>
-                        <w:lang w:val="en-US"/>
-                      </w:rPr>
-                      <w:t>Laying: 1.0;</w:t>
-                    </w:r>
-                  </w:p>
-                  <w:p>
-                    <w:pPr>
-                      <w:spacing w:line="240" w:lineRule="auto"/>
-                      <w:rPr>
-                        <w:lang w:val="en-US"/>
-                      </w:rPr>
-                    </w:pPr>
-                    <w:r>
-                      <w:rPr>
-                        <w:lang w:val="en-US"/>
-                      </w:rPr>
-                      <w:t>Sitting: 2.0;</w:t>
-                    </w:r>
-                  </w:p>
-                  <w:p>
-                    <w:pPr>
-                      <w:spacing w:line="240" w:lineRule="auto"/>
-                      <w:rPr>
-                        <w:lang w:val="en-US"/>
-                      </w:rPr>
-                    </w:pPr>
-                    <w:r>
-                      <w:rPr>
-                        <w:lang w:val="en-US"/>
-                      </w:rPr>
-                      <w:t>Standing: 1.5;</w:t>
-                    </w:r>
-                  </w:p>
-                  <w:p>
-                    <w:pPr>
-                      <w:spacing w:line="240" w:lineRule="auto"/>
-                      <w:rPr>
-                        <w:lang w:val="en-US"/>
-                      </w:rPr>
-                    </w:pPr>
-                    <w:r>
-                      <w:rPr>
-                        <w:lang w:val="en-US"/>
-                      </w:rPr>
-                      <w:t>Walking: 1.2;</w:t>
-                    </w:r>
-                  </w:p>
-                  <w:p>
-                    <w:pPr>
-                      <w:spacing w:line="240" w:lineRule="auto"/>
-                      <w:rPr>
-                        <w:lang w:val="en-US"/>
-                      </w:rPr>
-                    </w:pPr>
-                    <w:proofErr w:type="spellStart"/>
-                    <w:r>
-                      <w:rPr>
-                        <w:lang w:val="en-US"/>
-                      </w:rPr>
-                      <w:t>W</w:t>
-                    </w:r>
-                    <w:r>
-                      <w:rPr>
-                        <w:lang w:val="en-US"/>
-                      </w:rPr>
-                      <w:t>alking_Downstairs</w:t>
-                    </w:r>
-                    <w:proofErr w:type="spellEnd"/>
-                    <w:r>
-                      <w:rPr>
-                        <w:lang w:val="en-US"/>
-                      </w:rPr>
-                      <w:t>: 3.0;</w:t>
-                    </w:r>
-                  </w:p>
-                  <w:p>
-                    <w:pPr>
-                      <w:spacing w:line="240" w:lineRule="auto"/>
-                      <w:rPr>
-                        <w:lang w:val="en-US"/>
-                      </w:rPr>
-                    </w:pPr>
-                    <w:proofErr w:type="spellStart"/>
-                    <w:r>
-                      <w:rPr>
-                        <w:lang w:val="en-US"/>
-                      </w:rPr>
-                      <w:t>Walking_Upstairs</w:t>
-                    </w:r>
-                    <w:proofErr w:type="spellEnd"/>
-                    <w:r>
-                      <w:rPr>
-                        <w:lang w:val="en-US"/>
-                      </w:rPr>
-                      <w:t>: 2.0</w:t>
-                    </w:r>
-                  </w:p>
-                </w:tc>
-              </w:tr>
-              <w:tr>
-                <w:trPr>
-                  <w:trHeight w:val="429"/>
-                </w:trPr>
-                <w:tc>
-                  <w:tcPr>
-                    <w:tcW w:w="1551" w:type="dxa"/>
-                  </w:tcPr>
-                  <w:p>
-                    <w:pPr>
-                      <w:spacing w:line="240" w:lineRule="auto"/>
-                    </w:pPr>
-                    <w:proofErr w:type="spellStart"/>
-                    <w:r>
-                      <w:t>probability</w:t>
-                    </w:r>
-                    <w:proofErr w:type="spellEnd"/>
-                  </w:p>
-                </w:tc>
-                <w:tc>
-                  <w:tcPr>
-                    <w:tcW w:w="2773" w:type="dxa"/>
-                  </w:tcPr>
-                  <w:p>
-                    <w:pPr>
-                      <w:spacing w:line="240" w:lineRule="auto"/>
-                    </w:pPr>
-                    <w:r>
-                      <w:t>True</w:t>
-                    </w:r>
-                  </w:p>
-                </w:tc>
-              </w:tr>
-              <w:tr>
-                <w:trPr>
-                  <w:trHeight w:val="429"/>
-                </w:trPr>
-                <w:tc>
-                  <w:tcPr>
-                    <w:tcW w:w="1551" w:type="dxa"/>
-                  </w:tcPr>
-                  <w:p>
-                    <w:pPr>
-                      <w:spacing w:line="240" w:lineRule="auto"/>
-                    </w:pPr>
-                    <w:proofErr w:type="spellStart"/>
-                    <w:r>
-                      <w:t>random_state</w:t>
-                    </w:r>
-                    <w:proofErr w:type="spellEnd"/>
-                  </w:p>
-                </w:tc>
-                <w:tc>
-                  <w:tcPr>
-                    <w:tcW w:w="2773" w:type="dxa"/>
-                  </w:tcPr>
-                  <w:p>
-                    <w:pPr>
-                      <w:spacing w:line="240" w:lineRule="auto"/>
-                    </w:pPr>
-                    <w:r>
-                      <w:t>RANDOM_STATE</w:t>
-                    </w:r>
-                  </w:p>
-                </w:tc>
-              </w:tr>
-            </w:tbl>
-            <w:p/>
           </w:sdtContent>
         </w:sdt>
       </w:sdtContent>
     </w:sdt>
     <w:sectPr>
-      <w:footerReference w:type="default" r:id="rId14"/>
-      <w:footerReference w:type="first" r:id="rId15"/>
+      <w:footerReference w:type="default" r:id="rId9"/>
+      <w:footerReference w:type="first" r:id="rId10"/>
       <w:pgSz w:w="12240" w:h="15840"/>
       <w:pgMar w:top="1440" w:right="1440" w:bottom="1440" w:left="1440" w:header="720" w:footer="720" w:gutter="0"/>
       <w:cols w:space="720"/>

</xml_diff>

<commit_message>
Parameter als Text und einiges gekürzt
</commit_message>
<xml_diff>
--- a/Journal template free format.docx
+++ b/Journal template free format.docx
@@ -32,7 +32,7 @@
     </w:p>
     <w:p>
       <w:r>
-        <w:t>Die Motivation dieser Analyse besteht darin zu untersuchen, wie gut maschinelle Lernverfahren komplexe Sensordaten verarbeiten und daraus menschliche Aktivitäten ableiten können. Solche Verfahren sind insbesondere im Bereich Human Activity Recognition relevant, beispielsweise für Fitness-Tracking, Gesundheitsmonitoring, Rehabilitation oder kontextabhängige Smartphone-Anwendungen. Besonders interessant ist dabei nicht nur, ob ein Modell bekannte Messungen gut klassifizieren kann, sondern auch, ob es auf bisher unbekannte Personen generalisiert.</w:t>
+        <w:t>Die Motivation dieser Analyse besteht darin zu untersuchen, wie gut maschinelle Lernverfahren komplexe Sensordaten verarbeiten und daraus menschliche Aktivitäten ableiten können. Besonders interessant ist dabei nicht nur, ob ein Modell bekannte Messungen gut klassifizieren kann, sondern auch, ob es auf bisher unbekannte Personen generalisiert.</w:t>
       </w:r>
     </w:p>
     <w:p>
@@ -58,7 +58,31 @@
     </w:p>
     <w:p>
       <w:r>
-        <w:t>Die zur Verfügung gestellten Daten basieren auf A Public Domain Dataset for Human Activity Recognition Using Smartphones</w:t>
+        <w:t xml:space="preserve">Die zur Verfügung gestellten Daten basieren auf A Public Domain Dataset </w:t>
+      </w:r>
+      <w:proofErr w:type="spellStart"/>
+      <w:r>
+        <w:t>for</w:t>
+      </w:r>
+      <w:proofErr w:type="spellEnd"/>
+      <w:r>
+        <w:t xml:space="preserve"> Human </w:t>
+      </w:r>
+      <w:proofErr w:type="spellStart"/>
+      <w:r>
+        <w:t>Activity</w:t>
+      </w:r>
+      <w:proofErr w:type="spellEnd"/>
+      <w:r>
+        <w:t xml:space="preserve"> Recognition </w:t>
+      </w:r>
+      <w:proofErr w:type="spellStart"/>
+      <w:r>
+        <w:t>Using</w:t>
+      </w:r>
+      <w:proofErr w:type="spellEnd"/>
+      <w:r>
+        <w:t xml:space="preserve"> Smartphones</w:t>
       </w:r>
       <w:sdt>
         <w:sdtPr>
@@ -101,7 +125,15 @@
         <w:spacing w:after="0" w:line="312" w:lineRule="auto"/>
       </w:pPr>
       <w:r>
-        <w:t>Der Datensatz besteht aus zwei CSV-Dateien. Die Datei measures.csv enthält die gelabelten Daten und wurde für Training, Modellvergleich und Testbewertung verwendet. Die Datei to_predict.csv enthält ungelabelte Daten, für die am Ende der Analyse finale Vorhersagen erzeugt werden sollen.</w:t>
+        <w:t xml:space="preserve">Der Datensatz besteht aus zwei CSV-Dateien. Die Datei measures.csv enthält die gelabelten Daten und wurde für Training, Modellvergleich und Testbewertung verwendet. Die Datei to_predict.csv enthält </w:t>
+      </w:r>
+      <w:proofErr w:type="spellStart"/>
+      <w:r>
+        <w:t>ungelabelte</w:t>
+      </w:r>
+      <w:proofErr w:type="spellEnd"/>
+      <w:r>
+        <w:t xml:space="preserve"> Daten, für die am Ende der Analyse finale Vorhersagen erzeugt werden sollen.</w:t>
       </w:r>
     </w:p>
     <w:p>
@@ -109,7 +141,23 @@
         <w:spacing w:after="0" w:line="312" w:lineRule="auto"/>
       </w:pPr>
       <w:r>
-        <w:t>Die Datei measures.csv umfasst 7352 Beobachtungen mit insgesamt 563 Spalten. Davon sind 561 Spalten Sensorfeatures. Die beiden übrigen Spalten sind subject, also die Personen-ID, und activity, also das Aktivitätslabel. In measures.csv sind 21 der insgesamt 30 Versuchspersonen enthalten.</w:t>
+        <w:t xml:space="preserve">Die Datei measures.csv umfasst 7352 Beobachtungen mit insgesamt 563 Spalten. Davon sind 561 Spalten Sensorfeatures. Die beiden übrigen Spalten sind </w:t>
+      </w:r>
+      <w:proofErr w:type="spellStart"/>
+      <w:r>
+        <w:t>subject</w:t>
+      </w:r>
+      <w:proofErr w:type="spellEnd"/>
+      <w:r>
+        <w:t xml:space="preserve">, also die Personen-ID, und </w:t>
+      </w:r>
+      <w:proofErr w:type="spellStart"/>
+      <w:r>
+        <w:t>activity</w:t>
+      </w:r>
+      <w:proofErr w:type="spellEnd"/>
+      <w:r>
+        <w:t>, also das Aktivitätslabel. In measures.csv sind 21 der insgesamt 30 Versuchspersonen enthalten.</w:t>
       </w:r>
     </w:p>
     <w:p>
@@ -119,14 +167,54 @@
       <w:r>
         <w:t xml:space="preserve">: </w:t>
       </w:r>
-      <w:r>
-        <w:t>Laying, Standing, Sitting, Walking, Walking_Upstairs und Walking_Downstairs.</w:t>
-      </w:r>
-    </w:p>
-    <w:p>
+      <w:proofErr w:type="spellStart"/>
+      <w:r>
+        <w:t>Laying</w:t>
+      </w:r>
+      <w:proofErr w:type="spellEnd"/>
+      <w:r>
+        <w:t xml:space="preserve">, Standing, Sitting, Walking, </w:t>
+      </w:r>
+      <w:proofErr w:type="spellStart"/>
+      <w:r>
+        <w:t>Walking_Upstairs</w:t>
+      </w:r>
+      <w:proofErr w:type="spellEnd"/>
+      <w:r>
+        <w:t xml:space="preserve"> und </w:t>
+      </w:r>
+      <w:proofErr w:type="spellStart"/>
+      <w:r>
+        <w:t>Walking_Downstairs</w:t>
+      </w:r>
+      <w:proofErr w:type="spellEnd"/>
+      <w:r>
+        <w:t>.</w:t>
+      </w:r>
+    </w:p>
+    <w:p>
+      <w:r>
+        <w:t xml:space="preserve">Eine Zeile im Datensatz beschreibt jeweils ein Messfenster einer bestimmten Person während einer bestimmten Aktivität. Die Feature-Spalten enthalten vorverarbeitete und normalisierte Sensormerkmale, die aus den Smartphone-Signalen berechnet wurden. Die Datei to_predict.csv </w:t>
+      </w:r>
       <w:r>
         <w:lastRenderedPageBreak/>
-        <w:t>Eine Zeile im Datensatz beschreibt jeweils ein Messfenster einer bestimmten Person während einer bestimmten Aktivität. Die Feature-Spalten enthalten vorverarbeitete und normalisierte Sensormerkmale, die aus den Smartphone-Signalen berechnet wurden. Die Datei to_predict.csv umfasst die übrigen 2947 Beobachtungen. Sie enthält dieselben Sensorfeatures und die Spalte subject, jedoch keine Zielvariable activity.</w:t>
+        <w:t xml:space="preserve">umfasst die übrigen 2947 Beobachtungen. Sie enthält dieselben Sensorfeatures und die Spalte </w:t>
+      </w:r>
+      <w:proofErr w:type="spellStart"/>
+      <w:r>
+        <w:t>subject</w:t>
+      </w:r>
+      <w:proofErr w:type="spellEnd"/>
+      <w:r>
+        <w:t xml:space="preserve">, jedoch keine Zielvariable </w:t>
+      </w:r>
+      <w:proofErr w:type="spellStart"/>
+      <w:r>
+        <w:t>activity</w:t>
+      </w:r>
+      <w:proofErr w:type="spellEnd"/>
+      <w:r>
+        <w:t>.</w:t>
       </w:r>
     </w:p>
     <w:p>
@@ -144,7 +232,13 @@
     </w:p>
     <w:p>
       <w:r>
-        <w:t>Die zur Verfügung gestellten Daten waren bereits vorverarbeitet und lagen daher in einem gut nutzbaren Zustand vor. Vor der Modellierung wurden die Datensätze dennoch auf technische Auffälligkeiten überprüft. Dabei wurden insbesondere fehlende Werte, doppelte Zeilen, Datensatzdimensionen, Feature-Spalten und Klassenverteilungen betrachtet.</w:t>
+        <w:t>Vor der Modellierung wurden die Datensätze</w:t>
+      </w:r>
+      <w:r>
+        <w:t xml:space="preserve"> </w:t>
+      </w:r>
+      <w:r>
+        <w:t>auf technische Auffälligkeiten überprüft. Dabei wurden insbesondere fehlende Werte, doppelte Zeilen, Datensatzdimensionen, Feature-Spalten und Klassenverteilungen betrachtet.</w:t>
       </w:r>
     </w:p>
     <w:p>
@@ -157,12 +251,31 @@
     </w:p>
     <w:p>
       <w:r>
-        <w:t>Die Klassen sind im gelabelten Datensatz nicht exakt gleich verteilt, aber auch nicht stark unausgeglichen. Die häufigste Klasse ist LAYING mit 1407 Beobachtungen. Die seltenste Klasse ist WALKING_DOWNSTAIRS mit 986 Beobachtungen. Insgesamt ist die Klassenverteilung ausreichend ausgewogen, sodass keine starke Verzerrung durch eine einzelne dominante Klasse zu erwarten ist.</w:t>
-      </w:r>
-    </w:p>
-    <w:p>
-      <w:r>
-        <w:t>Für Modelle, die empfindlich auf unterschiedliche Skalierungen reagieren, beispielsweise SVM, k-Nearest Neighbors oder Logistic Regression, wurde eine Standardisierung innerhalb einer Pipeline verwendet. Dadurch wurde sichergestellt, dass die Skalierung ausschließlich auf den Trainingsdaten gelernt und anschließend auf Validierungs- oder Testdaten angewendet wurde.</w:t>
+        <w:t>Die häufigste Klasse ist LAYING mit 1407 Beobachtungen. Die seltenste Klasse ist WALKING_DOWNSTAIRS mit 986 Beobachtungen. Insgesamt ist die Klassenverteilung ausreichend ausgewogen</w:t>
+      </w:r>
+      <w:r>
+        <w:t>.</w:t>
+      </w:r>
+    </w:p>
+    <w:p>
+      <w:r>
+        <w:t>Für Modelle, die empfindlich auf unterschiedliche Skalierungen reagieren, beispielsweise SVM, k-</w:t>
+      </w:r>
+      <w:proofErr w:type="spellStart"/>
+      <w:r>
+        <w:t>Nearest</w:t>
+      </w:r>
+      <w:proofErr w:type="spellEnd"/>
+      <w:r>
+        <w:t xml:space="preserve"> Neighbors oder </w:t>
+      </w:r>
+      <w:proofErr w:type="spellStart"/>
+      <w:r>
+        <w:t>Logistic</w:t>
+      </w:r>
+      <w:proofErr w:type="spellEnd"/>
+      <w:r>
+        <w:t xml:space="preserve"> Regression, wurde eine Standardisierung innerhalb einer Pipeline verwendet. Dadurch wurde sichergestellt, dass die Skalierung ausschließlich auf den Trainingsdaten gelernt und anschließend auf Validierungs- oder Testdaten angewendet wurde.</w:t>
       </w:r>
     </w:p>
     <w:p>
@@ -180,12 +293,44 @@
     </w:p>
     <w:p>
       <w:r>
-        <w:t>Für die Modellbewertung wurde measures.csv in einen Trainings- und einen Testdatensatz aufgeteilt. Die Aufteilung erfolgte nicht zufällig auf Ebene einzelner Beobachtungen, sondern gruppiert nach Versuchspersonen (subject). Dieses Vorgehen ist notwendig, da mehrere Messfenster von derselben Person stammen.</w:t>
-      </w:r>
-    </w:p>
-    <w:p>
-      <w:r>
-        <w:t>Die Subjects 27, 28, 29 und 30 wurden dem Testdatensatz zugeordnet. Alle übrigen 17 Subjects aus measures.csv wurden für den Trainingsdatensatz verwendet. Zusätzlich wurde überprüft, ob die Subjects 1, 3, 5 und 6 im Trainingsdatensatz enthalten sind. Der resultierende Trainingsdatensatz umfasst 5867 Beobachtungen, der Testdatensatz 1485. Zwischen de</w:t>
+        <w:t>Für die Modellbewertung wurde measures.csv in einen Trainings- und einen Testdatensatz aufgeteilt. Die Aufteilung erfolgte nicht zufällig auf Ebene einzelner Beobachtungen, sondern gruppiert nach Versuchspersonen (</w:t>
+      </w:r>
+      <w:proofErr w:type="spellStart"/>
+      <w:r>
+        <w:t>subject</w:t>
+      </w:r>
+      <w:proofErr w:type="spellEnd"/>
+      <w:r>
+        <w:t>). Dieses Vorgehen ist notwendig, da mehrere Messfenster von derselben Person stammen.</w:t>
+      </w:r>
+    </w:p>
+    <w:p>
+      <w:r>
+        <w:t xml:space="preserve">Die </w:t>
+      </w:r>
+      <w:proofErr w:type="spellStart"/>
+      <w:r>
+        <w:t>Subjects</w:t>
+      </w:r>
+      <w:proofErr w:type="spellEnd"/>
+      <w:r>
+        <w:t xml:space="preserve"> 27, 28, 29 und 30 wurden dem Testdatensatz zugeordnet. Alle übrigen 17 </w:t>
+      </w:r>
+      <w:proofErr w:type="spellStart"/>
+      <w:r>
+        <w:t>Subjects</w:t>
+      </w:r>
+      <w:proofErr w:type="spellEnd"/>
+      <w:r>
+        <w:t xml:space="preserve"> aus measures.csv wurden für den Trainingsdatensatz verwendet. Zusätzlich wurde überprüft, ob die </w:t>
+      </w:r>
+      <w:proofErr w:type="spellStart"/>
+      <w:r>
+        <w:t>Subjects</w:t>
+      </w:r>
+      <w:proofErr w:type="spellEnd"/>
+      <w:r>
+        <w:t xml:space="preserve"> 1, 3, 5 und 6 im Trainingsdatensatz enthalten sind. Der resultierende Trainingsdatensatz umfasst 5867 Beobachtungen, der Testdatensatz 1485. Zwischen de</w:t>
       </w:r>
       <w:r>
         <w:t xml:space="preserve">m </w:t>
@@ -264,7 +409,23 @@
         </w:drawing>
       </w:r>
       <w:r>
-        <w:t>Die Modellwahl erfolgte ausschließlich auf dem Trainingsdatensatz mithilfe einer 5-fold Group Cross-Validation. Dabei wurden die Folds ebenfalls nach subject gebildet, sodass alle Beobachtungen einer Person vollständig entweder im Trainings- oder im Validierungsanteil eines Folds lagen. Als zentrale Bewertungsmetrik wurde die mittlere Accuracy über die fünf Folds verwendet.</w:t>
+        <w:t xml:space="preserve">Die Modellwahl erfolgte ausschließlich auf dem Trainingsdatensatz mithilfe einer 5-fold Group Cross-Validation. Dabei wurden die Folds ebenfalls nach </w:t>
+      </w:r>
+      <w:proofErr w:type="spellStart"/>
+      <w:r>
+        <w:t>subject</w:t>
+      </w:r>
+      <w:proofErr w:type="spellEnd"/>
+      <w:r>
+        <w:t xml:space="preserve"> gebildet, sodass alle Beobachtungen einer Person vollständig entweder im Trainings- oder im Validierungsanteil eines Folds lagen. Als zentrale Bewertungsmetrik wurde die mittlere </w:t>
+      </w:r>
+      <w:proofErr w:type="spellStart"/>
+      <w:r>
+        <w:t>Accuracy</w:t>
+      </w:r>
+      <w:proofErr w:type="spellEnd"/>
+      <w:r>
+        <w:t xml:space="preserve"> über die fünf Folds verwendet.</w:t>
       </w:r>
     </w:p>
     <w:p>
@@ -434,7 +595,31 @@
     </w:p>
     <w:p>
       <w:r>
-        <w:t>Zur Modellwahl wurden mehrere Klassifikationsmodelle auf dem Trainingsdatensatz verglichen. Die Auswahl geeigneter Modelle erfolgte primär anhand der mittleren Cross-Validation-Accuracy. Anschließend wurden ausgewählte Modellvarianten auf dem subject-basierten Holdout-Testset bewertet.</w:t>
+        <w:t>Zur Modellwahl wurden mehrere Klassifikationsmodelle auf dem Trainingsdatensatz verglichen. Die Auswahl geeigneter Modelle erfolgte primär anhand der mittleren Cross-Validation-</w:t>
+      </w:r>
+      <w:proofErr w:type="spellStart"/>
+      <w:r>
+        <w:t>Accuracy</w:t>
+      </w:r>
+      <w:proofErr w:type="spellEnd"/>
+      <w:r>
+        <w:t xml:space="preserve">. Anschließend wurden ausgewählte Modellvarianten auf dem </w:t>
+      </w:r>
+      <w:proofErr w:type="spellStart"/>
+      <w:r>
+        <w:t>subject</w:t>
+      </w:r>
+      <w:proofErr w:type="spellEnd"/>
+      <w:r>
+        <w:t>-basierten Holdout-</w:t>
+      </w:r>
+      <w:proofErr w:type="spellStart"/>
+      <w:r>
+        <w:t>Testset</w:t>
+      </w:r>
+      <w:proofErr w:type="spellEnd"/>
+      <w:r>
+        <w:t xml:space="preserve"> bewertet.</w:t>
       </w:r>
     </w:p>
     <w:p>
@@ -452,7 +637,39 @@
     </w:p>
     <w:p>
       <w:r>
-        <w:t>Für den Modellvergleich wurden verschiedene Klassifikationsverfahren getestet, darunter Logistic Regression, k-Nearest Neighbors, Random Forest, XGBClassifier und RBF-SVM. Die Bewertung erfolgte mit 5-fold Group Cross-Validation auf dem Trainingsdatensatz. Dabei wurde nach subject gruppiert, sodass Beobachtungen derselben Person nicht gleichzeitig in Trainings- und Validierungsdaten eines Folds vorkamen.</w:t>
+        <w:t xml:space="preserve">Für den Modellvergleich wurden verschiedene Klassifikationsverfahren getestet, darunter </w:t>
+      </w:r>
+      <w:proofErr w:type="spellStart"/>
+      <w:r>
+        <w:t>Logistic</w:t>
+      </w:r>
+      <w:proofErr w:type="spellEnd"/>
+      <w:r>
+        <w:t xml:space="preserve"> Regression, k-</w:t>
+      </w:r>
+      <w:proofErr w:type="spellStart"/>
+      <w:r>
+        <w:t>Nearest</w:t>
+      </w:r>
+      <w:proofErr w:type="spellEnd"/>
+      <w:r>
+        <w:t xml:space="preserve"> Neighbors, Random Forest, </w:t>
+      </w:r>
+      <w:proofErr w:type="spellStart"/>
+      <w:r>
+        <w:t>XGBClassifier</w:t>
+      </w:r>
+      <w:proofErr w:type="spellEnd"/>
+      <w:r>
+        <w:t xml:space="preserve"> und RBF-SVM. Die Bewertung erfolgte mit 5-fold Group Cross-Validation auf dem Trainingsdatensatz. Dabei wurde nach </w:t>
+      </w:r>
+      <w:proofErr w:type="spellStart"/>
+      <w:r>
+        <w:t>subject</w:t>
+      </w:r>
+      <w:proofErr w:type="spellEnd"/>
+      <w:r>
+        <w:t xml:space="preserve"> gruppiert, sodass Beobachtungen derselben Person nicht gleichzeitig in Trainings- und Validierungsdaten eines Folds vorkamen.</w:t>
       </w:r>
     </w:p>
     <w:tbl>
@@ -508,8 +725,16 @@
               <w:rPr>
                 <w:b/>
               </w:rPr>
-              <w:t>CV Accuracy</w:t>
+              <w:t xml:space="preserve">CV </w:t>
             </w:r>
+            <w:proofErr w:type="spellStart"/>
+            <w:r>
+              <w:rPr>
+                <w:b/>
+              </w:rPr>
+              <w:t>Accuracy</w:t>
+            </w:r>
+            <w:proofErr w:type="spellEnd"/>
           </w:p>
         </w:tc>
         <w:tc>
@@ -624,8 +849,13 @@
             <w:pPr>
               <w:spacing w:after="0" w:line="240" w:lineRule="auto"/>
             </w:pPr>
+            <w:proofErr w:type="spellStart"/>
             <w:r>
-              <w:t>Logistic Regression</w:t>
+              <w:t>Logistic</w:t>
+            </w:r>
+            <w:proofErr w:type="spellEnd"/>
+            <w:r>
+              <w:t xml:space="preserve"> Regression</w:t>
             </w:r>
           </w:p>
         </w:tc>
@@ -681,9 +911,11 @@
             <w:pPr>
               <w:spacing w:after="0" w:line="240" w:lineRule="auto"/>
             </w:pPr>
+            <w:proofErr w:type="spellStart"/>
             <w:r>
               <w:t>XGBClassifier</w:t>
             </w:r>
+            <w:proofErr w:type="spellEnd"/>
           </w:p>
         </w:tc>
         <w:tc>
@@ -796,7 +1028,15 @@
               <w:spacing w:after="0" w:line="240" w:lineRule="auto"/>
             </w:pPr>
             <w:r>
-              <w:t>k-Nearest Neighbors</w:t>
+              <w:t>k-</w:t>
+            </w:r>
+            <w:proofErr w:type="spellStart"/>
+            <w:r>
+              <w:t>Nearest</w:t>
+            </w:r>
+            <w:proofErr w:type="spellEnd"/>
+            <w:r>
+              <w:t xml:space="preserve"> Neighbors</w:t>
             </w:r>
           </w:p>
         </w:tc>
@@ -873,7 +1113,39 @@
     </w:p>
     <w:p>
       <w:r>
-        <w:t>Die RBF-SVM erzielte mit einer mittleren Cross-Validation-Accuracy von 0.9248 das beste Ergebnis im Modellvergleich. Logistic Regression und XGBClassifier lagen mit 0.9160 bzw. 0.9112 ebenfalls auf hohem Niveau. Der XGBClassifier hatte eine deutlich höhere mittlere Fit-Zeit als die übrigen Modelle, wurde jedoch aufgrund seiner guten Testleistung und Kombinierbarkeit mit anderen Modellen weiter untersucht.</w:t>
+        <w:t>Die RBF-SVM erzielte mit einer mittleren Cross-Validation-</w:t>
+      </w:r>
+      <w:proofErr w:type="spellStart"/>
+      <w:r>
+        <w:t>Accuracy</w:t>
+      </w:r>
+      <w:proofErr w:type="spellEnd"/>
+      <w:r>
+        <w:t xml:space="preserve"> von 0.9248 das beste Ergebnis im Modellvergleich. </w:t>
+      </w:r>
+      <w:proofErr w:type="spellStart"/>
+      <w:r>
+        <w:t>Logistic</w:t>
+      </w:r>
+      <w:proofErr w:type="spellEnd"/>
+      <w:r>
+        <w:t xml:space="preserve"> Regression und </w:t>
+      </w:r>
+      <w:proofErr w:type="spellStart"/>
+      <w:r>
+        <w:t>XGBClassifier</w:t>
+      </w:r>
+      <w:proofErr w:type="spellEnd"/>
+      <w:r>
+        <w:t xml:space="preserve"> lagen mit 0.9160 bzw. 0.9112 ebenfalls auf hohem Niveau. Der </w:t>
+      </w:r>
+      <w:proofErr w:type="spellStart"/>
+      <w:r>
+        <w:t>XGBClassifier</w:t>
+      </w:r>
+      <w:proofErr w:type="spellEnd"/>
+      <w:r>
+        <w:t xml:space="preserve"> hatte eine deutlich höhere mittlere Fit-Zeit als die übrigen Modelle, wurde jedoch aufgrund seiner guten Testleistung und Kombinierbarkeit mit anderen Modellen weiter untersucht.</w:t>
       </w:r>
     </w:p>
     <w:p>
@@ -891,12 +1163,68 @@
     </w:p>
     <w:p>
       <w:r>
-        <w:t>Hyperparameter wurden vor allem bei den Modellen weiter untersucht, die im ersten Modellvergleich eine gute Leistung zeigten oder für die Fehlerstruktur besonders relevant waren. Die Auswahl der Hyperparameter erfolgte dabei auf Basis der Cross-Validation-Ergebnisse auf dem Trainingsdatensatz. Die Test Accuracy des Holdout-Testsets wurde nicht zur Auswahl der Hyperparameter verwendet, sondern erst anschließend zur finalen Bewertung der ausgewählten Modellvarianten berechnet.</w:t>
-      </w:r>
-    </w:p>
-    <w:p>
-      <w:r>
-        <w:t>Besonders deutlich lohnte sich die Optimierung beim XGBClassifier. Durch die Anpassung von Baumanzahl, Baumtiefe, Lernrate, Subsampling und Regularisierung verbesserte sich die Modellleistung im Vergleich zur vorherigen Einstellung. Auch bei der RBF-SVM führte die Anpassung der Parameter C und gamma zu einer leichten Verbesserung. Random Forest und k-Nearest Neighbors wurden ebenfalls mit verschiedenen Parametereinstellungen getestet, erreichten jedoch keine bessere Cross-Validation-Leistung als XGBClassifier oder RBF-SVM.</w:t>
+        <w:t xml:space="preserve">Hyperparameter wurden vor allem bei den Modellen weiter untersucht, die im ersten Modellvergleich eine gute Leistung zeigten oder für die Fehlerstruktur besonders relevant waren. Die Auswahl der Hyperparameter erfolgte dabei auf Basis der Cross-Validation-Ergebnisse auf dem Trainingsdatensatz. Die Test </w:t>
+      </w:r>
+      <w:proofErr w:type="spellStart"/>
+      <w:r>
+        <w:t>Accuracy</w:t>
+      </w:r>
+      <w:proofErr w:type="spellEnd"/>
+      <w:r>
+        <w:t xml:space="preserve"> des Holdout-</w:t>
+      </w:r>
+      <w:proofErr w:type="spellStart"/>
+      <w:r>
+        <w:t>Testsets</w:t>
+      </w:r>
+      <w:proofErr w:type="spellEnd"/>
+      <w:r>
+        <w:t xml:space="preserve"> wurde nicht zur Auswahl der Hyperparameter verwendet, sondern erst anschließend zur finalen Bewertung der ausgewählten Modellvarianten berechnet.</w:t>
+      </w:r>
+    </w:p>
+    <w:p>
+      <w:r>
+        <w:t xml:space="preserve">Besonders deutlich lohnte sich die Optimierung beim </w:t>
+      </w:r>
+      <w:proofErr w:type="spellStart"/>
+      <w:r>
+        <w:t>XGBClassifier</w:t>
+      </w:r>
+      <w:proofErr w:type="spellEnd"/>
+      <w:r>
+        <w:t xml:space="preserve">. Durch die Anpassung von Baumanzahl, Baumtiefe, </w:t>
+      </w:r>
+      <w:proofErr w:type="spellStart"/>
+      <w:r>
+        <w:t>Lernrate</w:t>
+      </w:r>
+      <w:proofErr w:type="spellEnd"/>
+      <w:r>
+        <w:t xml:space="preserve">, Subsampling und Regularisierung verbesserte sich die Modellleistung im Vergleich zur vorherigen Einstellung. Auch bei der RBF-SVM führte die Anpassung der Parameter C und </w:t>
+      </w:r>
+      <w:proofErr w:type="spellStart"/>
+      <w:r>
+        <w:t>gamma</w:t>
+      </w:r>
+      <w:proofErr w:type="spellEnd"/>
+      <w:r>
+        <w:t xml:space="preserve"> zu einer leichten Verbesserung. Random Forest und k-</w:t>
+      </w:r>
+      <w:proofErr w:type="spellStart"/>
+      <w:r>
+        <w:t>Nearest</w:t>
+      </w:r>
+      <w:proofErr w:type="spellEnd"/>
+      <w:r>
+        <w:t xml:space="preserve"> Neighbors wurden ebenfalls mit verschiedenen Parametereinstellungen getestet, erreichten jedoch keine bessere Cross-Validation-Leistung als </w:t>
+      </w:r>
+      <w:proofErr w:type="spellStart"/>
+      <w:r>
+        <w:t>XGBClassifier</w:t>
+      </w:r>
+      <w:proofErr w:type="spellEnd"/>
+      <w:r>
+        <w:t xml:space="preserve"> oder RBF-SVM.</w:t>
       </w:r>
     </w:p>
     <w:p>
@@ -918,7 +1246,31 @@
         <w:jc w:val="left"/>
       </w:pPr>
       <w:r>
-        <w:t xml:space="preserve">Nach der Modellwahl wurden ausgewählte Modelle auf dem subject-basierten Holdout-Testset bewertet. Dafür wurden Test Accuracy, </w:t>
+        <w:t xml:space="preserve">Nach der Modellwahl wurden ausgewählte Modelle auf dem </w:t>
+      </w:r>
+      <w:proofErr w:type="spellStart"/>
+      <w:r>
+        <w:t>subject</w:t>
+      </w:r>
+      <w:proofErr w:type="spellEnd"/>
+      <w:r>
+        <w:t>-basierten Holdout-</w:t>
+      </w:r>
+      <w:proofErr w:type="spellStart"/>
+      <w:r>
+        <w:t>Testset</w:t>
+      </w:r>
+      <w:proofErr w:type="spellEnd"/>
+      <w:r>
+        <w:t xml:space="preserve"> bewertet. Dafür wurden Test </w:t>
+      </w:r>
+      <w:proofErr w:type="spellStart"/>
+      <w:r>
+        <w:t>Accuracy</w:t>
+      </w:r>
+      <w:proofErr w:type="spellEnd"/>
+      <w:r>
+        <w:t xml:space="preserve">, </w:t>
       </w:r>
       <w:proofErr w:type="gramStart"/>
       <w:r>
@@ -926,7 +1278,31 @@
       </w:r>
       <w:proofErr w:type="gramEnd"/>
       <w:r>
-        <w:t xml:space="preserve"> und die Confusion Matrix berechnet. Die Test Accuracy wurde nicht als primäre Metrik der Modellwahl verwendet, sondern diente zur finalen Bewertung der Generalisierung auf unbekannte Subjects.</w:t>
+        <w:t xml:space="preserve"> und die </w:t>
+      </w:r>
+      <w:proofErr w:type="spellStart"/>
+      <w:r>
+        <w:t>Confusion</w:t>
+      </w:r>
+      <w:proofErr w:type="spellEnd"/>
+      <w:r>
+        <w:t xml:space="preserve"> Matrix berechnet. Die Test </w:t>
+      </w:r>
+      <w:proofErr w:type="spellStart"/>
+      <w:r>
+        <w:t>Accuracy</w:t>
+      </w:r>
+      <w:proofErr w:type="spellEnd"/>
+      <w:r>
+        <w:t xml:space="preserve"> wurde nicht als primäre Metrik der Modellwahl verwendet, sondern diente zur finalen Bewertung der Generalisierung auf unbekannte </w:t>
+      </w:r>
+      <w:proofErr w:type="spellStart"/>
+      <w:r>
+        <w:t>Subjects</w:t>
+      </w:r>
+      <w:proofErr w:type="spellEnd"/>
+      <w:r>
+        <w:t>.</w:t>
       </w:r>
     </w:p>
     <w:p>
@@ -935,7 +1311,7 @@
         <w:jc w:val="left"/>
       </w:pPr>
       <w:r>
-        <w:t>Die Fehleranalyse zeigte, dass die dynamischen Aktivitäten sowie LAYING sehr zuverlässig klassifiziert wurden. Die verbleibenden Fehler traten nahezu ausschließlich zwischen den Klassen SITTING und STANDING auf. Diese Verwechslung ist plausibel, da beide Aktivitäten statische Körperhaltungen darstellen und sich in den Smartphone-Sensordaten ähnlicher zeigen als dynamische Aktivitäten wie WALKING oder Treppensteigen.</w:t>
+        <w:t xml:space="preserve">Die Fehleranalyse zeigte, dass die dynamischen Aktivitäten sowie LAYING sehr zuverlässig klassifiziert wurden. Die verbleibenden Fehler traten nahezu ausschließlich zwischen den Klassen SITTING und STANDING auf. </w:t>
       </w:r>
     </w:p>
     <w:p>
@@ -944,8 +1320,11 @@
         <w:jc w:val="left"/>
       </w:pPr>
       <w:r>
+        <w:t xml:space="preserve">Zusätzlich zeigte sich eine auffällige Fehlerhäufung bei Subject 28. Dies deutet darauf hin, dass diese Testperson bei den statischen Aktivitäten ein abweichendes Sensormuster aufweisen </w:t>
+      </w:r>
+      <w:r>
         <w:lastRenderedPageBreak/>
-        <w:t>Zusätzlich zeigte sich eine auffällige Fehlerhäufung bei Subject 28. Dies deutet darauf hin, dass diese Testperson bei den statischen Aktivitäten ein abweichendes Sensormuster aufweisen könnte. Ein tatsächlicher Daten- oder Label-Fehler kann daraus jedoch nicht sicher abgeleitet werden.</w:t>
+        <w:t>könnte. Ein tatsächlicher Daten- oder Label-Fehler kann daraus jedoch nicht sicher abgeleitet werden.</w:t>
       </w:r>
     </w:p>
     <w:p>
@@ -969,12 +1348,52 @@
         <w:t xml:space="preserve">, </w:t>
       </w:r>
       <w:r>
-        <w:t>zusätzlich wurde mit SelectKBest eine Feature Selection durchgeführt, um nur die für diese binäre Trennung relevantesten Merkmale zu verwenden.</w:t>
-      </w:r>
-    </w:p>
-    <w:p>
-      <w:r>
-        <w:t>Verschiedene Spezialmodelle wurden getestet, darunter RBF-SVM, Logistic Regression, LinearSVC, Random Forest, XGBoost und Polynomial-SVM. Das beste Spezialmodell verwendete 150 ausgewählte Features und eine Polynomial-SVM. Zusätzlich wurde die Entscheidungsschwelle des Spezialmodells angepasst, um die verbleibenden Verwechslungen zwischen SITTING und STANDING weiter zu reduzieren.</w:t>
+        <w:t xml:space="preserve">zusätzlich wurde mit </w:t>
+      </w:r>
+      <w:proofErr w:type="spellStart"/>
+      <w:r>
+        <w:t>SelectKBest</w:t>
+      </w:r>
+      <w:proofErr w:type="spellEnd"/>
+      <w:r>
+        <w:t xml:space="preserve"> eine Feature </w:t>
+      </w:r>
+      <w:proofErr w:type="spellStart"/>
+      <w:r>
+        <w:t>Selection</w:t>
+      </w:r>
+      <w:proofErr w:type="spellEnd"/>
+      <w:r>
+        <w:t xml:space="preserve"> durchgeführt, um nur die für diese binäre Trennung relevantesten Merkmale zu verwenden.</w:t>
+      </w:r>
+    </w:p>
+    <w:p>
+      <w:r>
+        <w:t xml:space="preserve">Verschiedene Spezialmodelle wurden getestet, darunter RBF-SVM, </w:t>
+      </w:r>
+      <w:proofErr w:type="spellStart"/>
+      <w:r>
+        <w:t>Logistic</w:t>
+      </w:r>
+      <w:proofErr w:type="spellEnd"/>
+      <w:r>
+        <w:t xml:space="preserve"> Regression, </w:t>
+      </w:r>
+      <w:proofErr w:type="spellStart"/>
+      <w:r>
+        <w:t>LinearSVC</w:t>
+      </w:r>
+      <w:proofErr w:type="spellEnd"/>
+      <w:r>
+        <w:t xml:space="preserve">, Random Forest, </w:t>
+      </w:r>
+      <w:proofErr w:type="spellStart"/>
+      <w:r>
+        <w:t>XGBoost</w:t>
+      </w:r>
+      <w:proofErr w:type="spellEnd"/>
+      <w:r>
+        <w:t xml:space="preserve"> und Polynomial-SVM. Das beste Spezialmodell verwendete 150 ausgewählte Features und eine Polynomial-SVM. Zusätzlich wurde die Entscheidungsschwelle des Spezialmodells angepasst, um die verbleibenden Verwechslungen zwischen SITTING und STANDING weiter zu reduzieren.</w:t>
       </w:r>
     </w:p>
     <w:p>
@@ -1003,7 +1422,23 @@
         <w:t>ist</w:t>
       </w:r>
       <w:r>
-        <w:t xml:space="preserve"> ein zweistufiges Modell. In der ersten Stufe wurde ein Soft-Voting-Ensemble aus Polynomial-SVM und XGBClassifier verwendet. Der XGBClassifier wurde </w:t>
+        <w:t xml:space="preserve"> ein zweistufiges Modell. In der ersten Stufe wurde ein Soft-Voting-Ensemble aus Polynomial-SVM und </w:t>
+      </w:r>
+      <w:proofErr w:type="spellStart"/>
+      <w:r>
+        <w:t>XGBClassifier</w:t>
+      </w:r>
+      <w:proofErr w:type="spellEnd"/>
+      <w:r>
+        <w:t xml:space="preserve"> verwendet. Der </w:t>
+      </w:r>
+      <w:proofErr w:type="spellStart"/>
+      <w:r>
+        <w:t>XGBClassifier</w:t>
+      </w:r>
+      <w:proofErr w:type="spellEnd"/>
+      <w:r>
+        <w:t xml:space="preserve"> wurde </w:t>
       </w:r>
       <w:proofErr w:type="gramStart"/>
       <w:r>
@@ -1036,784 +1471,380 @@
       </w:r>
     </w:p>
     <w:p>
-      <w:r>
-        <w:t>In der zweiten Stufe wurden alle Beobachtungen, die vom Hauptmodell als SITTING oder STANDING vorhergesagt wurden, durch das spezialisierte Polynomial-SVM-Modell erneut bewertet.</w:t>
-      </w:r>
-    </w:p>
-    <w:p>
-      <w:r>
-        <w:t xml:space="preserve">Das finale Modell erreichte auf dem Holdout-Testset eine Test Accuracy von 0.9764 und einen </w:t>
-      </w:r>
-      <w:proofErr w:type="gramStart"/>
-      <w:r>
-        <w:t>Test Error</w:t>
-      </w:r>
-      <w:proofErr w:type="gramEnd"/>
-      <w:r>
-        <w:t xml:space="preserve"> von 0.0236. Insgesamt wurden 35 von 1485 Testbeobachtungen falsch klassifiziert. Die verbleibenden Fehler lagen ausschließlich zwischen SITTING und STANDING.</w:t>
-      </w:r>
-      <w:r>
-        <w:br/>
-      </w:r>
-    </w:p>
-    <w:p>
-      <w:r>
-        <w:t xml:space="preserve">Alle Hyperparameter sind folgend </w:t>
-      </w:r>
-      <w:r>
-        <w:t>aufgelistet:</w:t>
-      </w:r>
-      <w:r>
+      <w:pPr>
         <w:rPr>
           <w:lang w:val="en-US"/>
         </w:rPr>
-        <w:br w:type="page"/>
-      </w:r>
-    </w:p>
-    <w:p>
-      <w:pPr>
+      </w:pPr>
+      <w:r>
+        <w:t xml:space="preserve">Hierbei haben wir für Poly-SVM </w:t>
+      </w:r>
+      <w:r>
+        <w:t xml:space="preserve">zuerst den </w:t>
+      </w:r>
+      <w:proofErr w:type="spellStart"/>
+      <w:r>
+        <w:t>StandardScaler</w:t>
+      </w:r>
+      <w:proofErr w:type="spellEnd"/>
+      <w:r>
+        <w:t xml:space="preserve"> genutzt und dann C=1e5, </w:t>
+      </w:r>
+      <w:proofErr w:type="spellStart"/>
+      <w:r>
+        <w:t>gamma</w:t>
+      </w:r>
+      <w:proofErr w:type="spellEnd"/>
+      <w:r>
+        <w:t xml:space="preserve">=0.001, </w:t>
+      </w:r>
+      <w:proofErr w:type="spellStart"/>
+      <w:r>
+        <w:t>degree</w:t>
+      </w:r>
+      <w:proofErr w:type="spellEnd"/>
+      <w:r>
+        <w:t xml:space="preserve">=6, coef0=2.0, </w:t>
+      </w:r>
+      <w:proofErr w:type="spellStart"/>
+      <w:r>
+        <w:t>class_weight</w:t>
+      </w:r>
+      <w:proofErr w:type="spellEnd"/>
+      <w:proofErr w:type="gramStart"/>
+      <w:r>
+        <w:t>={</w:t>
+      </w:r>
+      <w:proofErr w:type="gramEnd"/>
+      <w:r>
+        <w:t xml:space="preserve">folgende </w:t>
+      </w:r>
+      <w:proofErr w:type="spellStart"/>
+      <w:r>
+        <w:t>Weights</w:t>
+      </w:r>
+      <w:proofErr w:type="spellEnd"/>
+      <w:r>
+        <w:t xml:space="preserve">} und </w:t>
+      </w:r>
+      <w:proofErr w:type="spellStart"/>
+      <w:r>
+        <w:t>probability</w:t>
+      </w:r>
+      <w:proofErr w:type="spellEnd"/>
+      <w:r>
+        <w:t xml:space="preserve">=True gesetzt. Die hier </w:t>
+      </w:r>
+      <w:proofErr w:type="spellStart"/>
+      <w:r>
+        <w:t>gesnutzen</w:t>
+      </w:r>
+      <w:proofErr w:type="spellEnd"/>
+      <w:r>
+        <w:t xml:space="preserve"> gewichte sind </w:t>
+      </w:r>
+      <w:proofErr w:type="spellStart"/>
+      <w:r>
+        <w:t>Laying</w:t>
+      </w:r>
+      <w:proofErr w:type="spellEnd"/>
+      <w:r>
+        <w:t xml:space="preserve">: 1.0, Sitting: 2.0, Standing: 1.5, Walking: 1.2, </w:t>
+      </w:r>
+      <w:proofErr w:type="spellStart"/>
+      <w:r>
+        <w:t>Walking_Downstairs</w:t>
+      </w:r>
+      <w:proofErr w:type="spellEnd"/>
+      <w:r>
+        <w:t xml:space="preserve">: 3.0 und </w:t>
+      </w:r>
+      <w:proofErr w:type="spellStart"/>
+      <w:r>
+        <w:t>Walking_Upstairs</w:t>
+      </w:r>
+      <w:proofErr w:type="spellEnd"/>
+      <w:r>
+        <w:t xml:space="preserve">: 2.0. </w:t>
+      </w:r>
+      <w:r>
         <w:rPr>
           <w:lang w:val="en-US"/>
         </w:rPr>
-      </w:pPr>
+        <w:t xml:space="preserve">Für den </w:t>
+      </w:r>
+      <w:proofErr w:type="spellStart"/>
       <w:r>
         <w:rPr>
           <w:lang w:val="en-US"/>
         </w:rPr>
-        <w:lastRenderedPageBreak/>
-        <w:t xml:space="preserve">Poly-SVM </w:t>
-      </w:r>
-      <w:r>
-        <w:rPr>
-          <w:lang w:val="en-US"/>
-        </w:rPr>
-        <w:t>(</w:t>
-      </w:r>
-      <w:r>
-        <w:rPr>
-          <w:lang w:val="en-US"/>
-        </w:rPr>
-        <w:t>Stufe 1</w:t>
-      </w:r>
-      <w:r>
-        <w:rPr>
-          <w:lang w:val="en-US"/>
-        </w:rPr>
-        <w:t>)</w:t>
-      </w:r>
-      <w:r>
-        <w:rPr>
-          <w:lang w:val="en-US"/>
-        </w:rPr>
-        <w:t xml:space="preserve">: </w:t>
-      </w:r>
-    </w:p>
-    <w:p>
-      <w:pPr>
-        <w:rPr>
-          <w:lang w:val="en-US"/>
-        </w:rPr>
-      </w:pPr>
-      <w:proofErr w:type="gramStart"/>
-      <w:r>
-        <w:rPr>
-          <w:lang w:val="en-US"/>
-        </w:rPr>
-        <w:t>Pipeline(</w:t>
-      </w:r>
-      <w:proofErr w:type="gramEnd"/>
-      <w:r>
-        <w:rPr>
-          <w:lang w:val="en-US"/>
-        </w:rPr>
-        <w:t>steps</w:t>
-      </w:r>
-      <w:proofErr w:type="gramStart"/>
-      <w:r>
-        <w:rPr>
-          <w:lang w:val="en-US"/>
-        </w:rPr>
-        <w:t>=[</w:t>
-      </w:r>
-      <w:proofErr w:type="gramEnd"/>
-      <w:r>
-        <w:rPr>
-          <w:lang w:val="en-US"/>
-        </w:rPr>
-        <w:t xml:space="preserve">("scaler", </w:t>
-      </w:r>
-      <w:proofErr w:type="gramStart"/>
-      <w:r>
-        <w:rPr>
-          <w:lang w:val="en-US"/>
-        </w:rPr>
-        <w:t>StandardScaler(</w:t>
-      </w:r>
-      <w:proofErr w:type="gramEnd"/>
-      <w:r>
-        <w:rPr>
-          <w:lang w:val="en-US"/>
-        </w:rPr>
-        <w:t>)),</w:t>
-      </w:r>
+        <w:t>XGBClassifier</w:t>
+      </w:r>
+      <w:proofErr w:type="spellEnd"/>
       <w:r>
         <w:rPr>
           <w:lang w:val="en-US"/>
         </w:rPr>
         <w:t xml:space="preserve"> </w:t>
       </w:r>
+      <w:proofErr w:type="spellStart"/>
       <w:r>
         <w:rPr>
           <w:lang w:val="en-US"/>
         </w:rPr>
-        <w:t xml:space="preserve">("classifier", </w:t>
-      </w:r>
-      <w:proofErr w:type="gramStart"/>
+        <w:t>wurden</w:t>
+      </w:r>
+      <w:proofErr w:type="spellEnd"/>
       <w:r>
         <w:rPr>
           <w:lang w:val="en-US"/>
         </w:rPr>
-        <w:t>SVC(</w:t>
-      </w:r>
-      <w:proofErr w:type="gramEnd"/>
+        <w:t xml:space="preserve"> die Parameter </w:t>
+      </w:r>
       <w:r>
         <w:rPr>
           <w:lang w:val="en-US"/>
         </w:rPr>
-        <w:t>kernel="poly",</w:t>
-      </w:r>
+        <w:t>objective=</w:t>
+      </w:r>
+      <w:proofErr w:type="spellStart"/>
+      <w:proofErr w:type="gramStart"/>
       <w:r>
         <w:rPr>
           <w:lang w:val="en-US"/>
         </w:rPr>
-        <w:t xml:space="preserve"> </w:t>
-      </w:r>
+        <w:t>multi:softprob</w:t>
+      </w:r>
+      <w:proofErr w:type="spellEnd"/>
+      <w:proofErr w:type="gramEnd"/>
       <w:r>
         <w:rPr>
           <w:lang w:val="en-US"/>
         </w:rPr>
-        <w:t>C=1e5,</w:t>
-      </w:r>
+        <w:t xml:space="preserve">, </w:t>
+      </w:r>
+      <w:proofErr w:type="spellStart"/>
       <w:r>
         <w:rPr>
           <w:lang w:val="en-US"/>
         </w:rPr>
-        <w:t xml:space="preserve"> </w:t>
-      </w:r>
+        <w:t>n_estimators</w:t>
+      </w:r>
+      <w:proofErr w:type="spellEnd"/>
       <w:r>
         <w:rPr>
           <w:lang w:val="en-US"/>
         </w:rPr>
-        <w:t>tol=1e-5,</w:t>
-      </w:r>
+        <w:t xml:space="preserve">=300, </w:t>
+      </w:r>
+      <w:proofErr w:type="spellStart"/>
       <w:r>
         <w:rPr>
           <w:lang w:val="en-US"/>
         </w:rPr>
-        <w:t xml:space="preserve"> </w:t>
-      </w:r>
+        <w:t>max_depth</w:t>
+      </w:r>
+      <w:proofErr w:type="spellEnd"/>
       <w:r>
         <w:rPr>
           <w:lang w:val="en-US"/>
         </w:rPr>
-        <w:t>shrinking=True,</w:t>
-      </w:r>
+        <w:t xml:space="preserve">=2, </w:t>
+      </w:r>
+      <w:proofErr w:type="spellStart"/>
       <w:r>
         <w:rPr>
           <w:lang w:val="en-US"/>
         </w:rPr>
-        <w:t xml:space="preserve"> </w:t>
-      </w:r>
+        <w:t>learning_rate</w:t>
+      </w:r>
+      <w:proofErr w:type="spellEnd"/>
       <w:r>
         <w:rPr>
           <w:lang w:val="en-US"/>
         </w:rPr>
-        <w:t>gamma=0.001,</w:t>
-      </w:r>
+        <w:t xml:space="preserve">=0.1, subsample=0.8, </w:t>
+      </w:r>
+      <w:proofErr w:type="spellStart"/>
       <w:r>
         <w:rPr>
           <w:lang w:val="en-US"/>
         </w:rPr>
-        <w:t xml:space="preserve"> </w:t>
-      </w:r>
+        <w:t>colsample_bytree</w:t>
+      </w:r>
+      <w:proofErr w:type="spellEnd"/>
       <w:r>
         <w:rPr>
           <w:lang w:val="en-US"/>
         </w:rPr>
-        <w:t>degree=6,</w:t>
-      </w:r>
+        <w:t xml:space="preserve">=1.0, </w:t>
+      </w:r>
+      <w:proofErr w:type="spellStart"/>
       <w:r>
         <w:rPr>
           <w:lang w:val="en-US"/>
         </w:rPr>
-        <w:t xml:space="preserve"> </w:t>
-      </w:r>
+        <w:t>min_child_weight</w:t>
+      </w:r>
+      <w:proofErr w:type="spellEnd"/>
       <w:r>
         <w:rPr>
           <w:lang w:val="en-US"/>
         </w:rPr>
-        <w:t>coef0=2.0,</w:t>
-      </w:r>
+        <w:t xml:space="preserve">=3, </w:t>
+      </w:r>
+      <w:proofErr w:type="spellStart"/>
       <w:r>
         <w:rPr>
           <w:lang w:val="en-US"/>
         </w:rPr>
-        <w:t xml:space="preserve"> </w:t>
-      </w:r>
+        <w:t>reg_lambda</w:t>
+      </w:r>
+      <w:proofErr w:type="spellEnd"/>
       <w:r>
         <w:rPr>
           <w:lang w:val="en-US"/>
         </w:rPr>
-        <w:t>class_weight=class_weights_encoded,</w:t>
+        <w:t>=5</w:t>
       </w:r>
       <w:r>
         <w:rPr>
           <w:lang w:val="en-US"/>
         </w:rPr>
-        <w:t xml:space="preserve"> </w:t>
-      </w:r>
+        <w:t xml:space="preserve"> und </w:t>
+      </w:r>
+      <w:proofErr w:type="spellStart"/>
       <w:r>
         <w:rPr>
           <w:lang w:val="en-US"/>
         </w:rPr>
-        <w:t>probability=True,</w:t>
-      </w:r>
+        <w:t>reg_alpha</w:t>
+      </w:r>
+      <w:proofErr w:type="spellEnd"/>
       <w:r>
         <w:rPr>
           <w:lang w:val="en-US"/>
         </w:rPr>
-        <w:t xml:space="preserve"> </w:t>
+        <w:t>=0.1</w:t>
       </w:r>
       <w:r>
         <w:rPr>
           <w:lang w:val="en-US"/>
         </w:rPr>
-        <w:t>random_state=RANDOM_STATE</w:t>
-      </w:r>
+        <w:t xml:space="preserve">genutzt. </w:t>
+      </w:r>
+    </w:p>
+    <w:p>
+      <w:r>
+        <w:t>In der zweiten Stufe wurden alle Beobachtungen, die vom Hauptmodell als SITTING oder STANDING vorhergesagt wurden, durch das spezialisierte Polynomial-SVM-Modell erneut bewertet.</w:t>
+      </w:r>
+    </w:p>
+    <w:p>
+      <w:r>
+        <w:t xml:space="preserve">In dieser Stufe wurde dann der </w:t>
+      </w:r>
+      <w:proofErr w:type="spellStart"/>
+      <w:r>
+        <w:t>StandardScaler</w:t>
+      </w:r>
+      <w:proofErr w:type="spellEnd"/>
+      <w:r>
+        <w:t xml:space="preserve"> genutzt, dann </w:t>
+      </w:r>
+      <w:proofErr w:type="spellStart"/>
+      <w:r>
+        <w:t>SelectKBest</w:t>
+      </w:r>
+      <w:proofErr w:type="spellEnd"/>
+      <w:r>
+        <w:t xml:space="preserve"> mit </w:t>
+      </w:r>
+      <w:proofErr w:type="spellStart"/>
+      <w:r>
+        <w:t>score_func</w:t>
+      </w:r>
+      <w:proofErr w:type="spellEnd"/>
+      <w:r>
+        <w:t>=</w:t>
+      </w:r>
+      <w:proofErr w:type="spellStart"/>
+      <w:r>
+        <w:t>f_classif</w:t>
+      </w:r>
+      <w:proofErr w:type="spellEnd"/>
+      <w:r>
+        <w:t>, k=150</w:t>
+      </w:r>
+      <w:r>
+        <w:t xml:space="preserve"> und als Parameter für Poly-SVM </w:t>
+      </w:r>
+      <w:r>
+        <w:t xml:space="preserve">C=10, </w:t>
+      </w:r>
+      <w:proofErr w:type="spellStart"/>
+      <w:r>
+        <w:t>gamma</w:t>
+      </w:r>
+      <w:proofErr w:type="spellEnd"/>
+      <w:r>
+        <w:t xml:space="preserve">=0.0003, </w:t>
+      </w:r>
+      <w:proofErr w:type="spellStart"/>
+      <w:r>
+        <w:t>degree</w:t>
+      </w:r>
+      <w:proofErr w:type="spellEnd"/>
+      <w:r>
+        <w:t>=3, coef0=2.0</w:t>
+      </w:r>
+      <w:r>
+        <w:t xml:space="preserve"> und </w:t>
+      </w:r>
+      <w:proofErr w:type="spellStart"/>
+      <w:r>
+        <w:t>class_weight</w:t>
+      </w:r>
+      <w:proofErr w:type="spellEnd"/>
       <w:proofErr w:type="gramStart"/>
       <w:r>
-        <w:rPr>
-          <w:lang w:val="en-US"/>
-        </w:rPr>
-        <w:t>,</w:t>
-      </w:r>
-      <w:r>
-        <w:rPr>
-          <w:lang w:val="en-US"/>
-        </w:rPr>
-        <w:t xml:space="preserve"> </w:t>
-      </w:r>
-      <w:r>
-        <w:rPr>
-          <w:lang w:val="en-US"/>
-        </w:rPr>
-        <w:t>)</w:t>
+        <w:t>={</w:t>
       </w:r>
       <w:proofErr w:type="gramEnd"/>
       <w:r>
-        <w:rPr>
-          <w:lang w:val="en-US"/>
-        </w:rPr>
-        <w:t>),])</w:t>
-      </w:r>
-    </w:p>
-    <w:p>
-      <w:pPr>
-        <w:rPr>
-          <w:lang w:val="en-US"/>
-        </w:rPr>
-      </w:pPr>
-      <w:r>
-        <w:rPr>
-          <w:lang w:val="en-US"/>
-        </w:rPr>
-        <w:t xml:space="preserve">Weights: </w:t>
-      </w:r>
-      <w:r>
-        <w:rPr>
-          <w:lang w:val="en-US"/>
-        </w:rPr>
-        <w:t>"LAYING": 1.0,</w:t>
-      </w:r>
-      <w:r>
-        <w:rPr>
-          <w:lang w:val="en-US"/>
-        </w:rPr>
-        <w:t xml:space="preserve"> </w:t>
-      </w:r>
-      <w:r>
-        <w:rPr>
-          <w:lang w:val="en-US"/>
-        </w:rPr>
-        <w:t>"SITTING": 2.0,</w:t>
-      </w:r>
-      <w:r>
-        <w:rPr>
-          <w:lang w:val="en-US"/>
-        </w:rPr>
-        <w:t xml:space="preserve"> </w:t>
-      </w:r>
-      <w:r>
-        <w:rPr>
-          <w:lang w:val="en-US"/>
-        </w:rPr>
-        <w:t>"STANDING": 1.5,</w:t>
-      </w:r>
-      <w:r>
-        <w:rPr>
-          <w:lang w:val="en-US"/>
-        </w:rPr>
-        <w:t xml:space="preserve"> </w:t>
-      </w:r>
-      <w:r>
-        <w:rPr>
-          <w:lang w:val="en-US"/>
-        </w:rPr>
-        <w:t>"WALKING": 1.2,</w:t>
-      </w:r>
-      <w:r>
-        <w:rPr>
-          <w:lang w:val="en-US"/>
-        </w:rPr>
-        <w:t xml:space="preserve"> </w:t>
-      </w:r>
-      <w:r>
-        <w:rPr>
-          <w:lang w:val="en-US"/>
-        </w:rPr>
-        <w:t>"WALKING_DOWNSTAIRS": 3.0,</w:t>
-      </w:r>
-      <w:r>
-        <w:rPr>
-          <w:lang w:val="en-US"/>
-        </w:rPr>
-        <w:t xml:space="preserve"> </w:t>
-      </w:r>
-      <w:r>
-        <w:rPr>
-          <w:lang w:val="en-US"/>
-        </w:rPr>
-        <w:t>"WALKING_UPSTAIRS": 2.0</w:t>
-      </w:r>
-    </w:p>
-    <w:p>
-      <w:pPr>
-        <w:rPr>
-          <w:lang w:val="en-US"/>
-        </w:rPr>
-      </w:pPr>
-    </w:p>
-    <w:p>
-      <w:pPr>
-        <w:rPr>
-          <w:lang w:val="en-US"/>
-        </w:rPr>
-      </w:pPr>
-      <w:r>
-        <w:rPr>
-          <w:lang w:val="en-US"/>
-        </w:rPr>
-        <w:t>XGBoost (Stufe 1):</w:t>
-      </w:r>
-    </w:p>
-    <w:p>
-      <w:pPr>
-        <w:rPr>
-          <w:lang w:val="en-US"/>
-        </w:rPr>
-      </w:pPr>
-      <w:r>
-        <w:rPr>
-          <w:lang w:val="en-US"/>
-        </w:rPr>
-        <w:t>dict(objective="multi:softprob",</w:t>
-      </w:r>
-      <w:r>
-        <w:rPr>
-          <w:lang w:val="en-US"/>
-        </w:rPr>
-        <w:t xml:space="preserve"> </w:t>
-      </w:r>
-      <w:r>
-        <w:rPr>
-          <w:lang w:val="en-US"/>
-        </w:rPr>
-        <w:t>eval_metric="mlogloss",</w:t>
-      </w:r>
-      <w:r>
-        <w:rPr>
-          <w:lang w:val="en-US"/>
-        </w:rPr>
-        <w:t xml:space="preserve"> </w:t>
-      </w:r>
-      <w:r>
-        <w:rPr>
-          <w:lang w:val="en-US"/>
-        </w:rPr>
-        <w:t>tree_method="hist",</w:t>
-      </w:r>
-      <w:r>
-        <w:rPr>
-          <w:lang w:val="en-US"/>
-        </w:rPr>
-        <w:t xml:space="preserve"> </w:t>
-      </w:r>
-      <w:r>
-        <w:rPr>
-          <w:lang w:val="en-US"/>
-        </w:rPr>
-        <w:t>random_state=RANDOM_STATE,</w:t>
-      </w:r>
-      <w:r>
-        <w:rPr>
-          <w:lang w:val="en-US"/>
-        </w:rPr>
-        <w:t xml:space="preserve"> </w:t>
-      </w:r>
-      <w:r>
-        <w:rPr>
-          <w:lang w:val="en-US"/>
-        </w:rPr>
-        <w:t>n_jobs=-1,</w:t>
-      </w:r>
-      <w:r>
-        <w:rPr>
-          <w:lang w:val="en-US"/>
-        </w:rPr>
-        <w:t xml:space="preserve"> </w:t>
-      </w:r>
-      <w:r>
-        <w:rPr>
-          <w:lang w:val="en-US"/>
-        </w:rPr>
-        <w:t>n_estimators=300,</w:t>
-      </w:r>
-      <w:r>
-        <w:rPr>
-          <w:lang w:val="en-US"/>
-        </w:rPr>
-        <w:t xml:space="preserve"> </w:t>
-      </w:r>
-      <w:r>
-        <w:rPr>
-          <w:lang w:val="en-US"/>
-        </w:rPr>
-        <w:t>max_depth=2,</w:t>
-      </w:r>
-      <w:r>
-        <w:rPr>
-          <w:lang w:val="en-US"/>
-        </w:rPr>
-        <w:t xml:space="preserve"> </w:t>
-      </w:r>
-      <w:r>
-        <w:rPr>
-          <w:lang w:val="en-US"/>
-        </w:rPr>
-        <w:t>learning_rate=0.1,</w:t>
-      </w:r>
-      <w:r>
-        <w:rPr>
-          <w:lang w:val="en-US"/>
-        </w:rPr>
-        <w:t xml:space="preserve"> </w:t>
-      </w:r>
-      <w:r>
-        <w:rPr>
-          <w:lang w:val="en-US"/>
-        </w:rPr>
-        <w:t>subsample=0.8,</w:t>
-      </w:r>
-      <w:r>
-        <w:rPr>
-          <w:lang w:val="en-US"/>
-        </w:rPr>
-        <w:t xml:space="preserve"> </w:t>
-      </w:r>
-      <w:r>
-        <w:rPr>
-          <w:lang w:val="en-US"/>
-        </w:rPr>
-        <w:t>colsample_bytree=1.0,</w:t>
-      </w:r>
-      <w:r>
-        <w:rPr>
-          <w:lang w:val="en-US"/>
-        </w:rPr>
-        <w:t xml:space="preserve"> </w:t>
-      </w:r>
-      <w:r>
-        <w:rPr>
-          <w:lang w:val="en-US"/>
-        </w:rPr>
-        <w:t>min_child_weight=3,</w:t>
-      </w:r>
-      <w:r>
-        <w:rPr>
-          <w:lang w:val="en-US"/>
-        </w:rPr>
-        <w:t xml:space="preserve"> </w:t>
-      </w:r>
-      <w:r>
-        <w:rPr>
-          <w:lang w:val="en-US"/>
-        </w:rPr>
-        <w:t>reg_lambda=5,</w:t>
-      </w:r>
-      <w:r>
-        <w:rPr>
-          <w:lang w:val="en-US"/>
-        </w:rPr>
-        <w:t xml:space="preserve"> </w:t>
-      </w:r>
-      <w:r>
-        <w:rPr>
-          <w:lang w:val="en-US"/>
-        </w:rPr>
-        <w:t>reg_alpha=0.1,)</w:t>
-      </w:r>
-    </w:p>
-    <w:p>
-      <w:pPr>
-        <w:rPr>
-          <w:lang w:val="en-US"/>
-        </w:rPr>
-      </w:pPr>
-    </w:p>
-    <w:p>
-      <w:pPr>
-        <w:rPr>
-          <w:lang w:val="en-US"/>
-        </w:rPr>
-      </w:pPr>
-      <w:r>
-        <w:rPr>
-          <w:lang w:val="en-US"/>
-        </w:rPr>
-        <w:t>VotingClassifier (Stufe 1):</w:t>
-      </w:r>
-    </w:p>
-    <w:p>
-      <w:pPr>
-        <w:rPr>
-          <w:lang w:val="en-US"/>
-        </w:rPr>
-      </w:pPr>
+        <w:t xml:space="preserve">Sitting: 1.4, Standing: 1.0}. </w:t>
+      </w:r>
+    </w:p>
+    <w:p>
+      <w:r>
+        <w:lastRenderedPageBreak/>
+        <w:t>Das finale Modell erreichte auf dem Holdout-</w:t>
+      </w:r>
+      <w:proofErr w:type="spellStart"/>
+      <w:r>
+        <w:t>Testset</w:t>
+      </w:r>
+      <w:proofErr w:type="spellEnd"/>
+      <w:r>
+        <w:t xml:space="preserve"> eine Test </w:t>
+      </w:r>
+      <w:proofErr w:type="spellStart"/>
+      <w:r>
+        <w:t>Accuracy</w:t>
+      </w:r>
+      <w:proofErr w:type="spellEnd"/>
+      <w:r>
+        <w:t xml:space="preserve"> von 0.9764 und einen </w:t>
+      </w:r>
       <w:proofErr w:type="gramStart"/>
       <w:r>
-        <w:rPr>
-          <w:lang w:val="en-US"/>
-        </w:rPr>
-        <w:t>VotingClassifier(</w:t>
+        <w:t>Test Error</w:t>
       </w:r>
       <w:proofErr w:type="gramEnd"/>
       <w:r>
-        <w:rPr>
-          <w:lang w:val="en-US"/>
-        </w:rPr>
-        <w:t>estimators</w:t>
-      </w:r>
-      <w:proofErr w:type="gramStart"/>
-      <w:r>
-        <w:rPr>
-          <w:lang w:val="en-US"/>
-        </w:rPr>
-        <w:t>=[</w:t>
-      </w:r>
-      <w:proofErr w:type="gramEnd"/>
-      <w:r>
-        <w:rPr>
-          <w:lang w:val="en-US"/>
-        </w:rPr>
-        <w:t>("poly_svm", poly_svm_main), ("xgb", xgb_main),],</w:t>
-      </w:r>
-      <w:r>
-        <w:rPr>
-          <w:lang w:val="en-US"/>
-        </w:rPr>
-        <w:t xml:space="preserve"> </w:t>
-      </w:r>
-      <w:r>
-        <w:rPr>
-          <w:lang w:val="en-US"/>
-        </w:rPr>
-        <w:t>voting="soft",</w:t>
-      </w:r>
-      <w:r>
-        <w:rPr>
-          <w:lang w:val="en-US"/>
-        </w:rPr>
-        <w:t xml:space="preserve"> </w:t>
-      </w:r>
-      <w:r>
-        <w:rPr>
-          <w:lang w:val="en-US"/>
-        </w:rPr>
-        <w:t>weights</w:t>
-      </w:r>
-      <w:proofErr w:type="gramStart"/>
-      <w:r>
-        <w:rPr>
-          <w:lang w:val="en-US"/>
-        </w:rPr>
-        <w:t>=[</w:t>
-      </w:r>
-      <w:proofErr w:type="gramEnd"/>
-      <w:r>
-        <w:rPr>
-          <w:lang w:val="en-US"/>
-        </w:rPr>
-        <w:t>1, 3],</w:t>
-      </w:r>
-      <w:r>
-        <w:rPr>
-          <w:lang w:val="en-US"/>
-        </w:rPr>
-        <w:t xml:space="preserve"> </w:t>
-      </w:r>
-      <w:r>
-        <w:rPr>
-          <w:lang w:val="en-US"/>
-        </w:rPr>
-        <w:t>n_jobs=-1,)</w:t>
-      </w:r>
-    </w:p>
-    <w:p>
-      <w:pPr>
-        <w:rPr>
-          <w:lang w:val="en-US"/>
-        </w:rPr>
-      </w:pPr>
-    </w:p>
-    <w:p>
-      <w:pPr>
-        <w:rPr>
-          <w:lang w:val="en-US"/>
-        </w:rPr>
-      </w:pPr>
-      <w:r>
-        <w:rPr>
-          <w:lang w:val="en-US"/>
-        </w:rPr>
-        <w:t>Poly-SVM (Stufe 2):</w:t>
-      </w:r>
-    </w:p>
-    <w:p>
-      <w:pPr>
-        <w:rPr>
-          <w:lang w:val="en-US"/>
-        </w:rPr>
-      </w:pPr>
-      <w:r>
-        <w:rPr>
-          <w:lang w:val="en-US"/>
-        </w:rPr>
-        <w:t>Pipeline(steps=[("scaler", StandardScaler()),</w:t>
-      </w:r>
-      <w:r>
-        <w:rPr>
-          <w:lang w:val="en-US"/>
-        </w:rPr>
-        <w:t xml:space="preserve"> </w:t>
-      </w:r>
-      <w:r>
-        <w:rPr>
-          <w:lang w:val="en-US"/>
-        </w:rPr>
-        <w:t>("select",</w:t>
-      </w:r>
-      <w:r>
-        <w:rPr>
-          <w:lang w:val="en-US"/>
-        </w:rPr>
-        <w:t xml:space="preserve"> </w:t>
-      </w:r>
-      <w:r>
-        <w:rPr>
-          <w:lang w:val="en-US"/>
-        </w:rPr>
-        <w:t>SelectKBest(score_func=f_classif, k=150)), ("classifier", SVC(kernel="poly",</w:t>
-      </w:r>
-      <w:r>
-        <w:rPr>
-          <w:lang w:val="en-US"/>
-        </w:rPr>
-        <w:t xml:space="preserve"> </w:t>
-      </w:r>
-      <w:r>
-        <w:rPr>
-          <w:lang w:val="en-US"/>
-        </w:rPr>
-        <w:t>C=10,</w:t>
-      </w:r>
-      <w:r>
-        <w:rPr>
-          <w:lang w:val="en-US"/>
-        </w:rPr>
-        <w:t xml:space="preserve"> </w:t>
-      </w:r>
-      <w:r>
-        <w:rPr>
-          <w:lang w:val="en-US"/>
-        </w:rPr>
-        <w:t>gamma=0.0003,</w:t>
-      </w:r>
-      <w:r>
-        <w:rPr>
-          <w:lang w:val="en-US"/>
-        </w:rPr>
-        <w:t xml:space="preserve"> </w:t>
-      </w:r>
-      <w:r>
-        <w:rPr>
-          <w:lang w:val="en-US"/>
-        </w:rPr>
-        <w:t>degree=3,</w:t>
-      </w:r>
-      <w:r>
-        <w:rPr>
-          <w:lang w:val="en-US"/>
-        </w:rPr>
-        <w:t xml:space="preserve"> </w:t>
-      </w:r>
-      <w:r>
-        <w:rPr>
-          <w:lang w:val="en-US"/>
-        </w:rPr>
-        <w:t>coef0=2.0,</w:t>
-      </w:r>
-      <w:r>
-        <w:rPr>
-          <w:lang w:val="en-US"/>
-        </w:rPr>
-        <w:t xml:space="preserve"> </w:t>
-      </w:r>
-      <w:r>
-        <w:rPr>
-          <w:lang w:val="en-US"/>
-        </w:rPr>
-        <w:t>class_weight={"SITTING": 1.4, "STANDING": 1.0},</w:t>
-      </w:r>
-      <w:r>
-        <w:rPr>
-          <w:lang w:val="en-US"/>
-        </w:rPr>
-        <w:t xml:space="preserve"> </w:t>
-      </w:r>
-      <w:r>
-        <w:rPr>
-          <w:lang w:val="en-US"/>
-        </w:rPr>
-        <w:t>random_state=RANDOM_STATE,)),])</w:t>
-      </w:r>
-    </w:p>
-    <w:p>
-      <w:pPr>
-        <w:rPr>
-          <w:lang w:val="en-US"/>
-        </w:rPr>
-      </w:pPr>
-    </w:p>
+        <w:t xml:space="preserve"> von 0.0236. Insgesamt wurden 35 von 1485 Testbeobachtungen falsch klassifiziert. Die verbleibenden Fehler lagen ausschließlich zwischen SITTING und STANDING.</w:t>
+      </w:r>
+    </w:p>
+    <w:p/>
     <w:sdt>
       <w:sdtPr>
         <w:rPr>

</xml_diff>

<commit_message>
Abbildung 1 entfernt und text daran angepasst
</commit_message>
<xml_diff>
--- a/Journal template free format.docx
+++ b/Journal template free format.docx
@@ -349,74 +349,6 @@
       </w:r>
     </w:p>
     <w:p>
-      <w:r>
-        <w:rPr>
-          <w:noProof/>
-        </w:rPr>
-        <w:lastRenderedPageBreak/>
-        <w:drawing>
-          <wp:anchor distT="0" distB="0" distL="114300" distR="114300" simplePos="0" relativeHeight="251658240" behindDoc="1" locked="0" layoutInCell="1" allowOverlap="1" wp14:anchorId="26BEF09C" wp14:editId="7E16FB90">
-            <wp:simplePos x="0" y="0"/>
-            <wp:positionH relativeFrom="margin">
-              <wp:posOffset>40640</wp:posOffset>
-            </wp:positionH>
-            <wp:positionV relativeFrom="paragraph">
-              <wp:posOffset>1041238</wp:posOffset>
-            </wp:positionV>
-            <wp:extent cx="5868670" cy="2895600"/>
-            <wp:effectExtent l="0" t="0" r="0" b="0"/>
-            <wp:wrapTopAndBottom/>
-            <wp:docPr id="1555148323" name="Grafik 2"/>
-            <wp:cNvGraphicFramePr>
-              <a:graphicFrameLocks xmlns:a="http://schemas.openxmlformats.org/drawingml/2006/main" noChangeAspect="1"/>
-            </wp:cNvGraphicFramePr>
-            <a:graphic xmlns:a="http://schemas.openxmlformats.org/drawingml/2006/main">
-              <a:graphicData uri="http://schemas.openxmlformats.org/drawingml/2006/picture">
-                <pic:pic xmlns:pic="http://schemas.openxmlformats.org/drawingml/2006/picture">
-                  <pic:nvPicPr>
-                    <pic:cNvPr id="0" name="Picture 1"/>
-                    <pic:cNvPicPr>
-                      <a:picLocks noChangeAspect="1" noChangeArrowheads="1"/>
-                    </pic:cNvPicPr>
-                  </pic:nvPicPr>
-                  <pic:blipFill>
-                    <a:blip r:embed="rId8" cstate="print">
-                      <a:extLst>
-                        <a:ext uri="{28A0092B-C50C-407E-A947-70E740481C1C}">
-                          <a14:useLocalDpi xmlns:a14="http://schemas.microsoft.com/office/drawing/2010/main" val="0"/>
-                        </a:ext>
-                      </a:extLst>
-                    </a:blip>
-                    <a:srcRect/>
-                    <a:stretch>
-                      <a:fillRect/>
-                    </a:stretch>
-                  </pic:blipFill>
-                  <pic:spPr bwMode="auto">
-                    <a:xfrm>
-                      <a:off x="0" y="0"/>
-                      <a:ext cx="5868670" cy="2895600"/>
-                    </a:xfrm>
-                    <a:prstGeom prst="rect">
-                      <a:avLst/>
-                    </a:prstGeom>
-                    <a:noFill/>
-                    <a:ln>
-                      <a:noFill/>
-                    </a:ln>
-                  </pic:spPr>
-                </pic:pic>
-              </a:graphicData>
-            </a:graphic>
-            <wp14:sizeRelH relativeFrom="page">
-              <wp14:pctWidth>0</wp14:pctWidth>
-            </wp14:sizeRelH>
-            <wp14:sizeRelV relativeFrom="page">
-              <wp14:pctHeight>0</wp14:pctHeight>
-            </wp14:sizeRelV>
-          </wp:anchor>
-        </w:drawing>
-      </w:r>
       <w:r>
         <w:t xml:space="preserve">Die Modellwahl erfolgte ausschließlich auf dem Trainingsdatensatz mithilfe einer 5-fold Group Cross-Validation. Dabei wurden die Folds ebenfalls nach </w:t>
       </w:r>
@@ -577,10 +509,18 @@
           </mc:Fallback>
         </mc:AlternateContent>
       </w:r>
-    </w:p>
-    <w:p>
-      <w:r>
-        <w:t>Die Klassenverteilungen im Trainings- und Testdatensatz wurden zusätzlich verglichen. Abbildung 1 zeigt, dass die relativen Häufigkeiten der sechs Aktivitätsklassen in beiden Datensätzen ähnlich sind. Die stärkste Abweichung zeigt sich bei der Klasse WALKING, ist jedoch nicht so ausgeprägt, dass eine wesentliche Verzerrung der Modellbewertung zu erwarten ist.</w:t>
+      <w:r>
+        <w:t xml:space="preserve">Die Klassenverteilungen im Trainings- und Testdatensatz wurden zusätzlich verglichen. </w:t>
+      </w:r>
+      <w:r>
+        <w:t>Dort war zu sehen</w:t>
+      </w:r>
+      <w:r>
+        <w:t xml:space="preserve"> dass die relativen Häufigkeiten der sechs Aktivitätsklassen in beiden Datensätzen ähnlich </w:t>
+      </w:r>
+      <w:r>
+        <w:lastRenderedPageBreak/>
+        <w:t>sind. Die stärkste Abweichung zeigt sich bei der Klasse WALKING, ist jedoch nicht so ausgeprägt, dass eine wesentliche Verzerrung der Modellbewertung zu erwarten ist.</w:t>
       </w:r>
     </w:p>
     <w:p>
@@ -729,7 +669,6 @@
               <w:rPr>
                 <w:b/>
               </w:rPr>
-              <w:lastRenderedPageBreak/>
               <w:t>Modell</w:t>
             </w:r>
           </w:p>
@@ -774,14 +713,12 @@
                 <w:b/>
               </w:rPr>
             </w:pPr>
-            <w:proofErr w:type="gramStart"/>
             <w:r>
               <w:rPr>
                 <w:b/>
               </w:rPr>
               <w:t>CV Error</w:t>
             </w:r>
-            <w:proofErr w:type="gramEnd"/>
           </w:p>
         </w:tc>
         <w:tc>
@@ -1209,6 +1146,7 @@
     </w:p>
     <w:p>
       <w:r>
+        <w:lastRenderedPageBreak/>
         <w:t xml:space="preserve">Besonders deutlich lohnte sich die Optimierung beim </w:t>
       </w:r>
       <w:proofErr w:type="spellStart"/>
@@ -1295,15 +1233,7 @@
       </w:r>
       <w:proofErr w:type="spellEnd"/>
       <w:r>
-        <w:t xml:space="preserve">, </w:t>
-      </w:r>
-      <w:proofErr w:type="gramStart"/>
-      <w:r>
-        <w:t>Test Error</w:t>
-      </w:r>
-      <w:proofErr w:type="gramEnd"/>
-      <w:r>
-        <w:t xml:space="preserve"> und die </w:t>
+        <w:t xml:space="preserve">, Test Error und die </w:t>
       </w:r>
       <w:proofErr w:type="spellStart"/>
       <w:r>
@@ -1345,11 +1275,7 @@
         <w:jc w:val="left"/>
       </w:pPr>
       <w:r>
-        <w:t xml:space="preserve">Zusätzlich zeigte sich eine auffällige Fehlerhäufung bei Subject 28. Dies deutet darauf hin, dass diese Testperson bei den statischen Aktivitäten ein abweichendes Sensormuster aufweisen </w:t>
-      </w:r>
-      <w:r>
-        <w:lastRenderedPageBreak/>
-        <w:t>könnte. Ein tatsächlicher Daten- oder Label-Fehler kann daraus jedoch nicht sicher abgeleitet werden.</w:t>
+        <w:t>Zusätzlich zeigte sich eine auffällige Fehlerhäufung bei Subject 28. Dies deutet darauf hin, dass diese Testperson bei den statischen Aktivitäten ein abweichendes Sensormuster aufweisen könnte. Ein tatsächlicher Daten- oder Label-Fehler kann daraus jedoch nicht sicher abgeleitet werden.</w:t>
       </w:r>
     </w:p>
     <w:p>
@@ -1471,18 +1397,14 @@
       </w:r>
       <w:proofErr w:type="spellEnd"/>
       <w:r>
-        <w:t xml:space="preserve"> wurde </w:t>
-      </w:r>
-      <w:proofErr w:type="gramStart"/>
-      <w:r>
-        <w:t xml:space="preserve">dabei </w:t>
-      </w:r>
-      <w:r>
-        <w:t xml:space="preserve"> im</w:t>
-      </w:r>
-      <w:proofErr w:type="gramEnd"/>
-      <w:r>
-        <w:t xml:space="preserve"> Verhältnis drei</w:t>
+        <w:t xml:space="preserve"> wurde dabei </w:t>
+      </w:r>
+      <w:r>
+        <w:t xml:space="preserve"> im </w:t>
+      </w:r>
+      <w:r>
+        <w:lastRenderedPageBreak/>
+        <w:t>Verhältnis drei</w:t>
       </w:r>
       <w:r>
         <w:t xml:space="preserve"> zu </w:t>
@@ -1544,13 +1466,8 @@
         <w:t>class_weight</w:t>
       </w:r>
       <w:proofErr w:type="spellEnd"/>
-      <w:proofErr w:type="gramStart"/>
-      <w:r>
-        <w:t>={</w:t>
-      </w:r>
-      <w:proofErr w:type="gramEnd"/>
-      <w:r>
-        <w:t xml:space="preserve">folgende </w:t>
+      <w:r>
+        <w:t xml:space="preserve">={folgende </w:t>
       </w:r>
       <w:proofErr w:type="spellStart"/>
       <w:r>
@@ -1641,7 +1558,6 @@
         <w:t>objective=</w:t>
       </w:r>
       <w:proofErr w:type="spellStart"/>
-      <w:proofErr w:type="gramStart"/>
       <w:r>
         <w:rPr>
           <w:lang w:val="en-US"/>
@@ -1649,7 +1565,6 @@
         <w:t>multi:softprob</w:t>
       </w:r>
       <w:proofErr w:type="spellEnd"/>
-      <w:proofErr w:type="gramEnd"/>
       <w:r>
         <w:rPr>
           <w:lang w:val="en-US"/>
@@ -1838,18 +1753,12 @@
         <w:t>class_weight</w:t>
       </w:r>
       <w:proofErr w:type="spellEnd"/>
-      <w:proofErr w:type="gramStart"/>
-      <w:r>
-        <w:t>={</w:t>
-      </w:r>
-      <w:proofErr w:type="gramEnd"/>
-      <w:r>
-        <w:t xml:space="preserve">Sitting: 1.4, Standing: 1.0}. </w:t>
-      </w:r>
-    </w:p>
-    <w:p>
-      <w:r>
-        <w:lastRenderedPageBreak/>
+      <w:r>
+        <w:t xml:space="preserve">={Sitting: 1.4, Standing: 1.0}. </w:t>
+      </w:r>
+    </w:p>
+    <w:p>
+      <w:r>
         <w:t>Das finale Modell erreichte auf dem Holdout-</w:t>
       </w:r>
       <w:proofErr w:type="spellStart"/>
@@ -1866,15 +1775,7 @@
       </w:r>
       <w:proofErr w:type="spellEnd"/>
       <w:r>
-        <w:t xml:space="preserve"> von 0.9764 und einen </w:t>
-      </w:r>
-      <w:proofErr w:type="gramStart"/>
-      <w:r>
-        <w:t>Test Error</w:t>
-      </w:r>
-      <w:proofErr w:type="gramEnd"/>
-      <w:r>
-        <w:t xml:space="preserve"> von 0.0236. Insgesamt wurden 35 von 1485 Testbeobachtungen falsch klassifiziert. Die verbleibenden Fehler lagen ausschließlich zwischen SITTING und STANDING.</w:t>
+        <w:t xml:space="preserve"> von 0.9764 und einen Test Error von 0.0236. Insgesamt wurden 35 von 1485 Testbeobachtungen falsch klassifiziert. Die verbleibenden Fehler lagen ausschließlich zwischen SITTING und STANDING.</w:t>
       </w:r>
     </w:p>
     <w:p/>
@@ -2034,8 +1935,8 @@
       </w:sdtContent>
     </w:sdt>
     <w:sectPr>
-      <w:footerReference w:type="default" r:id="rId9"/>
-      <w:footerReference w:type="first" r:id="rId10"/>
+      <w:footerReference w:type="default" r:id="rId8"/>
+      <w:footerReference w:type="first" r:id="rId9"/>
       <w:pgSz w:w="12240" w:h="15840"/>
       <w:pgMar w:top="1440" w:right="1440" w:bottom="1440" w:left="1440" w:header="720" w:footer="720" w:gutter="0"/>
       <w:cols w:space="720"/>

</xml_diff>

<commit_message>
Overfitting am Ende von finales modell eingefügt
</commit_message>
<xml_diff>
--- a/Journal template free format.docx
+++ b/Journal template free format.docx
@@ -513,14 +513,17 @@
         <w:t xml:space="preserve">Die Klassenverteilungen im Trainings- und Testdatensatz wurden zusätzlich verglichen. </w:t>
       </w:r>
       <w:r>
-        <w:t>Dort war zu sehen</w:t>
-      </w:r>
-      <w:r>
-        <w:t xml:space="preserve"> dass die relativen Häufigkeiten der sechs Aktivitätsklassen in beiden Datensätzen ähnlich </w:t>
+        <w:t xml:space="preserve">Dort war zu </w:t>
+      </w:r>
+      <w:r>
+        <w:t>erkennen,</w:t>
+      </w:r>
+      <w:r>
+        <w:t xml:space="preserve"> dass die relativen Häufigkeiten der sechs Aktivitätsklassen in beiden Datensätzen </w:t>
       </w:r>
       <w:r>
         <w:lastRenderedPageBreak/>
-        <w:t>sind. Die stärkste Abweichung zeigt sich bei der Klasse WALKING, ist jedoch nicht so ausgeprägt, dass eine wesentliche Verzerrung der Modellbewertung zu erwarten ist.</w:t>
+        <w:t>ähnlich sind. Die stärkste Abweichung zeigt sich bei der Klasse WALKING, ist jedoch nicht so ausgeprägt, dass eine wesentliche Verzerrung der Modellbewertung zu erwarten ist.</w:t>
       </w:r>
     </w:p>
     <w:p>
@@ -713,12 +716,14 @@
                 <w:b/>
               </w:rPr>
             </w:pPr>
+            <w:proofErr w:type="gramStart"/>
             <w:r>
               <w:rPr>
                 <w:b/>
               </w:rPr>
               <w:t>CV Error</w:t>
             </w:r>
+            <w:proofErr w:type="gramEnd"/>
           </w:p>
         </w:tc>
         <w:tc>
@@ -1233,7 +1238,15 @@
       </w:r>
       <w:proofErr w:type="spellEnd"/>
       <w:r>
-        <w:t xml:space="preserve">, Test Error und die </w:t>
+        <w:t xml:space="preserve">, </w:t>
+      </w:r>
+      <w:proofErr w:type="gramStart"/>
+      <w:r>
+        <w:t>Test Error</w:t>
+      </w:r>
+      <w:proofErr w:type="gramEnd"/>
+      <w:r>
+        <w:t xml:space="preserve"> und die </w:t>
       </w:r>
       <w:proofErr w:type="spellStart"/>
       <w:r>
@@ -1397,10 +1410,18 @@
       </w:r>
       <w:proofErr w:type="spellEnd"/>
       <w:r>
-        <w:t xml:space="preserve"> wurde dabei </w:t>
-      </w:r>
-      <w:r>
-        <w:t xml:space="preserve"> im </w:t>
+        <w:t xml:space="preserve"> wurde </w:t>
+      </w:r>
+      <w:proofErr w:type="gramStart"/>
+      <w:r>
+        <w:t xml:space="preserve">dabei </w:t>
+      </w:r>
+      <w:r>
+        <w:t xml:space="preserve"> im</w:t>
+      </w:r>
+      <w:proofErr w:type="gramEnd"/>
+      <w:r>
+        <w:t xml:space="preserve"> </w:t>
       </w:r>
       <w:r>
         <w:lastRenderedPageBreak/>
@@ -1466,8 +1487,13 @@
         <w:t>class_weight</w:t>
       </w:r>
       <w:proofErr w:type="spellEnd"/>
-      <w:r>
-        <w:t xml:space="preserve">={folgende </w:t>
+      <w:proofErr w:type="gramStart"/>
+      <w:r>
+        <w:t>={</w:t>
+      </w:r>
+      <w:proofErr w:type="gramEnd"/>
+      <w:r>
+        <w:t xml:space="preserve">folgende </w:t>
       </w:r>
       <w:proofErr w:type="spellStart"/>
       <w:r>
@@ -1558,6 +1584,7 @@
         <w:t>objective=</w:t>
       </w:r>
       <w:proofErr w:type="spellStart"/>
+      <w:proofErr w:type="gramStart"/>
       <w:r>
         <w:rPr>
           <w:lang w:val="en-US"/>
@@ -1565,6 +1592,7 @@
         <w:t>multi:softprob</w:t>
       </w:r>
       <w:proofErr w:type="spellEnd"/>
+      <w:proofErr w:type="gramEnd"/>
       <w:r>
         <w:rPr>
           <w:lang w:val="en-US"/>
@@ -1753,8 +1781,13 @@
         <w:t>class_weight</w:t>
       </w:r>
       <w:proofErr w:type="spellEnd"/>
-      <w:r>
-        <w:t xml:space="preserve">={Sitting: 1.4, Standing: 1.0}. </w:t>
+      <w:proofErr w:type="gramStart"/>
+      <w:r>
+        <w:t>={</w:t>
+      </w:r>
+      <w:proofErr w:type="gramEnd"/>
+      <w:r>
+        <w:t xml:space="preserve">Sitting: 1.4, Standing: 1.0}. </w:t>
       </w:r>
     </w:p>
     <w:p>
@@ -1775,7 +1808,26 @@
       </w:r>
       <w:proofErr w:type="spellEnd"/>
       <w:r>
-        <w:t xml:space="preserve"> von 0.9764 und einen Test Error von 0.0236. Insgesamt wurden 35 von 1485 Testbeobachtungen falsch klassifiziert. Die verbleibenden Fehler lagen ausschließlich zwischen SITTING und STANDING.</w:t>
+        <w:t xml:space="preserve"> von 0.9764 und einen </w:t>
+      </w:r>
+      <w:proofErr w:type="gramStart"/>
+      <w:r>
+        <w:t>Test Error</w:t>
+      </w:r>
+      <w:proofErr w:type="gramEnd"/>
+      <w:r>
+        <w:t xml:space="preserve"> von 0.0236. Insgesamt wurden 35 von 1485 Testbeobachtungen falsch klassifiziert. Die verbleibenden Fehler lagen ausschließlich zwischen SITTING und STANDING.</w:t>
+      </w:r>
+      <w:r>
+        <w:t xml:space="preserve"> Zusätzlich wurde das finale Modell auf </w:t>
+      </w:r>
+      <w:proofErr w:type="spellStart"/>
+      <w:r>
+        <w:t>Overfitting</w:t>
+      </w:r>
+      <w:proofErr w:type="spellEnd"/>
+      <w:r>
+        <w:t xml:space="preserve"> getestet, was aber verneint werden konnte.</w:t>
       </w:r>
     </w:p>
     <w:p/>

</xml_diff>

<commit_message>
Confusion Matrix als Bild in results
Confusion Matrix als Bild aus csv erstellen lassen und dann in das Paper gleich mit eingearbeitet und Zusammenfassung geschrieben
</commit_message>
<xml_diff>
--- a/Journal template free format.docx
+++ b/Journal template free format.docx
@@ -59,31 +59,7 @@
     </w:p>
     <w:p>
       <w:r>
-        <w:t xml:space="preserve">Die zur Verfügung gestellten Daten basieren auf A Public Domain Dataset </w:t>
-      </w:r>
-      <w:proofErr w:type="spellStart"/>
-      <w:r>
-        <w:t>for</w:t>
-      </w:r>
-      <w:proofErr w:type="spellEnd"/>
-      <w:r>
-        <w:t xml:space="preserve"> Human </w:t>
-      </w:r>
-      <w:proofErr w:type="spellStart"/>
-      <w:r>
-        <w:t>Activity</w:t>
-      </w:r>
-      <w:proofErr w:type="spellEnd"/>
-      <w:r>
-        <w:t xml:space="preserve"> Recognition </w:t>
-      </w:r>
-      <w:proofErr w:type="spellStart"/>
-      <w:r>
-        <w:t>Using</w:t>
-      </w:r>
-      <w:proofErr w:type="spellEnd"/>
-      <w:r>
-        <w:t xml:space="preserve"> Smartphones</w:t>
+        <w:t>Die zur Verfügung gestellten Daten basieren auf A Public Domain Dataset for Human Activity Recognition Using Smartphones</w:t>
       </w:r>
       <w:sdt>
         <w:sdtPr>
@@ -126,15 +102,7 @@
         <w:spacing w:after="0" w:line="312" w:lineRule="auto"/>
       </w:pPr>
       <w:r>
-        <w:t xml:space="preserve">Der Datensatz besteht aus zwei CSV-Dateien. Die Datei measures.csv enthält die gelabelten Daten und wurde für Training, Modellvergleich und Testbewertung verwendet. Die Datei to_predict.csv enthält </w:t>
-      </w:r>
-      <w:proofErr w:type="spellStart"/>
-      <w:r>
-        <w:t>ungelabelte</w:t>
-      </w:r>
-      <w:proofErr w:type="spellEnd"/>
-      <w:r>
-        <w:t xml:space="preserve"> Daten, für die am Ende der Analyse finale Vorhersagen erzeugt werden sollen.</w:t>
+        <w:t>Der Datensatz besteht aus zwei CSV-Dateien. Die Datei measures.csv enthält die gelabelten Daten und wurde für Training, Modellvergleich und Testbewertung verwendet. Die Datei to_predict.csv enthält ungelabelte Daten, für die am Ende der Analyse finale Vorhersagen erzeugt werden sollen.</w:t>
       </w:r>
     </w:p>
     <w:p>
@@ -142,23 +110,7 @@
         <w:spacing w:after="0" w:line="312" w:lineRule="auto"/>
       </w:pPr>
       <w:r>
-        <w:t xml:space="preserve">Die Datei measures.csv umfasst 7352 Beobachtungen mit insgesamt 563 Spalten. Davon sind 561 Spalten Sensorfeatures. Die beiden übrigen Spalten sind </w:t>
-      </w:r>
-      <w:proofErr w:type="spellStart"/>
-      <w:r>
-        <w:t>subject</w:t>
-      </w:r>
-      <w:proofErr w:type="spellEnd"/>
-      <w:r>
-        <w:t xml:space="preserve">, also die Personen-ID, und </w:t>
-      </w:r>
-      <w:proofErr w:type="spellStart"/>
-      <w:r>
-        <w:t>activity</w:t>
-      </w:r>
-      <w:proofErr w:type="spellEnd"/>
-      <w:r>
-        <w:t>, also das Aktivitätslabel. In measures.csv sind 21 der insgesamt 30 Versuchspersonen enthalten.</w:t>
+        <w:t>Die Datei measures.csv umfasst 7352 Beobachtungen mit insgesamt 563 Spalten. Davon sind 561 Spalten Sensorfeatures. Die beiden übrigen Spalten sind subject, also die Personen-ID, und activity, also das Aktivitätslabel. In measures.csv sind 21 der insgesamt 30 Versuchspersonen enthalten.</w:t>
       </w:r>
     </w:p>
     <w:p>
@@ -168,29 +120,8 @@
       <w:r>
         <w:t xml:space="preserve">: </w:t>
       </w:r>
-      <w:proofErr w:type="spellStart"/>
-      <w:r>
-        <w:t>Laying</w:t>
-      </w:r>
-      <w:proofErr w:type="spellEnd"/>
-      <w:r>
-        <w:t xml:space="preserve">, Standing, Sitting, Walking, </w:t>
-      </w:r>
-      <w:proofErr w:type="spellStart"/>
-      <w:r>
-        <w:t>Walking_Upstairs</w:t>
-      </w:r>
-      <w:proofErr w:type="spellEnd"/>
-      <w:r>
-        <w:t xml:space="preserve"> und </w:t>
-      </w:r>
-      <w:proofErr w:type="spellStart"/>
-      <w:r>
-        <w:t>Walking_Downstairs</w:t>
-      </w:r>
-      <w:proofErr w:type="spellEnd"/>
-      <w:r>
-        <w:t>.</w:t>
+      <w:r>
+        <w:t>Laying, Standing, Sitting, Walking, Walking_Upstairs und Walking_Downstairs.</w:t>
       </w:r>
     </w:p>
     <w:p>
@@ -199,23 +130,7 @@
       </w:r>
       <w:r>
         <w:lastRenderedPageBreak/>
-        <w:t xml:space="preserve">Sensormerkmale, die aus den Smartphone-Signalen berechnet wurden. Die Datei to_predict.csv umfasst die übrigen 2947 Beobachtungen. Sie enthält dieselben Sensorfeatures und die Spalte </w:t>
-      </w:r>
-      <w:proofErr w:type="spellStart"/>
-      <w:r>
-        <w:t>subject</w:t>
-      </w:r>
-      <w:proofErr w:type="spellEnd"/>
-      <w:r>
-        <w:t xml:space="preserve">, jedoch keine Zielvariable </w:t>
-      </w:r>
-      <w:proofErr w:type="spellStart"/>
-      <w:r>
-        <w:t>activity</w:t>
-      </w:r>
-      <w:proofErr w:type="spellEnd"/>
-      <w:r>
-        <w:t>.</w:t>
+        <w:t>Sensormerkmale, die aus den Smartphone-Signalen berechnet wurden. Die Datei to_predict.csv umfasst die übrigen 2947 Beobachtungen. Sie enthält dieselben Sensorfeatures und die Spalte subject, jedoch keine Zielvariable activity.</w:t>
       </w:r>
     </w:p>
     <w:p>
@@ -268,23 +183,7 @@
     </w:p>
     <w:p>
       <w:r>
-        <w:t>Für Modelle, die empfindlich auf unterschiedliche Skalierungen reagieren, beispielsweise SVM, k-</w:t>
-      </w:r>
-      <w:proofErr w:type="spellStart"/>
-      <w:r>
-        <w:t>Nearest</w:t>
-      </w:r>
-      <w:proofErr w:type="spellEnd"/>
-      <w:r>
-        <w:t xml:space="preserve"> Neighbors oder </w:t>
-      </w:r>
-      <w:proofErr w:type="spellStart"/>
-      <w:r>
-        <w:t>Logistic</w:t>
-      </w:r>
-      <w:proofErr w:type="spellEnd"/>
-      <w:r>
-        <w:t xml:space="preserve"> Regression, wurde eine Standardisierung innerhalb einer Pipeline verwendet. Dadurch wurde sichergestellt, dass die Skalierung ausschließlich auf den Trainingsdaten gelernt und anschließend auf Validierungs- oder Testdaten angewendet wurde.</w:t>
+        <w:t>Für Modelle, die empfindlich auf unterschiedliche Skalierungen reagieren, beispielsweise SVM, k-Nearest Neighbors oder Logistic Regression, wurde eine Standardisierung innerhalb einer Pipeline verwendet. Dadurch wurde sichergestellt, dass die Skalierung ausschließlich auf den Trainingsdaten gelernt und anschließend auf Validierungs- oder Testdaten angewendet wurde.</w:t>
       </w:r>
     </w:p>
     <w:p>
@@ -302,44 +201,12 @@
     </w:p>
     <w:p>
       <w:r>
-        <w:t>Für die Modellbewertung wurde measures.csv in einen Trainings- und einen Testdatensatz aufgeteilt. Die Aufteilung erfolgte nicht zufällig auf Ebene einzelner Beobachtungen, sondern gruppiert nach Versuchspersonen (</w:t>
-      </w:r>
-      <w:proofErr w:type="spellStart"/>
-      <w:r>
-        <w:t>subject</w:t>
-      </w:r>
-      <w:proofErr w:type="spellEnd"/>
-      <w:r>
-        <w:t>). Dieses Vorgehen ist notwendig, da mehrere Messfenster von derselben Person stammen.</w:t>
-      </w:r>
-    </w:p>
-    <w:p>
-      <w:r>
-        <w:t xml:space="preserve">Die </w:t>
-      </w:r>
-      <w:proofErr w:type="spellStart"/>
-      <w:r>
-        <w:t>Subjects</w:t>
-      </w:r>
-      <w:proofErr w:type="spellEnd"/>
-      <w:r>
-        <w:t xml:space="preserve"> 27, 28, 29 und 30 wurden dem Testdatensatz zugeordnet. Alle übrigen 17 </w:t>
-      </w:r>
-      <w:proofErr w:type="spellStart"/>
-      <w:r>
-        <w:t>Subjects</w:t>
-      </w:r>
-      <w:proofErr w:type="spellEnd"/>
-      <w:r>
-        <w:t xml:space="preserve"> aus measures.csv wurden für den Trainingsdatensatz verwendet. Zusätzlich wurde überprüft, ob die </w:t>
-      </w:r>
-      <w:proofErr w:type="spellStart"/>
-      <w:r>
-        <w:t>Subjects</w:t>
-      </w:r>
-      <w:proofErr w:type="spellEnd"/>
-      <w:r>
-        <w:t xml:space="preserve"> 1, 3, 5 und 6 im Trainingsdatensatz enthalten sind. Der resultierende Trainingsdatensatz umfasst 5867 Beobachtungen, der Testdatensatz 1485. Zwischen de</w:t>
+        <w:t>Für die Modellbewertung wurde measures.csv in einen Trainings- und einen Testdatensatz aufgeteilt. Die Aufteilung erfolgte nicht zufällig auf Ebene einzelner Beobachtungen, sondern gruppiert nach Versuchspersonen (subject). Dieses Vorgehen ist notwendig, da mehrere Messfenster von derselben Person stammen.</w:t>
+      </w:r>
+    </w:p>
+    <w:p>
+      <w:r>
+        <w:t>Die Subjects 27, 28, 29 und 30 wurden dem Testdatensatz zugeordnet. Alle übrigen 17 Subjects aus measures.csv wurden für den Trainingsdatensatz verwendet. Zusätzlich wurde überprüft, ob die Subjects 1, 3, 5 und 6 im Trainingsdatensatz enthalten sind. Der resultierende Trainingsdatensatz umfasst 5867 Beobachtungen, der Testdatensatz 1485. Zwischen de</w:t>
       </w:r>
       <w:r>
         <w:t xml:space="preserve">m </w:t>
@@ -350,23 +217,7 @@
     </w:p>
     <w:p>
       <w:r>
-        <w:t xml:space="preserve">Die Modellwahl erfolgte ausschließlich auf dem Trainingsdatensatz mithilfe einer 5-fold Group Cross-Validation. Dabei wurden die Folds ebenfalls nach </w:t>
-      </w:r>
-      <w:proofErr w:type="spellStart"/>
-      <w:r>
-        <w:t>subject</w:t>
-      </w:r>
-      <w:proofErr w:type="spellEnd"/>
-      <w:r>
-        <w:t xml:space="preserve"> gebildet, sodass alle Beobachtungen einer Person vollständig entweder im Trainings- oder im Validierungsanteil eines Folds lagen. Als zentrale Bewertungsmetrik wurde die mittlere </w:t>
-      </w:r>
-      <w:proofErr w:type="spellStart"/>
-      <w:r>
-        <w:t>Accuracy</w:t>
-      </w:r>
-      <w:proofErr w:type="spellEnd"/>
-      <w:r>
-        <w:t xml:space="preserve"> über die fünf Folds verwendet.</w:t>
+        <w:t>Die Modellwahl erfolgte ausschließlich auf dem Trainingsdatensatz mithilfe einer 5-fold Group Cross-Validation. Dabei wurden die Folds ebenfalls nach subject gebildet, sodass alle Beobachtungen einer Person vollständig entweder im Trainings- oder im Validierungsanteil eines Folds lagen. Als zentrale Bewertungsmetrik wurde die mittlere Accuracy über die fünf Folds verwendet.</w:t>
       </w:r>
     </w:p>
     <w:p>
@@ -563,31 +414,7 @@
     </w:p>
     <w:p>
       <w:r>
-        <w:t>Zur Modellwahl wurden mehrere Klassifikationsmodelle auf dem Trainingsdatensatz verglichen. Die Auswahl geeigneter Modelle erfolgte primär anhand der mittleren Cross-Validation-</w:t>
-      </w:r>
-      <w:proofErr w:type="spellStart"/>
-      <w:r>
-        <w:t>Accuracy</w:t>
-      </w:r>
-      <w:proofErr w:type="spellEnd"/>
-      <w:r>
-        <w:t xml:space="preserve">. Anschließend wurden ausgewählte Modellvarianten auf dem </w:t>
-      </w:r>
-      <w:proofErr w:type="spellStart"/>
-      <w:r>
-        <w:t>subject</w:t>
-      </w:r>
-      <w:proofErr w:type="spellEnd"/>
-      <w:r>
-        <w:t>-basierten Holdout-</w:t>
-      </w:r>
-      <w:proofErr w:type="spellStart"/>
-      <w:r>
-        <w:t>Testset</w:t>
-      </w:r>
-      <w:proofErr w:type="spellEnd"/>
-      <w:r>
-        <w:t xml:space="preserve"> bewertet.</w:t>
+        <w:t>Zur Modellwahl wurden mehrere Klassifikationsmodelle auf dem Trainingsdatensatz verglichen. Die Auswahl geeigneter Modelle erfolgte primär anhand der mittleren Cross-Validation-Accuracy. Anschließend wurden ausgewählte Modellvarianten auf dem subject-basierten Holdout-Testset bewertet.</w:t>
       </w:r>
     </w:p>
     <w:p>
@@ -605,39 +432,7 @@
     </w:p>
     <w:p>
       <w:r>
-        <w:t xml:space="preserve">Für den Modellvergleich wurden verschiedene Klassifikationsverfahren getestet, darunter </w:t>
-      </w:r>
-      <w:proofErr w:type="spellStart"/>
-      <w:r>
-        <w:t>Logistic</w:t>
-      </w:r>
-      <w:proofErr w:type="spellEnd"/>
-      <w:r>
-        <w:t xml:space="preserve"> Regression, k-</w:t>
-      </w:r>
-      <w:proofErr w:type="spellStart"/>
-      <w:r>
-        <w:t>Nearest</w:t>
-      </w:r>
-      <w:proofErr w:type="spellEnd"/>
-      <w:r>
-        <w:t xml:space="preserve"> Neighbors, Random Forest, </w:t>
-      </w:r>
-      <w:proofErr w:type="spellStart"/>
-      <w:r>
-        <w:t>XGBClassifier</w:t>
-      </w:r>
-      <w:proofErr w:type="spellEnd"/>
-      <w:r>
-        <w:t xml:space="preserve"> und RBF-SVM. Die Bewertung erfolgte mit 5-fold Group Cross-Validation auf dem Trainingsdatensatz. Dabei wurde nach </w:t>
-      </w:r>
-      <w:proofErr w:type="spellStart"/>
-      <w:r>
-        <w:t>subject</w:t>
-      </w:r>
-      <w:proofErr w:type="spellEnd"/>
-      <w:r>
-        <w:t xml:space="preserve"> gruppiert, sodass Beobachtungen derselben Person nicht gleichzeitig in Trainings- und Validierungsdaten eines Folds vorkamen.</w:t>
+        <w:t>Für den Modellvergleich wurden verschiedene Klassifikationsverfahren getestet, darunter Logistic Regression, k-Nearest Neighbors, Random Forest, XGBClassifier und RBF-SVM. Die Bewertung erfolgte mit 5-fold Group Cross-Validation auf dem Trainingsdatensatz. Dabei wurde nach subject gruppiert, sodass Beobachtungen derselben Person nicht gleichzeitig in Trainings- und Validierungsdaten eines Folds vorkamen.</w:t>
       </w:r>
     </w:p>
     <w:tbl>
@@ -692,16 +487,8 @@
               <w:rPr>
                 <w:b/>
               </w:rPr>
-              <w:t xml:space="preserve">CV </w:t>
+              <w:t>CV Accuracy</w:t>
             </w:r>
-            <w:proofErr w:type="spellStart"/>
-            <w:r>
-              <w:rPr>
-                <w:b/>
-              </w:rPr>
-              <w:t>Accuracy</w:t>
-            </w:r>
-            <w:proofErr w:type="spellEnd"/>
           </w:p>
         </w:tc>
         <w:tc>
@@ -716,14 +503,12 @@
                 <w:b/>
               </w:rPr>
             </w:pPr>
-            <w:proofErr w:type="gramStart"/>
             <w:r>
               <w:rPr>
                 <w:b/>
               </w:rPr>
               <w:t>CV Error</w:t>
             </w:r>
-            <w:proofErr w:type="gramEnd"/>
           </w:p>
         </w:tc>
         <w:tc>
@@ -816,13 +601,8 @@
             <w:pPr>
               <w:spacing w:after="0" w:line="240" w:lineRule="auto"/>
             </w:pPr>
-            <w:proofErr w:type="spellStart"/>
             <w:r>
-              <w:t>Logistic</w:t>
-            </w:r>
-            <w:proofErr w:type="spellEnd"/>
-            <w:r>
-              <w:t xml:space="preserve"> Regression</w:t>
+              <w:t>Logistic Regression</w:t>
             </w:r>
           </w:p>
         </w:tc>
@@ -878,11 +658,9 @@
             <w:pPr>
               <w:spacing w:after="0" w:line="240" w:lineRule="auto"/>
             </w:pPr>
-            <w:proofErr w:type="spellStart"/>
             <w:r>
               <w:t>XGBClassifier</w:t>
             </w:r>
-            <w:proofErr w:type="spellEnd"/>
           </w:p>
         </w:tc>
         <w:tc>
@@ -995,15 +773,7 @@
               <w:spacing w:after="0" w:line="240" w:lineRule="auto"/>
             </w:pPr>
             <w:r>
-              <w:t>k-</w:t>
-            </w:r>
-            <w:proofErr w:type="spellStart"/>
-            <w:r>
-              <w:t>Nearest</w:t>
-            </w:r>
-            <w:proofErr w:type="spellEnd"/>
-            <w:r>
-              <w:t xml:space="preserve"> Neighbors</w:t>
+              <w:t>k-Nearest Neighbors</w:t>
             </w:r>
           </w:p>
         </w:tc>
@@ -1080,39 +850,7 @@
     </w:p>
     <w:p>
       <w:r>
-        <w:t>Die RBF-SVM erzielte mit einer mittleren Cross-Validation-</w:t>
-      </w:r>
-      <w:proofErr w:type="spellStart"/>
-      <w:r>
-        <w:t>Accuracy</w:t>
-      </w:r>
-      <w:proofErr w:type="spellEnd"/>
-      <w:r>
-        <w:t xml:space="preserve"> von 0.9248 das beste Ergebnis im Modellvergleich. </w:t>
-      </w:r>
-      <w:proofErr w:type="spellStart"/>
-      <w:r>
-        <w:t>Logistic</w:t>
-      </w:r>
-      <w:proofErr w:type="spellEnd"/>
-      <w:r>
-        <w:t xml:space="preserve"> Regression und </w:t>
-      </w:r>
-      <w:proofErr w:type="spellStart"/>
-      <w:r>
-        <w:t>XGBClassifier</w:t>
-      </w:r>
-      <w:proofErr w:type="spellEnd"/>
-      <w:r>
-        <w:t xml:space="preserve"> lagen mit 0.9160 bzw. 0.9112 ebenfalls auf hohem Niveau. Der </w:t>
-      </w:r>
-      <w:proofErr w:type="spellStart"/>
-      <w:r>
-        <w:t>XGBClassifier</w:t>
-      </w:r>
-      <w:proofErr w:type="spellEnd"/>
-      <w:r>
-        <w:t xml:space="preserve"> hatte eine deutlich höhere mittlere Fit-Zeit als die übrigen Modelle, wurde jedoch aufgrund seiner guten Testleistung und Kombinierbarkeit mit anderen Modellen weiter untersucht.</w:t>
+        <w:t>Die RBF-SVM erzielte mit einer mittleren Cross-Validation-Accuracy von 0.9248 das beste Ergebnis im Modellvergleich. Logistic Regression und XGBClassifier lagen mit 0.9160 bzw. 0.9112 ebenfalls auf hohem Niveau. Der XGBClassifier hatte eine deutlich höhere mittlere Fit-Zeit als die übrigen Modelle, wurde jedoch aufgrund seiner guten Testleistung und Kombinierbarkeit mit anderen Modellen weiter untersucht.</w:t>
       </w:r>
     </w:p>
     <w:p>
@@ -1130,69 +868,13 @@
     </w:p>
     <w:p>
       <w:r>
-        <w:t xml:space="preserve">Hyperparameter wurden vor allem bei den Modellen weiter untersucht, die im ersten Modellvergleich eine gute Leistung zeigten oder für die Fehlerstruktur besonders relevant waren. Die Auswahl der Hyperparameter erfolgte dabei auf Basis der Cross-Validation-Ergebnisse auf dem Trainingsdatensatz. Die Test </w:t>
-      </w:r>
-      <w:proofErr w:type="spellStart"/>
-      <w:r>
-        <w:t>Accuracy</w:t>
-      </w:r>
-      <w:proofErr w:type="spellEnd"/>
-      <w:r>
-        <w:t xml:space="preserve"> des Holdout-</w:t>
-      </w:r>
-      <w:proofErr w:type="spellStart"/>
-      <w:r>
-        <w:t>Testsets</w:t>
-      </w:r>
-      <w:proofErr w:type="spellEnd"/>
-      <w:r>
-        <w:t xml:space="preserve"> wurde nicht zur Auswahl der Hyperparameter verwendet, sondern erst anschließend zur finalen Bewertung der ausgewählten Modellvarianten berechnet.</w:t>
+        <w:t>Hyperparameter wurden vor allem bei den Modellen weiter untersucht, die im ersten Modellvergleich eine gute Leistung zeigten oder für die Fehlerstruktur besonders relevant waren. Die Auswahl der Hyperparameter erfolgte dabei auf Basis der Cross-Validation-Ergebnisse auf dem Trainingsdatensatz. Die Test Accuracy des Holdout-Testsets wurde nicht zur Auswahl der Hyperparameter verwendet, sondern erst anschließend zur finalen Bewertung der ausgewählten Modellvarianten berechnet.</w:t>
       </w:r>
     </w:p>
     <w:p>
       <w:r>
         <w:lastRenderedPageBreak/>
-        <w:t xml:space="preserve">Besonders deutlich lohnte sich die Optimierung beim </w:t>
-      </w:r>
-      <w:proofErr w:type="spellStart"/>
-      <w:r>
-        <w:t>XGBClassifier</w:t>
-      </w:r>
-      <w:proofErr w:type="spellEnd"/>
-      <w:r>
-        <w:t xml:space="preserve">. Durch die Anpassung von Baumanzahl, Baumtiefe, </w:t>
-      </w:r>
-      <w:proofErr w:type="spellStart"/>
-      <w:r>
-        <w:t>Lernrate</w:t>
-      </w:r>
-      <w:proofErr w:type="spellEnd"/>
-      <w:r>
-        <w:t xml:space="preserve">, Subsampling und Regularisierung verbesserte sich die Modellleistung im Vergleich zur vorherigen Einstellung. Auch bei der RBF-SVM führte die Anpassung der Parameter C und </w:t>
-      </w:r>
-      <w:proofErr w:type="spellStart"/>
-      <w:r>
-        <w:t>gamma</w:t>
-      </w:r>
-      <w:proofErr w:type="spellEnd"/>
-      <w:r>
-        <w:t xml:space="preserve"> zu einer leichten Verbesserung. Random Forest und k-</w:t>
-      </w:r>
-      <w:proofErr w:type="spellStart"/>
-      <w:r>
-        <w:t>Nearest</w:t>
-      </w:r>
-      <w:proofErr w:type="spellEnd"/>
-      <w:r>
-        <w:t xml:space="preserve"> Neighbors wurden ebenfalls mit verschiedenen Parametereinstellungen getestet, erreichten jedoch keine bessere Cross-Validation-Leistung als </w:t>
-      </w:r>
-      <w:proofErr w:type="spellStart"/>
-      <w:r>
-        <w:t>XGBClassifier</w:t>
-      </w:r>
-      <w:proofErr w:type="spellEnd"/>
-      <w:r>
-        <w:t xml:space="preserve"> oder RBF-SVM.</w:t>
+        <w:t>Besonders deutlich lohnte sich die Optimierung beim XGBClassifier. Durch die Anpassung von Baumanzahl, Baumtiefe, Lernrate, Subsampling und Regularisierung verbesserte sich die Modellleistung im Vergleich zur vorherigen Einstellung. Auch bei der RBF-SVM führte die Anpassung der Parameter C und gamma zu einer leichten Verbesserung. Random Forest und k-Nearest Neighbors wurden ebenfalls mit verschiedenen Parametereinstellungen getestet, erreichten jedoch keine bessere Cross-Validation-Leistung als XGBClassifier oder RBF-SVM.</w:t>
       </w:r>
     </w:p>
     <w:p>
@@ -1214,63 +896,7 @@
         <w:jc w:val="left"/>
       </w:pPr>
       <w:r>
-        <w:t xml:space="preserve">Nach der Modellwahl wurden ausgewählte Modelle auf dem </w:t>
-      </w:r>
-      <w:proofErr w:type="spellStart"/>
-      <w:r>
-        <w:t>subject</w:t>
-      </w:r>
-      <w:proofErr w:type="spellEnd"/>
-      <w:r>
-        <w:t>-basierten Holdout-</w:t>
-      </w:r>
-      <w:proofErr w:type="spellStart"/>
-      <w:r>
-        <w:t>Testset</w:t>
-      </w:r>
-      <w:proofErr w:type="spellEnd"/>
-      <w:r>
-        <w:t xml:space="preserve"> bewertet. Dafür wurden Test </w:t>
-      </w:r>
-      <w:proofErr w:type="spellStart"/>
-      <w:r>
-        <w:t>Accuracy</w:t>
-      </w:r>
-      <w:proofErr w:type="spellEnd"/>
-      <w:r>
-        <w:t xml:space="preserve">, </w:t>
-      </w:r>
-      <w:proofErr w:type="gramStart"/>
-      <w:r>
-        <w:t>Test Error</w:t>
-      </w:r>
-      <w:proofErr w:type="gramEnd"/>
-      <w:r>
-        <w:t xml:space="preserve"> und die </w:t>
-      </w:r>
-      <w:proofErr w:type="spellStart"/>
-      <w:r>
-        <w:t>Confusion</w:t>
-      </w:r>
-      <w:proofErr w:type="spellEnd"/>
-      <w:r>
-        <w:t xml:space="preserve"> Matrix berechnet. Die Test </w:t>
-      </w:r>
-      <w:proofErr w:type="spellStart"/>
-      <w:r>
-        <w:t>Accuracy</w:t>
-      </w:r>
-      <w:proofErr w:type="spellEnd"/>
-      <w:r>
-        <w:t xml:space="preserve"> wurde nicht als primäre Metrik der Modellwahl verwendet, sondern diente zur finalen Bewertung der Generalisierung auf unbekannte </w:t>
-      </w:r>
-      <w:proofErr w:type="spellStart"/>
-      <w:r>
-        <w:t>Subjects</w:t>
-      </w:r>
-      <w:proofErr w:type="spellEnd"/>
-      <w:r>
-        <w:t>.</w:t>
+        <w:t>Nach der Modellwahl wurden ausgewählte Modelle auf dem subject-basierten Holdout-Testset bewertet. Dafür wurden Test Accuracy, Test Error und die Confusion Matrix berechnet. Die Test Accuracy wurde nicht als primäre Metrik der Modellwahl verwendet, sondern diente zur finalen Bewertung der Generalisierung auf unbekannte Subjects.</w:t>
       </w:r>
     </w:p>
     <w:p>
@@ -1312,52 +938,12 @@
         <w:t xml:space="preserve">, </w:t>
       </w:r>
       <w:r>
-        <w:t xml:space="preserve">zusätzlich wurde mit </w:t>
-      </w:r>
-      <w:proofErr w:type="spellStart"/>
-      <w:r>
-        <w:t>SelectKBest</w:t>
-      </w:r>
-      <w:proofErr w:type="spellEnd"/>
-      <w:r>
-        <w:t xml:space="preserve"> eine Feature </w:t>
-      </w:r>
-      <w:proofErr w:type="spellStart"/>
-      <w:r>
-        <w:t>Selection</w:t>
-      </w:r>
-      <w:proofErr w:type="spellEnd"/>
-      <w:r>
-        <w:t xml:space="preserve"> durchgeführt, um nur die für diese binäre Trennung relevantesten Merkmale zu verwenden.</w:t>
-      </w:r>
-    </w:p>
-    <w:p>
-      <w:r>
-        <w:t xml:space="preserve">Verschiedene Spezialmodelle wurden getestet, darunter RBF-SVM, </w:t>
-      </w:r>
-      <w:proofErr w:type="spellStart"/>
-      <w:r>
-        <w:t>Logistic</w:t>
-      </w:r>
-      <w:proofErr w:type="spellEnd"/>
-      <w:r>
-        <w:t xml:space="preserve"> Regression, </w:t>
-      </w:r>
-      <w:proofErr w:type="spellStart"/>
-      <w:r>
-        <w:t>LinearSVC</w:t>
-      </w:r>
-      <w:proofErr w:type="spellEnd"/>
-      <w:r>
-        <w:t xml:space="preserve">, Random Forest, </w:t>
-      </w:r>
-      <w:proofErr w:type="spellStart"/>
-      <w:r>
-        <w:t>XGBoost</w:t>
-      </w:r>
-      <w:proofErr w:type="spellEnd"/>
-      <w:r>
-        <w:t xml:space="preserve"> und Polynomial-SVM. Das beste Spezialmodell verwendete 150 ausgewählte Features und eine Polynomial-SVM. Zusätzlich wurde die Entscheidungsschwelle des Spezialmodells angepasst, um die verbleibenden Verwechslungen zwischen SITTING und STANDING weiter zu reduzieren.</w:t>
+        <w:t>zusätzlich wurde mit SelectKBest eine Feature Selection durchgeführt, um nur die für diese binäre Trennung relevantesten Merkmale zu verwenden.</w:t>
+      </w:r>
+    </w:p>
+    <w:p>
+      <w:r>
+        <w:t>Verschiedene Spezialmodelle wurden getestet, darunter RBF-SVM, Logistic Regression, LinearSVC, Random Forest, XGBoost und Polynomial-SVM. Das beste Spezialmodell verwendete 150 ausgewählte Features und eine Polynomial-SVM. Zusätzlich wurde die Entscheidungsschwelle des Spezialmodells angepasst, um die verbleibenden Verwechslungen zwischen SITTING und STANDING weiter zu reduzieren.</w:t>
       </w:r>
     </w:p>
     <w:p>
@@ -1394,34 +980,10 @@
         <w:t>ist</w:t>
       </w:r>
       <w:r>
-        <w:t xml:space="preserve"> ein zweistufiges Modell. In der ersten Stufe wurde ein Soft-Voting-Ensemble aus Polynomial-SVM und </w:t>
-      </w:r>
-      <w:proofErr w:type="spellStart"/>
-      <w:r>
-        <w:t>XGBClassifier</w:t>
-      </w:r>
-      <w:proofErr w:type="spellEnd"/>
-      <w:r>
-        <w:t xml:space="preserve"> verwendet. Der </w:t>
-      </w:r>
-      <w:proofErr w:type="spellStart"/>
-      <w:r>
-        <w:t>XGBClassifier</w:t>
-      </w:r>
-      <w:proofErr w:type="spellEnd"/>
-      <w:r>
-        <w:t xml:space="preserve"> wurde </w:t>
-      </w:r>
-      <w:proofErr w:type="gramStart"/>
-      <w:r>
-        <w:t xml:space="preserve">dabei </w:t>
-      </w:r>
-      <w:r>
-        <w:t xml:space="preserve"> im</w:t>
-      </w:r>
-      <w:proofErr w:type="gramEnd"/>
-      <w:r>
-        <w:t xml:space="preserve"> </w:t>
+        <w:t xml:space="preserve"> ein zweistufiges Modell. In der ersten Stufe wurde ein Soft-Voting-Ensemble aus Polynomial-SVM und XGBClassifier verwendet. Der XGBClassifier wurde dabei </w:t>
+      </w:r>
+      <w:r>
+        <w:t xml:space="preserve"> im </w:t>
       </w:r>
       <w:r>
         <w:lastRenderedPageBreak/>
@@ -1456,232 +1018,22 @@
         <w:t xml:space="preserve">Hierbei haben wir für Poly-SVM </w:t>
       </w:r>
       <w:r>
-        <w:t xml:space="preserve">zuerst den </w:t>
-      </w:r>
-      <w:proofErr w:type="spellStart"/>
-      <w:r>
-        <w:t>StandardScaler</w:t>
-      </w:r>
-      <w:proofErr w:type="spellEnd"/>
-      <w:r>
-        <w:t xml:space="preserve"> genutzt und dann C=1e5, </w:t>
-      </w:r>
-      <w:proofErr w:type="spellStart"/>
-      <w:r>
-        <w:t>gamma</w:t>
-      </w:r>
-      <w:proofErr w:type="spellEnd"/>
-      <w:r>
-        <w:t xml:space="preserve">=0.001, </w:t>
-      </w:r>
-      <w:proofErr w:type="spellStart"/>
-      <w:r>
-        <w:t>degree</w:t>
-      </w:r>
-      <w:proofErr w:type="spellEnd"/>
-      <w:r>
-        <w:t xml:space="preserve">=6, coef0=2.0, </w:t>
-      </w:r>
-      <w:proofErr w:type="spellStart"/>
-      <w:r>
-        <w:t>class_weight</w:t>
-      </w:r>
-      <w:proofErr w:type="spellEnd"/>
-      <w:proofErr w:type="gramStart"/>
-      <w:r>
-        <w:t>={</w:t>
-      </w:r>
-      <w:proofErr w:type="gramEnd"/>
-      <w:r>
-        <w:t xml:space="preserve">folgende </w:t>
-      </w:r>
-      <w:proofErr w:type="spellStart"/>
-      <w:r>
-        <w:t>Weights</w:t>
-      </w:r>
-      <w:proofErr w:type="spellEnd"/>
-      <w:r>
-        <w:t xml:space="preserve">} und </w:t>
-      </w:r>
-      <w:proofErr w:type="spellStart"/>
-      <w:r>
-        <w:t>probability</w:t>
-      </w:r>
-      <w:proofErr w:type="spellEnd"/>
-      <w:r>
-        <w:t xml:space="preserve">=True gesetzt. Die hier </w:t>
-      </w:r>
-      <w:proofErr w:type="spellStart"/>
-      <w:r>
-        <w:t>gesnutzen</w:t>
-      </w:r>
-      <w:proofErr w:type="spellEnd"/>
-      <w:r>
-        <w:t xml:space="preserve"> gewichte sind </w:t>
-      </w:r>
-      <w:proofErr w:type="spellStart"/>
-      <w:r>
-        <w:t>Laying</w:t>
-      </w:r>
-      <w:proofErr w:type="spellEnd"/>
-      <w:r>
-        <w:t xml:space="preserve">: 1.0, Sitting: 2.0, Standing: 1.5, Walking: 1.2, </w:t>
-      </w:r>
-      <w:proofErr w:type="spellStart"/>
-      <w:r>
-        <w:t>Walking_Downstairs</w:t>
-      </w:r>
-      <w:proofErr w:type="spellEnd"/>
-      <w:r>
-        <w:t xml:space="preserve">: 3.0 und </w:t>
-      </w:r>
-      <w:proofErr w:type="spellStart"/>
-      <w:r>
-        <w:t>Walking_Upstairs</w:t>
-      </w:r>
-      <w:proofErr w:type="spellEnd"/>
-      <w:r>
-        <w:t xml:space="preserve">: 2.0. </w:t>
+        <w:t xml:space="preserve">zuerst den StandardScaler genutzt und dann C=1e5, gamma=0.001, degree=6, coef0=2.0, class_weight={folgende Weights} und probability=True gesetzt. Die hier gesnutzen gewichte sind Laying: 1.0, Sitting: 2.0, Standing: 1.5, Walking: 1.2, </w:t>
+      </w:r>
+      <w:r>
+        <w:t xml:space="preserve">Walking_Downstairs: 3.0 und Walking_Upstairs: 2.0. </w:t>
       </w:r>
       <w:r>
         <w:rPr>
           <w:lang w:val="en-US"/>
         </w:rPr>
-        <w:t xml:space="preserve">Für den </w:t>
-      </w:r>
-      <w:proofErr w:type="spellStart"/>
+        <w:t xml:space="preserve">Für den XGBClassifier wurden die Parameter </w:t>
+      </w:r>
       <w:r>
         <w:rPr>
           <w:lang w:val="en-US"/>
         </w:rPr>
-        <w:t>XGBClassifier</w:t>
-      </w:r>
-      <w:proofErr w:type="spellEnd"/>
-      <w:r>
-        <w:rPr>
-          <w:lang w:val="en-US"/>
-        </w:rPr>
-        <w:t xml:space="preserve"> </w:t>
-      </w:r>
-      <w:proofErr w:type="spellStart"/>
-      <w:r>
-        <w:rPr>
-          <w:lang w:val="en-US"/>
-        </w:rPr>
-        <w:t>wurden</w:t>
-      </w:r>
-      <w:proofErr w:type="spellEnd"/>
-      <w:r>
-        <w:rPr>
-          <w:lang w:val="en-US"/>
-        </w:rPr>
-        <w:t xml:space="preserve"> die Parameter </w:t>
-      </w:r>
-      <w:r>
-        <w:rPr>
-          <w:lang w:val="en-US"/>
-        </w:rPr>
-        <w:t>objective=</w:t>
-      </w:r>
-      <w:proofErr w:type="spellStart"/>
-      <w:proofErr w:type="gramStart"/>
-      <w:r>
-        <w:rPr>
-          <w:lang w:val="en-US"/>
-        </w:rPr>
-        <w:t>multi:softprob</w:t>
-      </w:r>
-      <w:proofErr w:type="spellEnd"/>
-      <w:proofErr w:type="gramEnd"/>
-      <w:r>
-        <w:rPr>
-          <w:lang w:val="en-US"/>
-        </w:rPr>
-        <w:t xml:space="preserve">, </w:t>
-      </w:r>
-      <w:proofErr w:type="spellStart"/>
-      <w:r>
-        <w:rPr>
-          <w:lang w:val="en-US"/>
-        </w:rPr>
-        <w:t>n_estimators</w:t>
-      </w:r>
-      <w:proofErr w:type="spellEnd"/>
-      <w:r>
-        <w:rPr>
-          <w:lang w:val="en-US"/>
-        </w:rPr>
-        <w:t xml:space="preserve">=300, </w:t>
-      </w:r>
-      <w:proofErr w:type="spellStart"/>
-      <w:r>
-        <w:rPr>
-          <w:lang w:val="en-US"/>
-        </w:rPr>
-        <w:t>max_depth</w:t>
-      </w:r>
-      <w:proofErr w:type="spellEnd"/>
-      <w:r>
-        <w:rPr>
-          <w:lang w:val="en-US"/>
-        </w:rPr>
-        <w:t xml:space="preserve">=2, </w:t>
-      </w:r>
-      <w:proofErr w:type="spellStart"/>
-      <w:r>
-        <w:rPr>
-          <w:lang w:val="en-US"/>
-        </w:rPr>
-        <w:t>learning_rate</w:t>
-      </w:r>
-      <w:proofErr w:type="spellEnd"/>
-      <w:r>
-        <w:rPr>
-          <w:lang w:val="en-US"/>
-        </w:rPr>
-        <w:t xml:space="preserve">=0.1, subsample=0.8, </w:t>
-      </w:r>
-      <w:proofErr w:type="spellStart"/>
-      <w:r>
-        <w:rPr>
-          <w:lang w:val="en-US"/>
-        </w:rPr>
-        <w:t>colsample_bytree</w:t>
-      </w:r>
-      <w:proofErr w:type="spellEnd"/>
-      <w:r>
-        <w:rPr>
-          <w:lang w:val="en-US"/>
-        </w:rPr>
-        <w:t xml:space="preserve">=1.0, </w:t>
-      </w:r>
-      <w:proofErr w:type="spellStart"/>
-      <w:r>
-        <w:rPr>
-          <w:lang w:val="en-US"/>
-        </w:rPr>
-        <w:t>min_child_weight</w:t>
-      </w:r>
-      <w:proofErr w:type="spellEnd"/>
-      <w:r>
-        <w:rPr>
-          <w:lang w:val="en-US"/>
-        </w:rPr>
-        <w:t xml:space="preserve">=3, </w:t>
-      </w:r>
-      <w:proofErr w:type="spellStart"/>
-      <w:r>
-        <w:rPr>
-          <w:lang w:val="en-US"/>
-        </w:rPr>
-        <w:t>reg_lambda</w:t>
-      </w:r>
-      <w:proofErr w:type="spellEnd"/>
-      <w:r>
-        <w:rPr>
-          <w:lang w:val="en-US"/>
-        </w:rPr>
-        <w:t>=5</w:t>
+        <w:t>objective=multi:softprob, n_estimators=300, max_depth=2, learning_rate=0.1, subsample=0.8, colsample_bytree=1.0, min_child_weight=3, reg_lambda=5</w:t>
       </w:r>
       <w:r>
         <w:rPr>
@@ -1689,19 +1041,11 @@
         </w:rPr>
         <w:t xml:space="preserve"> und </w:t>
       </w:r>
-      <w:proofErr w:type="spellStart"/>
       <w:r>
         <w:rPr>
           <w:lang w:val="en-US"/>
         </w:rPr>
-        <w:t>reg_alpha</w:t>
-      </w:r>
-      <w:proofErr w:type="spellEnd"/>
-      <w:r>
-        <w:rPr>
-          <w:lang w:val="en-US"/>
-        </w:rPr>
-        <w:t>=0.1</w:t>
+        <w:t>reg_alpha=0.1</w:t>
       </w:r>
       <w:r>
         <w:rPr>
@@ -1717,119 +1061,107 @@
     </w:p>
     <w:p>
       <w:r>
-        <w:t xml:space="preserve">In dieser Stufe wurde dann der </w:t>
-      </w:r>
-      <w:proofErr w:type="spellStart"/>
-      <w:r>
-        <w:t>StandardScaler</w:t>
-      </w:r>
-      <w:proofErr w:type="spellEnd"/>
-      <w:r>
-        <w:t xml:space="preserve"> genutzt, dann </w:t>
-      </w:r>
-      <w:proofErr w:type="spellStart"/>
-      <w:r>
-        <w:t>SelectKBest</w:t>
-      </w:r>
-      <w:proofErr w:type="spellEnd"/>
-      <w:r>
-        <w:t xml:space="preserve"> mit </w:t>
-      </w:r>
-      <w:proofErr w:type="spellStart"/>
-      <w:r>
-        <w:t>score_func</w:t>
-      </w:r>
-      <w:proofErr w:type="spellEnd"/>
-      <w:r>
-        <w:t>=</w:t>
-      </w:r>
-      <w:proofErr w:type="spellStart"/>
-      <w:r>
-        <w:t>f_classif</w:t>
-      </w:r>
-      <w:proofErr w:type="spellEnd"/>
-      <w:r>
-        <w:t>, k=150</w:t>
+        <w:t xml:space="preserve">In dieser Stufe wurde dann der StandardScaler genutzt, dann SelectKBest mit </w:t>
+      </w:r>
+      <w:r>
+        <w:t>score_func=f_classif, k=150</w:t>
       </w:r>
       <w:r>
         <w:t xml:space="preserve"> und als Parameter für Poly-SVM </w:t>
       </w:r>
       <w:r>
-        <w:t xml:space="preserve">C=10, </w:t>
-      </w:r>
-      <w:proofErr w:type="spellStart"/>
-      <w:r>
-        <w:t>gamma</w:t>
-      </w:r>
-      <w:proofErr w:type="spellEnd"/>
-      <w:r>
-        <w:t xml:space="preserve">=0.0003, </w:t>
-      </w:r>
-      <w:proofErr w:type="spellStart"/>
-      <w:r>
-        <w:t>degree</w:t>
-      </w:r>
-      <w:proofErr w:type="spellEnd"/>
-      <w:r>
-        <w:t>=3, coef0=2.0</w:t>
-      </w:r>
-      <w:r>
-        <w:t xml:space="preserve"> und </w:t>
-      </w:r>
-      <w:proofErr w:type="spellStart"/>
-      <w:r>
-        <w:t>class_weight</w:t>
-      </w:r>
-      <w:proofErr w:type="spellEnd"/>
-      <w:proofErr w:type="gramStart"/>
-      <w:r>
-        <w:t>={</w:t>
-      </w:r>
-      <w:proofErr w:type="gramEnd"/>
-      <w:r>
-        <w:t xml:space="preserve">Sitting: 1.4, Standing: 1.0}. </w:t>
-      </w:r>
-    </w:p>
-    <w:p>
-      <w:r>
-        <w:t>Das finale Modell erreichte auf dem Holdout-</w:t>
-      </w:r>
-      <w:proofErr w:type="spellStart"/>
-      <w:r>
-        <w:t>Testset</w:t>
-      </w:r>
-      <w:proofErr w:type="spellEnd"/>
-      <w:r>
-        <w:t xml:space="preserve"> eine Test </w:t>
-      </w:r>
-      <w:proofErr w:type="spellStart"/>
-      <w:r>
-        <w:t>Accuracy</w:t>
-      </w:r>
-      <w:proofErr w:type="spellEnd"/>
-      <w:r>
-        <w:t xml:space="preserve"> von 0.9764 und einen </w:t>
-      </w:r>
-      <w:proofErr w:type="gramStart"/>
-      <w:r>
-        <w:t>Test Error</w:t>
-      </w:r>
-      <w:proofErr w:type="gramEnd"/>
-      <w:r>
-        <w:t xml:space="preserve"> von 0.0236. Insgesamt wurden 35 von 1485 Testbeobachtungen falsch klassifiziert. Die verbleibenden Fehler lagen ausschließlich zwischen SITTING und STANDING.</w:t>
-      </w:r>
-      <w:r>
-        <w:t xml:space="preserve"> Zusätzlich wurde das finale Modell auf </w:t>
-      </w:r>
-      <w:proofErr w:type="spellStart"/>
-      <w:r>
-        <w:t>Overfitting</w:t>
-      </w:r>
-      <w:proofErr w:type="spellEnd"/>
-      <w:r>
-        <w:t xml:space="preserve"> getestet, was aber verneint werden konnte.</w:t>
-      </w:r>
-    </w:p>
+        <w:t>C=10, gamma=0.0003, degree=3, coef0=2.0</w:t>
+      </w:r>
+      <w:r>
+        <w:t xml:space="preserve"> und class_weight={Sitting: 1.4, Standing: 1.0}. </w:t>
+      </w:r>
+    </w:p>
+    <w:p>
+      <w:r>
+        <w:t>Das finale Modell erreichte auf dem Holdout-Testset eine Test Accuracy von 0.9764 und einen Test Error von 0.0236. Insgesamt wurden 35 von 1485 Testbeobachtungen falsch klassifiziert. Die verbleibenden Fehler lagen ausschließlich zwischen SITTING und STANDING.</w:t>
+      </w:r>
+      <w:r>
+        <w:t xml:space="preserve"> Zusätzlich wurde das finale Modell auf Overfitting getestet, was aber verneint werden konnte.</w:t>
+      </w:r>
+    </w:p>
+    <w:p/>
+    <w:p>
+      <w:pPr>
+        <w:pStyle w:val="berschrift2"/>
+      </w:pPr>
+      <w:r>
+        <w:drawing>
+          <wp:anchor distT="0" distB="0" distL="114300" distR="114300" simplePos="0" relativeHeight="251661312" behindDoc="0" locked="0" layoutInCell="1" allowOverlap="1" wp14:anchorId="7A1C1B21" wp14:editId="4C14B99C">
+            <wp:simplePos x="0" y="0"/>
+            <wp:positionH relativeFrom="column">
+              <wp:posOffset>0</wp:posOffset>
+            </wp:positionH>
+            <wp:positionV relativeFrom="paragraph">
+              <wp:posOffset>465455</wp:posOffset>
+            </wp:positionV>
+            <wp:extent cx="5943600" cy="2624455"/>
+            <wp:effectExtent l="0" t="0" r="0" b="4445"/>
+            <wp:wrapSquare wrapText="bothSides"/>
+            <wp:docPr id="1759439097" name="Grafik 1"/>
+            <wp:cNvGraphicFramePr>
+              <a:graphicFrameLocks xmlns:a="http://schemas.openxmlformats.org/drawingml/2006/main" noChangeAspect="1"/>
+            </wp:cNvGraphicFramePr>
+            <a:graphic xmlns:a="http://schemas.openxmlformats.org/drawingml/2006/main">
+              <a:graphicData uri="http://schemas.openxmlformats.org/drawingml/2006/picture">
+                <pic:pic xmlns:pic="http://schemas.openxmlformats.org/drawingml/2006/picture">
+                  <pic:nvPicPr>
+                    <pic:cNvPr id="1759439097" name=""/>
+                    <pic:cNvPicPr/>
+                  </pic:nvPicPr>
+                  <pic:blipFill>
+                    <a:blip r:embed="rId8">
+                      <a:extLst>
+                        <a:ext uri="{28A0092B-C50C-407E-A947-70E740481C1C}">
+                          <a14:useLocalDpi xmlns:a14="http://schemas.microsoft.com/office/drawing/2010/main" val="0"/>
+                        </a:ext>
+                      </a:extLst>
+                    </a:blip>
+                    <a:stretch>
+                      <a:fillRect/>
+                    </a:stretch>
+                  </pic:blipFill>
+                  <pic:spPr>
+                    <a:xfrm>
+                      <a:off x="0" y="0"/>
+                      <a:ext cx="5943600" cy="2624455"/>
+                    </a:xfrm>
+                    <a:prstGeom prst="rect">
+                      <a:avLst/>
+                    </a:prstGeom>
+                  </pic:spPr>
+                </pic:pic>
+              </a:graphicData>
+            </a:graphic>
+          </wp:anchor>
+        </w:drawing>
+      </w:r>
+      <w:r>
+        <w:t>Zusammenfassung</w:t>
+      </w:r>
+    </w:p>
+    <w:p/>
+    <w:p>
+      <w:r>
+        <w:lastRenderedPageBreak/>
+        <w:t xml:space="preserve">Wie in Abbildung 1 zu sehen ist war es möglich die Fehler überall bis auf bei Standing und Sitting auf dem Testset zu eliminieren. Das Spricht zum einen für die </w:t>
+      </w:r>
+      <w:r>
+        <w:t>Ähnlichkeit</w:t>
+      </w:r>
+      <w:r>
+        <w:t xml:space="preserve"> der beiden Aktivitäten, </w:t>
+      </w:r>
+      <w:r>
+        <w:t>einen großen Einfluss auf dieses Ergebnis hat aber auch, dass die Daten von subject 28, welche im Testset vorhanden sind, teilweise von den anderen abweichen und daher die Fehlerquote auf dem Testset dort erhöht ist. Insgesamt lässt sich aber sagen, dass die verschiedenen Modelle schon gut mit den Daten umgehen konnten. Durch die Kombination mehrerer Modelle konnte die Accuracy noch weiter gesteigert werden  und ist laut cross-validation und Testset sehr hoch. Man kann also aus dem Ergebnis ableiten, dass maschinelle Lernverfahren sehr gut in der Lage sind solche Sensordaten zu Klassifizieren und einzuordnen.</w:t>
+      </w:r>
+    </w:p>
+    <w:p/>
+    <w:p/>
     <w:p/>
     <w:sdt>
       <w:sdtPr>
@@ -1987,8 +1319,8 @@
       </w:sdtContent>
     </w:sdt>
     <w:sectPr>
-      <w:footerReference w:type="default" r:id="rId8"/>
-      <w:footerReference w:type="first" r:id="rId9"/>
+      <w:footerReference w:type="default" r:id="rId9"/>
+      <w:footerReference w:type="first" r:id="rId10"/>
       <w:pgSz w:w="12240" w:h="15840"/>
       <w:pgMar w:top="1440" w:right="1440" w:bottom="1440" w:left="1440" w:header="720" w:footer="720" w:gutter="0"/>
       <w:cols w:space="720"/>

</xml_diff>

<commit_message>
Finales Modell im Paper zu Finales Modell/Ergebnis geändert
</commit_message>
<xml_diff>
--- a/Journal template free format.docx
+++ b/Journal template free format.docx
@@ -971,6 +971,13 @@
         </w:rPr>
         <w:t>2.4. Finales Modell</w:t>
       </w:r>
+      <w:r>
+        <w:rPr>
+          <w:sz w:val="28"/>
+          <w:szCs w:val="28"/>
+        </w:rPr>
+        <w:t>/Ergebnis</w:t>
+      </w:r>
     </w:p>
     <w:p>
       <w:r>
@@ -1144,7 +1151,6 @@
         <w:t>Zusammenfassung</w:t>
       </w:r>
     </w:p>
-    <w:p/>
     <w:p>
       <w:r>
         <w:lastRenderedPageBreak/>

</xml_diff>

<commit_message>
Zitat richtig eingefügt und genau 6 seiten
</commit_message>
<xml_diff>
--- a/Journal template free format.docx
+++ b/Journal template free format.docx
@@ -1134,8 +1134,40 @@
       </w:r>
       <w:proofErr w:type="spellEnd"/>
       <w:r>
-        <w:t xml:space="preserve"> beschriebenen Optimierungen höher ist als bei einfacheren Einzelmodellen [2].</w:t>
-      </w:r>
+        <w:t xml:space="preserve"> beschriebenen Optimierungen höher ist als bei einfacheren Einzelmodellen.</w:t>
+      </w:r>
+      <w:sdt>
+        <w:sdtPr>
+          <w:id w:val="21673796"/>
+          <w:citation/>
+        </w:sdtPr>
+        <w:sdtContent>
+          <w:r>
+            <w:fldChar w:fldCharType="begin"/>
+          </w:r>
+          <w:r>
+            <w:instrText xml:space="preserve"> CITATION Che16 \l 1031 </w:instrText>
+          </w:r>
+          <w:r>
+            <w:fldChar w:fldCharType="separate"/>
+          </w:r>
+          <w:r>
+            <w:rPr>
+              <w:noProof/>
+            </w:rPr>
+            <w:t xml:space="preserve"> </w:t>
+          </w:r>
+          <w:r>
+            <w:rPr>
+              <w:noProof/>
+            </w:rPr>
+            <w:t>[2]</w:t>
+          </w:r>
+          <w:r>
+            <w:fldChar w:fldCharType="end"/>
+          </w:r>
+        </w:sdtContent>
+      </w:sdt>
     </w:p>
     <w:p>
       <w:pPr>
@@ -1956,7 +1988,6 @@
     </w:p>
     <w:p/>
     <w:p/>
-    <w:p/>
     <w:sdt>
       <w:sdtPr>
         <w:rPr>
@@ -1998,6 +2029,15 @@
           </w:sdtPr>
           <w:sdtContent>
             <w:p>
+              <w:pPr>
+                <w:rPr>
+                  <w:rFonts w:asciiTheme="minorHAnsi" w:hAnsiTheme="minorHAnsi" w:cstheme="minorBidi"/>
+                  <w:noProof/>
+                  <w:sz w:val="22"/>
+                  <w:szCs w:val="22"/>
+                  <w:lang w:val="en-US"/>
+                </w:rPr>
+              </w:pPr>
               <w:r>
                 <w:fldChar w:fldCharType="begin"/>
               </w:r>
@@ -2026,7 +2066,7 @@
               </w:tblGrid>
               <w:tr>
                 <w:trPr>
-                  <w:divId w:val="634680847"/>
+                  <w:divId w:val="1100027043"/>
                   <w:tblCellSpacing w:w="15" w:type="dxa"/>
                 </w:trPr>
                 <w:tc>
@@ -2088,10 +2128,74 @@
                   </w:p>
                 </w:tc>
               </w:tr>
+              <w:tr>
+                <w:trPr>
+                  <w:divId w:val="1100027043"/>
+                  <w:tblCellSpacing w:w="15" w:type="dxa"/>
+                </w:trPr>
+                <w:tc>
+                  <w:tcPr>
+                    <w:tcW w:w="50" w:type="pct"/>
+                    <w:hideMark/>
+                  </w:tcPr>
+                  <w:p>
+                    <w:pPr>
+                      <w:pStyle w:val="Literaturverzeichnis"/>
+                      <w:rPr>
+                        <w:noProof/>
+                      </w:rPr>
+                    </w:pPr>
+                    <w:r>
+                      <w:rPr>
+                        <w:noProof/>
+                      </w:rPr>
+                      <w:t xml:space="preserve">[2] </w:t>
+                    </w:r>
+                  </w:p>
+                </w:tc>
+                <w:tc>
+                  <w:tcPr>
+                    <w:tcW w:w="0" w:type="auto"/>
+                    <w:hideMark/>
+                  </w:tcPr>
+                  <w:p>
+                    <w:pPr>
+                      <w:pStyle w:val="Literaturverzeichnis"/>
+                      <w:rPr>
+                        <w:noProof/>
+                        <w:lang w:val="en-US"/>
+                      </w:rPr>
+                    </w:pPr>
+                    <w:r>
+                      <w:rPr>
+                        <w:noProof/>
+                        <w:lang w:val="en-US"/>
+                      </w:rPr>
+                      <w:t xml:space="preserve">T. Chen und C. Guestrin, „XGBoost: A Scalable Tree Boosting System,“ in </w:t>
+                    </w:r>
+                    <w:r>
+                      <w:rPr>
+                        <w:i/>
+                        <w:iCs/>
+                        <w:noProof/>
+                        <w:lang w:val="en-US"/>
+                      </w:rPr>
+                      <w:t>Proceedings of the 22nd ACM SIGKDD International Conference on Knowledge Discovery and Data Mining</w:t>
+                    </w:r>
+                    <w:r>
+                      <w:rPr>
+                        <w:noProof/>
+                        <w:lang w:val="en-US"/>
+                      </w:rPr>
+                      <w:t xml:space="preserve">, San Francisco, 2016. </w:t>
+                    </w:r>
+                  </w:p>
+                </w:tc>
+              </w:tr>
             </w:tbl>
             <w:p>
               <w:pPr>
-                <w:divId w:val="634680847"/>
+                <w:divId w:val="1100027043"/>
                 <w:rPr>
                   <w:rFonts w:eastAsia="Times New Roman"/>
                   <w:noProof/>
@@ -4278,11 +4382,35 @@
     <b:ConferenceName>21st European Symposium on Artificial Neural Networks, Computational Intelligence and Machine Learning</b:ConferenceName>
     <b:RefOrder>1</b:RefOrder>
   </b:Source>
+  <b:Source>
+    <b:Tag>Che16</b:Tag>
+    <b:SourceType>ConferenceProceedings</b:SourceType>
+    <b:Guid>{0BF68E83-7113-457E-BD31-45C70B7C4549}</b:Guid>
+    <b:Title>XGBoost: A Scalable Tree Boosting System</b:Title>
+    <b:Year>2016</b:Year>
+    <b:City>San Francisco</b:City>
+    <b:Author>
+      <b:Author>
+        <b:NameList>
+          <b:Person>
+            <b:Last>Chen</b:Last>
+            <b:First>T.</b:First>
+          </b:Person>
+          <b:Person>
+            <b:Last>Guestrin</b:Last>
+            <b:First>C.</b:First>
+          </b:Person>
+        </b:NameList>
+      </b:Author>
+    </b:Author>
+    <b:ConferenceName>Proceedings of the 22nd ACM SIGKDD International Conference on Knowledge Discovery and Data Mining</b:ConferenceName>
+    <b:RefOrder>2</b:RefOrder>
+  </b:Source>
 </b:Sources>
 </file>
 
 <file path=customXml/itemProps1.xml><?xml version="1.0" encoding="utf-8"?>
-<ds:datastoreItem xmlns:ds="http://schemas.openxmlformats.org/officeDocument/2006/customXml" ds:itemID="{074EFC00-669B-4366-8BB1-4A3BA5BB9DB1}">
+<ds:datastoreItem xmlns:ds="http://schemas.openxmlformats.org/officeDocument/2006/customXml" ds:itemID="{5B2C2E56-6E5B-4803-9D03-271CDDB3AF83}">
   <ds:schemaRefs>
     <ds:schemaRef ds:uri="http://schemas.openxmlformats.org/officeDocument/2006/bibliography"/>
   </ds:schemaRefs>

</xml_diff>